<commit_message>
Updated the proof in report for the switch location configurations
</commit_message>
<xml_diff>
--- a/Evidence/What QuickGrid's URL navigation changes for an existing app.docx
+++ b/Evidence/What QuickGrid's URL navigation changes for an existing app.docx
@@ -1109,15 +1109,7 @@
           </w:tcPr>
           <w:p>
             <w:r>
-              <w:t xml:space="preserve">Clicking sortable headers did not perform sorting. </w:t>
-            </w:r>
-            <w:proofErr w:type="gramStart"/>
-            <w:r>
-              <w:t>This matches</w:t>
-            </w:r>
-            <w:proofErr w:type="gramEnd"/>
-            <w:r>
-              <w:t xml:space="preserve"> expected .NET 10 Static SSR behavior.</w:t>
+              <w:t>Clicking sortable headers did not perform sorting. This matches expected .NET 10 Static SSR behavior.</w:t>
             </w:r>
           </w:p>
         </w:tc>
@@ -1186,15 +1178,7 @@
           </w:tcPr>
           <w:p>
             <w:r>
-              <w:t xml:space="preserve">Clicking sortable headers did not perform sorting. </w:t>
-            </w:r>
-            <w:proofErr w:type="gramStart"/>
-            <w:r>
-              <w:t>This matches</w:t>
-            </w:r>
-            <w:proofErr w:type="gramEnd"/>
-            <w:r>
-              <w:t xml:space="preserve"> expected .NET 10 Static SSR behavior.</w:t>
+              <w:t>Clicking sortable headers did not perform sorting. This matches expected .NET 10 Static SSR behavior.</w:t>
             </w:r>
           </w:p>
         </w:tc>
@@ -1263,15 +1247,7 @@
           </w:tcPr>
           <w:p>
             <w:r>
-              <w:t xml:space="preserve">Clicking paginator controls did not change page state. </w:t>
-            </w:r>
-            <w:proofErr w:type="gramStart"/>
-            <w:r>
-              <w:t>This matches</w:t>
-            </w:r>
-            <w:proofErr w:type="gramEnd"/>
-            <w:r>
-              <w:t xml:space="preserve"> expected .NET 10 Static SSR behavior.</w:t>
+              <w:t>Clicking paginator controls did not change page state. This matches expected .NET 10 Static SSR behavior.</w:t>
             </w:r>
           </w:p>
         </w:tc>
@@ -1340,15 +1316,7 @@
           </w:tcPr>
           <w:p>
             <w:r>
-              <w:t xml:space="preserve">Clicking paginator controls did not change page state. </w:t>
-            </w:r>
-            <w:proofErr w:type="gramStart"/>
-            <w:r>
-              <w:t>This matches</w:t>
-            </w:r>
-            <w:proofErr w:type="gramEnd"/>
-            <w:r>
-              <w:t xml:space="preserve"> expected .NET 10 Static SSR behavior.</w:t>
+              <w:t>Clicking paginator controls did not change page state. This matches expected .NET 10 Static SSR behavior.</w:t>
             </w:r>
           </w:p>
         </w:tc>
@@ -1680,15 +1648,7 @@
           </w:tcPr>
           <w:p>
             <w:r>
-              <w:t xml:space="preserve">Verify </w:t>
-            </w:r>
-            <w:proofErr w:type="gramStart"/>
-            <w:r>
-              <w:t>paginator</w:t>
-            </w:r>
-            <w:proofErr w:type="gramEnd"/>
-            <w:r>
-              <w:t xml:space="preserve"> HTML structure</w:t>
+              <w:t>Verify paginator HTML structure</w:t>
             </w:r>
           </w:p>
         </w:tc>
@@ -1797,15 +1757,7 @@
           </w:tcPr>
           <w:p>
             <w:r>
-              <w:t xml:space="preserve">Sorting worked correctly and grid order </w:t>
-            </w:r>
-            <w:proofErr w:type="gramStart"/>
-            <w:r>
-              <w:t>updated</w:t>
-            </w:r>
-            <w:proofErr w:type="gramEnd"/>
-            <w:r>
-              <w:t xml:space="preserve"> accordingly.</w:t>
+              <w:t>Sorting worked correctly and grid order updated accordingly.</w:t>
             </w:r>
           </w:p>
         </w:tc>
@@ -1874,15 +1826,7 @@
           </w:tcPr>
           <w:p>
             <w:r>
-              <w:t xml:space="preserve">Sorting worked correctly and grid order </w:t>
-            </w:r>
-            <w:proofErr w:type="gramStart"/>
-            <w:r>
-              <w:t>updated</w:t>
-            </w:r>
-            <w:proofErr w:type="gramEnd"/>
-            <w:r>
-              <w:t xml:space="preserve"> accordingly.</w:t>
+              <w:t>Sorting worked correctly and grid order updated accordingly.</w:t>
             </w:r>
           </w:p>
         </w:tc>
@@ -3240,15 +3184,7 @@
           </w:tcPr>
           <w:p>
             <w:r>
-              <w:t xml:space="preserve">Verify browser Back </w:t>
-            </w:r>
-            <w:proofErr w:type="gramStart"/>
-            <w:r>
-              <w:t>restores</w:t>
-            </w:r>
-            <w:proofErr w:type="gramEnd"/>
-            <w:r>
-              <w:t xml:space="preserve"> previous page state</w:t>
+              <w:t>Verify browser Back restores previous page state</w:t>
             </w:r>
           </w:p>
         </w:tc>
@@ -3568,15 +3504,7 @@
           </w:tcPr>
           <w:p>
             <w:r>
-              <w:t xml:space="preserve">Grid </w:t>
-            </w:r>
-            <w:proofErr w:type="gramStart"/>
-            <w:r>
-              <w:t>sorted</w:t>
-            </w:r>
-            <w:proofErr w:type="gramEnd"/>
-            <w:r>
-              <w:t xml:space="preserve"> correctly.</w:t>
+              <w:t>Grid sorted correctly.</w:t>
             </w:r>
           </w:p>
           <w:p>
@@ -3648,15 +3576,7 @@
           </w:tcPr>
           <w:p>
             <w:r>
-              <w:t xml:space="preserve">Grid </w:t>
-            </w:r>
-            <w:proofErr w:type="gramStart"/>
-            <w:r>
-              <w:t>sorted</w:t>
-            </w:r>
-            <w:proofErr w:type="gramEnd"/>
-            <w:r>
-              <w:t xml:space="preserve"> correctly.</w:t>
+              <w:t>Grid sorted correctly.</w:t>
             </w:r>
           </w:p>
           <w:p>
@@ -3797,15 +3717,7 @@
           </w:tcPr>
           <w:p>
             <w:r>
-              <w:t xml:space="preserve">Behavior </w:t>
-            </w:r>
-            <w:proofErr w:type="gramStart"/>
-            <w:r>
-              <w:t>matched</w:t>
-            </w:r>
-            <w:proofErr w:type="gramEnd"/>
-            <w:r>
-              <w:t xml:space="preserve"> development environment.</w:t>
+              <w:t>Behavior matched development environment.</w:t>
             </w:r>
           </w:p>
         </w:tc>
@@ -3877,15 +3789,7 @@
           </w:tcPr>
           <w:p>
             <w:r>
-              <w:t xml:space="preserve">Behavior </w:t>
-            </w:r>
-            <w:proofErr w:type="gramStart"/>
-            <w:r>
-              <w:t>matched</w:t>
-            </w:r>
-            <w:proofErr w:type="gramEnd"/>
-            <w:r>
-              <w:t xml:space="preserve"> development environment.</w:t>
+              <w:t>Behavior matched development environment.</w:t>
             </w:r>
           </w:p>
         </w:tc>
@@ -3952,15 +3856,7 @@
           </w:tcPr>
           <w:p>
             <w:r>
-              <w:t xml:space="preserve">URL updates </w:t>
-            </w:r>
-            <w:proofErr w:type="gramStart"/>
-            <w:r>
-              <w:t>functioned</w:t>
-            </w:r>
-            <w:proofErr w:type="gramEnd"/>
-            <w:r>
-              <w:t xml:space="preserve"> correctly.</w:t>
+              <w:t>URL updates functioned correctly.</w:t>
             </w:r>
           </w:p>
         </w:tc>
@@ -4027,15 +3923,7 @@
           </w:tcPr>
           <w:p>
             <w:r>
-              <w:t xml:space="preserve">URL updates </w:t>
-            </w:r>
-            <w:proofErr w:type="gramStart"/>
-            <w:r>
-              <w:t>functioned</w:t>
-            </w:r>
-            <w:proofErr w:type="gramEnd"/>
-            <w:r>
-              <w:t xml:space="preserve"> correctly.</w:t>
+              <w:t>URL updates functioned correctly.</w:t>
             </w:r>
           </w:p>
         </w:tc>
@@ -4333,15 +4221,7 @@
                 <w:sz w:val="20"/>
                 <w:szCs w:val="20"/>
               </w:rPr>
-              <w:t>&lt;</w:t>
-            </w:r>
-            <w:r>
-              <w:rPr>
-                <w:rFonts w:ascii="Courier New" w:hAnsi="Courier New" w:cs="Courier New"/>
-                <w:sz w:val="20"/>
-                <w:szCs w:val="20"/>
-              </w:rPr>
-              <w:t>button&gt;</w:t>
+              <w:t>&lt;button&gt;</w:t>
             </w:r>
             <w:r>
               <w:rPr>
@@ -4639,19 +4519,11 @@
             <w:tcW w:w="3707" w:type="dxa"/>
           </w:tcPr>
           <w:p>
-            <w:proofErr w:type="gramStart"/>
             <w:r>
               <w:rPr>
                 <w:rFonts w:ascii="Aptos" w:hAnsi="Aptos"/>
               </w:rPr>
-              <w:t>Verify</w:t>
-            </w:r>
-            <w:proofErr w:type="gramEnd"/>
-            <w:r>
-              <w:rPr>
-                <w:rFonts w:ascii="Aptos" w:hAnsi="Aptos"/>
-              </w:rPr>
-              <w:t xml:space="preserve"> both configuration locations produce identical behavior</w:t>
+              <w:t>Verify both configuration locations produce identical behavior</w:t>
             </w:r>
           </w:p>
         </w:tc>
@@ -9295,21 +9167,12 @@
       <w:r>
         <w:t xml:space="preserve">The compatibility switch </w:t>
       </w:r>
-      <w:proofErr w:type="gramStart"/>
       <w:r>
         <w:rPr>
           <w:i/>
           <w:iCs/>
         </w:rPr>
-        <w:t>Microsoft.AspNetCore.Components.QuickGrid</w:t>
-      </w:r>
-      <w:proofErr w:type="gramEnd"/>
-      <w:r>
-        <w:rPr>
-          <w:i/>
-          <w:iCs/>
-        </w:rPr>
-        <w:t>.EnableUrlBasedQuickGridNavigationAndSorting</w:t>
+        <w:t>Microsoft.AspNetCore.Components.QuickGrid.EnableUrlBasedQuickGridNavigationAndSorting</w:t>
       </w:r>
       <w:r>
         <w:t xml:space="preserve"> was validated using both supported configuration locations:</w:t>
@@ -9334,15 +9197,17 @@
       <w:tblPr>
         <w:tblStyle w:val="TableGrid"/>
         <w:tblW w:w="0" w:type="auto"/>
+        <w:tblInd w:w="607" w:type="dxa"/>
+        <w:tblLayout w:type="fixed"/>
         <w:tblLook w:val="04A0" w:firstRow="1" w:lastRow="0" w:firstColumn="1" w:lastColumn="0" w:noHBand="0" w:noVBand="1"/>
       </w:tblPr>
       <w:tblGrid>
-        <w:gridCol w:w="9350"/>
+        <w:gridCol w:w="8658"/>
       </w:tblGrid>
       <w:tr>
         <w:tc>
           <w:tcPr>
-            <w:tcW w:w="9350" w:type="dxa"/>
+            <w:tcW w:w="8658" w:type="dxa"/>
           </w:tcPr>
           <w:p>
             <w:pPr>
@@ -9413,69 +9278,53 @@
                 <w:i/>
                 <w:iCs/>
               </w:rPr>
-              <w:t>Include="</w:t>
-            </w:r>
-            <w:proofErr w:type="gramStart"/>
-            <w:r>
+              <w:t>Include="Microsoft.AspNetCore.Components.QuickGrid.EnableUrlBasedQuickGridNavigationAndSorting"</w:t>
+            </w:r>
+          </w:p>
+          <w:p>
+            <w:pPr>
+              <w:ind w:left="720"/>
               <w:rPr>
                 <w:i/>
                 <w:iCs/>
               </w:rPr>
-              <w:t>Microsoft.AspNetCore.Components.QuickGrid</w:t>
-            </w:r>
-            <w:proofErr w:type="gramEnd"/>
+            </w:pPr>
             <w:r>
               <w:rPr>
                 <w:i/>
                 <w:iCs/>
               </w:rPr>
-              <w:t>.EnableUrlBasedQuickGridNavigationAndSorting"</w:t>
-            </w:r>
-          </w:p>
-          <w:p>
-            <w:pPr>
-              <w:ind w:left="720"/>
+              <w:t>Value="false" /&gt;</w:t>
+            </w:r>
+          </w:p>
+          <w:p>
+            <w:pPr>
+              <w:rPr>
+                <w:b/>
+                <w:bCs/>
+              </w:rPr>
+            </w:pPr>
+            <w:r>
               <w:rPr>
                 <w:i/>
                 <w:iCs/>
               </w:rPr>
-            </w:pPr>
+              <w:t>&lt;/</w:t>
+            </w:r>
+            <w:proofErr w:type="spellStart"/>
             <w:r>
               <w:rPr>
                 <w:i/>
                 <w:iCs/>
               </w:rPr>
-              <w:t>Value="false" /&gt;</w:t>
-            </w:r>
-          </w:p>
-          <w:p>
-            <w:pPr>
-              <w:rPr>
-                <w:b/>
-                <w:bCs/>
-              </w:rPr>
-            </w:pPr>
+              <w:t>ItemGroup</w:t>
+            </w:r>
+            <w:proofErr w:type="spellEnd"/>
             <w:r>
               <w:rPr>
                 <w:i/>
                 <w:iCs/>
               </w:rPr>
-              <w:t>&lt;/</w:t>
-            </w:r>
-            <w:proofErr w:type="spellStart"/>
-            <w:r>
-              <w:rPr>
-                <w:i/>
-                <w:iCs/>
-              </w:rPr>
-              <w:t>ItemGroup</w:t>
-            </w:r>
-            <w:proofErr w:type="spellEnd"/>
-            <w:r>
-              <w:rPr>
-                <w:i/>
-                <w:iCs/>
-              </w:rPr>
               <w:t>&gt;</w:t>
             </w:r>
           </w:p>
@@ -9489,6 +9338,36 @@
           <w:bCs/>
         </w:rPr>
       </w:pPr>
+    </w:p>
+    <w:p>
+      <w:pPr>
+        <w:ind w:left="720"/>
+      </w:pPr>
+      <w:r>
+        <w:t xml:space="preserve">Proof: </w:t>
+      </w:r>
+      <w:hyperlink r:id="rId62" w:history="1">
+        <w:r>
+          <w:rPr>
+            <w:rStyle w:val="Hyperlink"/>
+          </w:rPr>
+          <w:t xml:space="preserve">Switch validation (Location: Project file) · </w:t>
+        </w:r>
+        <w:proofErr w:type="spellStart"/>
+        <w:r>
+          <w:rPr>
+            <w:rStyle w:val="Hyperlink"/>
+          </w:rPr>
+          <w:t>BrundhaVelusamy</w:t>
+        </w:r>
+        <w:proofErr w:type="spellEnd"/>
+        <w:r>
+          <w:rPr>
+            <w:rStyle w:val="Hyperlink"/>
+          </w:rPr>
+          <w:t>/QuickGridUrlNavigationUpgradeValidation@706c3e5</w:t>
+        </w:r>
+      </w:hyperlink>
     </w:p>
     <w:p>
       <w:pPr>
@@ -9518,15 +9397,17 @@
       <w:tblPr>
         <w:tblStyle w:val="TableGrid"/>
         <w:tblW w:w="0" w:type="auto"/>
+        <w:tblInd w:w="607" w:type="dxa"/>
+        <w:tblLayout w:type="fixed"/>
         <w:tblLook w:val="04A0" w:firstRow="1" w:lastRow="0" w:firstColumn="1" w:lastColumn="0" w:noHBand="0" w:noVBand="1"/>
       </w:tblPr>
       <w:tblGrid>
-        <w:gridCol w:w="9350"/>
+        <w:gridCol w:w="8635"/>
       </w:tblGrid>
       <w:tr>
         <w:tc>
           <w:tcPr>
-            <w:tcW w:w="9350" w:type="dxa"/>
+            <w:tcW w:w="8635" w:type="dxa"/>
           </w:tcPr>
           <w:p>
             <w:pPr>
@@ -9564,23 +9445,7 @@
                 <w:i/>
                 <w:iCs/>
               </w:rPr>
-              <w:t>"</w:t>
-            </w:r>
-            <w:proofErr w:type="gramStart"/>
-            <w:r>
-              <w:rPr>
-                <w:i/>
-                <w:iCs/>
-              </w:rPr>
-              <w:t>Microsoft.AspNetCore.Components.QuickGrid</w:t>
-            </w:r>
-            <w:proofErr w:type="gramEnd"/>
-            <w:r>
-              <w:rPr>
-                <w:i/>
-                <w:iCs/>
-              </w:rPr>
-              <w:t>.EnableUrlBasedQuickGridNavigationAndSorting",</w:t>
+              <w:t>"Microsoft.AspNetCore.Components.QuickGrid.EnableUrlBasedQuickGridNavigationAndSorting",</w:t>
             </w:r>
           </w:p>
           <w:p>
@@ -9596,6 +9461,50 @@
       </w:tr>
     </w:tbl>
     <w:p/>
+    <w:p>
+      <w:pPr>
+        <w:ind w:left="720"/>
+      </w:pPr>
+      <w:r>
+        <w:t xml:space="preserve">Proof: </w:t>
+      </w:r>
+      <w:hyperlink r:id="rId63" w:history="1">
+        <w:r>
+          <w:rPr>
+            <w:rStyle w:val="Hyperlink"/>
+          </w:rPr>
+          <w:t xml:space="preserve">Switch validation and its evidence (Location: </w:t>
+        </w:r>
+        <w:proofErr w:type="spellStart"/>
+        <w:r>
+          <w:rPr>
+            <w:rStyle w:val="Hyperlink"/>
+          </w:rPr>
+          <w:t>Program.cs</w:t>
+        </w:r>
+        <w:proofErr w:type="spellEnd"/>
+        <w:r>
+          <w:rPr>
+            <w:rStyle w:val="Hyperlink"/>
+          </w:rPr>
+          <w:t xml:space="preserve">) · </w:t>
+        </w:r>
+        <w:proofErr w:type="spellStart"/>
+        <w:r>
+          <w:rPr>
+            <w:rStyle w:val="Hyperlink"/>
+          </w:rPr>
+          <w:t>BrundhaVelusamy</w:t>
+        </w:r>
+        <w:proofErr w:type="spellEnd"/>
+        <w:r>
+          <w:rPr>
+            <w:rStyle w:val="Hyperlink"/>
+          </w:rPr>
+          <w:t>/QuickGridUrlNavigationUpgradeValidation@1669c57</w:t>
+        </w:r>
+      </w:hyperlink>
+    </w:p>
     <w:p>
       <w:pPr>
         <w:rPr>
@@ -9676,6 +9585,7 @@
         </w:numPr>
       </w:pPr>
       <w:r>
+        <w:lastRenderedPageBreak/>
         <w:t>Static SSR behavior matched the .NET 10 baseline where UI interaction for sorting and paging was unavailable.</w:t>
       </w:r>
     </w:p>
@@ -9708,7 +9618,6 @@
         </w:numPr>
       </w:pPr>
       <w:r>
-        <w:lastRenderedPageBreak/>
         <w:t>Removing the switch restored the default .NET 11 URL-based navigation and sorting behavior.</w:t>
       </w:r>
     </w:p>
@@ -9893,7 +9802,7 @@
         <w:spacing w:line="240" w:lineRule="auto"/>
         <w:ind w:left="720" w:firstLine="720"/>
       </w:pPr>
-      <w:hyperlink r:id="rId62" w:history="1">
+      <w:hyperlink r:id="rId64" w:history="1">
         <w:r>
           <w:rPr>
             <w:rStyle w:val="Hyperlink"/>
@@ -9908,15 +9817,7 @@
         <w:ind w:left="720"/>
       </w:pPr>
       <w:r>
-        <w:t xml:space="preserve">After </w:t>
-      </w:r>
-      <w:proofErr w:type="gramStart"/>
-      <w:r>
-        <w:t>sort</w:t>
-      </w:r>
-      <w:proofErr w:type="gramEnd"/>
-      <w:r>
-        <w:t>:</w:t>
+        <w:t>After sort:</w:t>
       </w:r>
     </w:p>
     <w:p>
@@ -9924,7 +9825,7 @@
         <w:spacing w:line="240" w:lineRule="auto"/>
         <w:ind w:left="720" w:firstLine="720"/>
       </w:pPr>
-      <w:hyperlink r:id="rId63" w:history="1">
+      <w:hyperlink r:id="rId65" w:history="1">
         <w:r>
           <w:rPr>
             <w:rStyle w:val="Hyperlink"/>
@@ -9947,7 +9848,7 @@
         <w:spacing w:line="240" w:lineRule="auto"/>
         <w:ind w:left="720" w:firstLine="720"/>
       </w:pPr>
-      <w:hyperlink r:id="rId64" w:history="1">
+      <w:hyperlink r:id="rId66" w:history="1">
         <w:r>
           <w:rPr>
             <w:rStyle w:val="Hyperlink"/>
@@ -10011,6 +9912,7 @@
         </w:numPr>
       </w:pPr>
       <w:r>
+        <w:lastRenderedPageBreak/>
         <w:t>Sortable headers rendered as anchor (&lt;a&gt;) elements.</w:t>
       </w:r>
     </w:p>
@@ -10047,7 +9949,6 @@
         </w:numPr>
       </w:pPr>
       <w:r>
-        <w:lastRenderedPageBreak/>
         <w:t>Paging updated both the grid state and the URL.</w:t>
       </w:r>
     </w:p>
@@ -10101,7 +10002,7 @@
         <w:spacing w:line="240" w:lineRule="auto"/>
         <w:ind w:left="720" w:firstLine="720"/>
       </w:pPr>
-      <w:hyperlink r:id="rId65" w:history="1">
+      <w:hyperlink r:id="rId67" w:history="1">
         <w:r>
           <w:rPr>
             <w:rStyle w:val="Hyperlink"/>
@@ -10124,7 +10025,7 @@
         <w:spacing w:line="240" w:lineRule="auto"/>
         <w:ind w:left="720" w:firstLine="720"/>
       </w:pPr>
-      <w:hyperlink r:id="rId66" w:history="1">
+      <w:hyperlink r:id="rId68" w:history="1">
         <w:r>
           <w:rPr>
             <w:rStyle w:val="Hyperlink"/>
@@ -10139,15 +10040,7 @@
         <w:ind w:left="720"/>
       </w:pPr>
       <w:r>
-        <w:t xml:space="preserve">After </w:t>
-      </w:r>
-      <w:proofErr w:type="gramStart"/>
-      <w:r>
-        <w:t>paging</w:t>
-      </w:r>
-      <w:proofErr w:type="gramEnd"/>
-      <w:r>
-        <w:t>:</w:t>
+        <w:t>After paging:</w:t>
       </w:r>
     </w:p>
     <w:p>
@@ -10155,7 +10048,7 @@
         <w:spacing w:line="240" w:lineRule="auto"/>
         <w:ind w:left="1440"/>
       </w:pPr>
-      <w:hyperlink r:id="rId67" w:history="1">
+      <w:hyperlink r:id="rId69" w:history="1">
         <w:r>
           <w:rPr>
             <w:rStyle w:val="Hyperlink"/>
@@ -10315,12 +10208,10 @@
               <w:t xml:space="preserve">warn: </w:t>
             </w:r>
             <w:proofErr w:type="spellStart"/>
-            <w:proofErr w:type="gramStart"/>
             <w:r>
               <w:t>Microsoft.AspNetCore.HttpsPolicy.HttpsRedirectionMiddleware</w:t>
             </w:r>
             <w:proofErr w:type="spellEnd"/>
-            <w:proofErr w:type="gramEnd"/>
             <w:r>
               <w:t xml:space="preserve">[3] </w:t>
             </w:r>
@@ -10446,28 +10337,16 @@
               <w:ind w:left="360"/>
             </w:pPr>
             <w:r>
+              <w:lastRenderedPageBreak/>
               <w:t xml:space="preserve">warn: </w:t>
             </w:r>
             <w:proofErr w:type="spellStart"/>
-            <w:proofErr w:type="gramStart"/>
-            <w:r>
-              <w:t>Microsoft.AspNetCore.Components.Sections</w:t>
-            </w:r>
-            <w:proofErr w:type="gramEnd"/>
-            <w:r>
-              <w:t>.</w:t>
-            </w:r>
-            <w:proofErr w:type="gramStart"/>
-            <w:r>
-              <w:t>SectionRegistry</w:t>
+            <w:r>
+              <w:t>Microsoft.AspNetCore.Components.Sections.SectionRegistry</w:t>
             </w:r>
             <w:proofErr w:type="spellEnd"/>
             <w:r>
-              <w:t>[</w:t>
-            </w:r>
-            <w:proofErr w:type="gramEnd"/>
-            <w:r>
-              <w:t>1]</w:t>
+              <w:t>[1]</w:t>
             </w:r>
           </w:p>
           <w:p>
@@ -10499,11 +10378,7 @@
             </w:r>
             <w:proofErr w:type="spellEnd"/>
             <w:r>
-              <w:t xml:space="preserve"> in render mode </w:t>
-            </w:r>
-            <w:r>
-              <w:lastRenderedPageBreak/>
-              <w:t>'</w:t>
+              <w:t xml:space="preserve"> in render mode '</w:t>
             </w:r>
             <w:proofErr w:type="spellStart"/>
             <w:r>
@@ -10530,7 +10405,6 @@
           <w:b/>
           <w:bCs/>
         </w:rPr>
-        <w:lastRenderedPageBreak/>
         <w:t>Observation:</w:t>
       </w:r>
     </w:p>
@@ -10601,7 +10475,7 @@
           <w:noProof/>
         </w:rPr>
         <w:drawing>
-          <wp:inline distT="0" distB="0" distL="0" distR="0" wp14:anchorId="3DA66B92" wp14:editId="3EA39F31">
+          <wp:inline distT="0" distB="0" distL="0" distR="0" wp14:anchorId="3DA66B92" wp14:editId="6D3E4715">
             <wp:extent cx="5943600" cy="1237615"/>
             <wp:effectExtent l="0" t="0" r="0" b="635"/>
             <wp:docPr id="2134330611" name="Picture 16"/>
@@ -10618,7 +10492,7 @@
                     </pic:cNvPicPr>
                   </pic:nvPicPr>
                   <pic:blipFill>
-                    <a:blip r:embed="rId68" cstate="print">
+                    <a:blip r:embed="rId70" cstate="print">
                       <a:extLst>
                         <a:ext uri="{28A0092B-C50C-407E-A947-70E740481C1C}">
                           <a14:useLocalDpi xmlns:a14="http://schemas.microsoft.com/office/drawing/2010/main" val="0"/>
@@ -10750,19 +10624,20 @@
                 <w:sz w:val="22"/>
                 <w:szCs w:val="22"/>
               </w:rPr>
-              <w:t>dotnet publish .\QuickGridUrlNavigationSampleNET10To11.csproj ` -c Release ` -</w:t>
-            </w:r>
-            <w:proofErr w:type="gramStart"/>
-            <w:r>
+              <w:t>dotnet publish .\QuickGridUrlNavigationSampleNET10To11.csproj ` -c Release ` -o .\artifacts\hosted-publish </w:t>
+            </w:r>
+          </w:p>
+          <w:p>
+            <w:pPr>
+              <w:spacing w:line="240" w:lineRule="auto"/>
+              <w:ind w:left="360"/>
               <w:rPr>
                 <w:i/>
                 <w:iCs/>
                 <w:sz w:val="22"/>
                 <w:szCs w:val="22"/>
               </w:rPr>
-              <w:t>o .</w:t>
-            </w:r>
-            <w:proofErr w:type="gramEnd"/>
+            </w:pPr>
             <w:r>
               <w:rPr>
                 <w:i/>
@@ -10770,7 +10645,7 @@
                 <w:sz w:val="22"/>
                 <w:szCs w:val="22"/>
               </w:rPr>
-              <w:t>\artifacts\hosted-publish </w:t>
+              <w:t>cd .\artifacts\hosted-publish </w:t>
             </w:r>
           </w:p>
           <w:p>
@@ -10784,7 +10659,6 @@
                 <w:szCs w:val="22"/>
               </w:rPr>
             </w:pPr>
-            <w:proofErr w:type="gramStart"/>
             <w:r>
               <w:rPr>
                 <w:i/>
@@ -10792,9 +10666,9 @@
                 <w:sz w:val="22"/>
                 <w:szCs w:val="22"/>
               </w:rPr>
-              <w:t>cd .</w:t>
-            </w:r>
-            <w:proofErr w:type="gramEnd"/>
+              <w:t>$</w:t>
+            </w:r>
+            <w:proofErr w:type="spellStart"/>
             <w:r>
               <w:rPr>
                 <w:i/>
@@ -10802,31 +10676,30 @@
                 <w:sz w:val="22"/>
                 <w:szCs w:val="22"/>
               </w:rPr>
-              <w:t>\artifacts\hosted-publish </w:t>
-            </w:r>
-          </w:p>
-          <w:p>
-            <w:pPr>
-              <w:spacing w:line="240" w:lineRule="auto"/>
-              <w:ind w:left="360"/>
+              <w:t>env:ASPNETCORE_ENVIRONMENT</w:t>
+            </w:r>
+            <w:proofErr w:type="spellEnd"/>
+            <w:r>
               <w:rPr>
                 <w:i/>
                 <w:iCs/>
                 <w:sz w:val="22"/>
                 <w:szCs w:val="22"/>
               </w:rPr>
-            </w:pPr>
-            <w:r>
+              <w:t xml:space="preserve"> = "Production" </w:t>
+            </w:r>
+          </w:p>
+          <w:p>
+            <w:pPr>
+              <w:spacing w:line="240" w:lineRule="auto"/>
+              <w:ind w:left="360"/>
               <w:rPr>
                 <w:i/>
                 <w:iCs/>
                 <w:sz w:val="22"/>
                 <w:szCs w:val="22"/>
               </w:rPr>
-              <w:t>$</w:t>
-            </w:r>
-            <w:proofErr w:type="spellStart"/>
-            <w:proofErr w:type="gramStart"/>
+            </w:pPr>
             <w:r>
               <w:rPr>
                 <w:i/>
@@ -10834,9 +10707,9 @@
                 <w:sz w:val="22"/>
                 <w:szCs w:val="22"/>
               </w:rPr>
-              <w:t>env:ASPNETCORE</w:t>
-            </w:r>
-            <w:proofErr w:type="gramEnd"/>
+              <w:t>dotnet .\QuickGridUrlNavigationSampleNET10To11.dll --</w:t>
+            </w:r>
+            <w:proofErr w:type="spellStart"/>
             <w:r>
               <w:rPr>
                 <w:i/>
@@ -10844,7 +10717,7 @@
                 <w:sz w:val="22"/>
                 <w:szCs w:val="22"/>
               </w:rPr>
-              <w:t>_ENVIRONMENT</w:t>
+              <w:t>urls</w:t>
             </w:r>
             <w:proofErr w:type="spellEnd"/>
             <w:r>
@@ -10854,50 +10727,9 @@
                 <w:sz w:val="22"/>
                 <w:szCs w:val="22"/>
               </w:rPr>
-              <w:t xml:space="preserve"> = "Production" </w:t>
-            </w:r>
-          </w:p>
-          <w:p>
-            <w:pPr>
-              <w:spacing w:line="240" w:lineRule="auto"/>
-              <w:ind w:left="360"/>
-              <w:rPr>
-                <w:i/>
-                <w:iCs/>
-                <w:sz w:val="22"/>
-                <w:szCs w:val="22"/>
-              </w:rPr>
-            </w:pPr>
-            <w:r>
-              <w:rPr>
-                <w:i/>
-                <w:iCs/>
-                <w:sz w:val="22"/>
-                <w:szCs w:val="22"/>
-              </w:rPr>
-              <w:t>dotnet .\QuickGridUrlNavigationSampleNET10To11.dll --</w:t>
-            </w:r>
-            <w:proofErr w:type="spellStart"/>
-            <w:r>
-              <w:rPr>
-                <w:i/>
-                <w:iCs/>
-                <w:sz w:val="22"/>
-                <w:szCs w:val="22"/>
-              </w:rPr>
-              <w:t>urls</w:t>
-            </w:r>
-            <w:proofErr w:type="spellEnd"/>
-            <w:r>
-              <w:rPr>
-                <w:i/>
-                <w:iCs/>
-                <w:sz w:val="22"/>
-                <w:szCs w:val="22"/>
-              </w:rPr>
               <w:t xml:space="preserve"> </w:t>
             </w:r>
-            <w:hyperlink r:id="rId69" w:history="1">
+            <w:hyperlink r:id="rId71" w:history="1">
               <w:r>
                 <w:rPr>
                   <w:rStyle w:val="Hyperlink"/>
@@ -11010,12 +10842,10 @@
               <w:t xml:space="preserve">warn: </w:t>
             </w:r>
             <w:proofErr w:type="spellStart"/>
-            <w:proofErr w:type="gramStart"/>
             <w:r>
               <w:t>Microsoft.AspNetCore.HttpsPolicy.HttpsRedirectionMiddleware</w:t>
             </w:r>
             <w:proofErr w:type="spellEnd"/>
-            <w:proofErr w:type="gramEnd"/>
             <w:r>
               <w:t xml:space="preserve">[3] </w:t>
             </w:r>
@@ -11025,6 +10855,7 @@
               <w:ind w:left="360"/>
             </w:pPr>
             <w:r>
+              <w:lastRenderedPageBreak/>
               <w:t>Failed to determine the https port for redirect.</w:t>
             </w:r>
           </w:p>
@@ -11044,6 +10875,7 @@
           <w:b/>
           <w:bCs/>
         </w:rPr>
+        <w:lastRenderedPageBreak/>
         <w:t>Observation:</w:t>
       </w:r>
     </w:p>
@@ -11070,7 +10902,6 @@
         <w:ind w:left="1440"/>
       </w:pPr>
       <w:r>
-        <w:lastRenderedPageBreak/>
         <w:t xml:space="preserve">Does not impact </w:t>
       </w:r>
       <w:proofErr w:type="spellStart"/>
@@ -11145,25 +10976,12 @@
               <w:t xml:space="preserve">warn: </w:t>
             </w:r>
             <w:proofErr w:type="spellStart"/>
-            <w:proofErr w:type="gramStart"/>
-            <w:r>
-              <w:t>Microsoft.AspNetCore.Components.Sections</w:t>
-            </w:r>
-            <w:proofErr w:type="gramEnd"/>
-            <w:r>
-              <w:t>.</w:t>
-            </w:r>
-            <w:proofErr w:type="gramStart"/>
-            <w:r>
-              <w:t>SectionRegistry</w:t>
+            <w:r>
+              <w:t>Microsoft.AspNetCore.Components.Sections.SectionRegistry</w:t>
             </w:r>
             <w:proofErr w:type="spellEnd"/>
             <w:r>
-              <w:t>[</w:t>
-            </w:r>
-            <w:proofErr w:type="gramEnd"/>
-            <w:r>
-              <w:t>1]</w:t>
+              <w:t>[1]</w:t>
             </w:r>
           </w:p>
           <w:p>
@@ -11295,7 +11113,7 @@
           <w:noProof/>
         </w:rPr>
         <w:drawing>
-          <wp:inline distT="0" distB="0" distL="0" distR="0" wp14:anchorId="391BB097" wp14:editId="215B178F">
+          <wp:inline distT="0" distB="0" distL="0" distR="0" wp14:anchorId="391BB097" wp14:editId="052B67EB">
             <wp:extent cx="5943600" cy="1616075"/>
             <wp:effectExtent l="0" t="0" r="0" b="3175"/>
             <wp:docPr id="771735196" name="Picture 22"/>
@@ -11312,7 +11130,7 @@
                     </pic:cNvPicPr>
                   </pic:nvPicPr>
                   <pic:blipFill>
-                    <a:blip r:embed="rId70" cstate="print">
+                    <a:blip r:embed="rId72" cstate="print">
                       <a:extLst>
                         <a:ext uri="{28A0092B-C50C-407E-A947-70E740481C1C}">
                           <a14:useLocalDpi xmlns:a14="http://schemas.microsoft.com/office/drawing/2010/main" val="0"/>
@@ -11483,7 +11301,6 @@
                     <w:t>dotnet publish .\QuickGridUrlNavigationSampleNET10To11.csproj ` -c Release ` -</w:t>
                   </w:r>
                   <w:proofErr w:type="spellStart"/>
-                  <w:proofErr w:type="gramStart"/>
                   <w:r>
                     <w:rPr>
                       <w:i/>
@@ -11494,7 +11311,6 @@
                     <w:t>p:PublishTrimmed</w:t>
                   </w:r>
                   <w:proofErr w:type="spellEnd"/>
-                  <w:proofErr w:type="gramEnd"/>
                   <w:r>
                     <w:rPr>
                       <w:i/>
@@ -11502,27 +11318,7 @@
                       <w:sz w:val="20"/>
                       <w:szCs w:val="20"/>
                     </w:rPr>
-                    <w:t>=true ` -</w:t>
-                  </w:r>
-                  <w:proofErr w:type="gramStart"/>
-                  <w:r>
-                    <w:rPr>
-                      <w:i/>
-                      <w:iCs/>
-                      <w:sz w:val="20"/>
-                      <w:szCs w:val="20"/>
-                    </w:rPr>
-                    <w:t>o .artifacts</w:t>
-                  </w:r>
-                  <w:proofErr w:type="gramEnd"/>
-                  <w:r>
-                    <w:rPr>
-                      <w:i/>
-                      <w:iCs/>
-                      <w:sz w:val="20"/>
-                      <w:szCs w:val="20"/>
-                    </w:rPr>
-                    <w:t xml:space="preserve">\trimmed-publish </w:t>
+                    <w:t xml:space="preserve">=true ` -o .artifacts\trimmed-publish </w:t>
                   </w:r>
                 </w:p>
               </w:tc>
@@ -11609,6 +11405,7 @@
                       <w:sz w:val="20"/>
                       <w:szCs w:val="20"/>
                     </w:rPr>
+                    <w:lastRenderedPageBreak/>
                     <w:t>In project file</w:t>
                   </w:r>
                 </w:p>
@@ -11691,27 +11488,7 @@
                       <w:sz w:val="20"/>
                       <w:szCs w:val="20"/>
                     </w:rPr>
-                    <w:t>dotnet publish .\QuickGridUrlNavigationSampleNET10To11.csproj ` -c Release -</w:t>
-                  </w:r>
-                  <w:proofErr w:type="gramStart"/>
-                  <w:r>
-                    <w:rPr>
-                      <w:i/>
-                      <w:iCs/>
-                      <w:sz w:val="20"/>
-                      <w:szCs w:val="20"/>
-                    </w:rPr>
-                    <w:t>o .artifacts</w:t>
-                  </w:r>
-                  <w:proofErr w:type="gramEnd"/>
-                  <w:r>
-                    <w:rPr>
-                      <w:i/>
-                      <w:iCs/>
-                      <w:sz w:val="20"/>
-                      <w:szCs w:val="20"/>
-                    </w:rPr>
-                    <w:t xml:space="preserve">\trimmed-publish </w:t>
+                    <w:t xml:space="preserve">dotnet publish .\QuickGridUrlNavigationSampleNET10To11.csproj ` -c Release -o .artifacts\trimmed-publish </w:t>
                   </w:r>
                 </w:p>
               </w:tc>
@@ -11740,7 +11517,6 @@
                 <w:szCs w:val="20"/>
               </w:rPr>
             </w:pPr>
-            <w:proofErr w:type="gramStart"/>
             <w:r>
               <w:rPr>
                 <w:i/>
@@ -11748,30 +11524,30 @@
                 <w:sz w:val="20"/>
                 <w:szCs w:val="20"/>
               </w:rPr>
-              <w:t>cd .</w:t>
-            </w:r>
-            <w:proofErr w:type="gramEnd"/>
-            <w:r>
+              <w:t>cd .\artifacts\trimmed-publish </w:t>
+            </w:r>
+          </w:p>
+          <w:p>
+            <w:pPr>
+              <w:spacing w:line="240" w:lineRule="auto"/>
+              <w:ind w:left="360"/>
               <w:rPr>
                 <w:i/>
                 <w:iCs/>
                 <w:sz w:val="20"/>
                 <w:szCs w:val="20"/>
               </w:rPr>
-              <w:t>\artifacts\trimmed-publish </w:t>
-            </w:r>
-          </w:p>
-          <w:p>
-            <w:pPr>
-              <w:spacing w:line="240" w:lineRule="auto"/>
-              <w:ind w:left="360"/>
+            </w:pPr>
+            <w:r>
               <w:rPr>
                 <w:i/>
                 <w:iCs/>
                 <w:sz w:val="20"/>
                 <w:szCs w:val="20"/>
               </w:rPr>
-            </w:pPr>
+              <w:t>$</w:t>
+            </w:r>
+            <w:proofErr w:type="spellStart"/>
             <w:r>
               <w:rPr>
                 <w:i/>
@@ -11779,10 +11555,9 @@
                 <w:sz w:val="20"/>
                 <w:szCs w:val="20"/>
               </w:rPr>
-              <w:t>$</w:t>
-            </w:r>
-            <w:proofErr w:type="spellStart"/>
-            <w:proofErr w:type="gramStart"/>
+              <w:t>env:ASPNETCORE_ENVIRONMENT</w:t>
+            </w:r>
+            <w:proofErr w:type="spellEnd"/>
             <w:r>
               <w:rPr>
                 <w:i/>
@@ -11790,9 +11565,14 @@
                 <w:sz w:val="20"/>
                 <w:szCs w:val="20"/>
               </w:rPr>
-              <w:t>env:ASPNETCORE</w:t>
-            </w:r>
-            <w:proofErr w:type="gramEnd"/>
+              <w:t xml:space="preserve"> = "Production" </w:t>
+            </w:r>
+          </w:p>
+          <w:p>
+            <w:pPr>
+              <w:spacing w:line="240" w:lineRule="auto"/>
+              <w:ind w:left="360"/>
+            </w:pPr>
             <w:r>
               <w:rPr>
                 <w:i/>
@@ -11800,9 +11580,9 @@
                 <w:sz w:val="20"/>
                 <w:szCs w:val="20"/>
               </w:rPr>
-              <w:t>_ENVIRONMENT</w:t>
-            </w:r>
-            <w:proofErr w:type="spellEnd"/>
+              <w:t>dotnet .\QuickGridUrlNavigationSampleNET10To11.dll --</w:t>
+            </w:r>
+            <w:proofErr w:type="spellStart"/>
             <w:r>
               <w:rPr>
                 <w:i/>
@@ -11810,14 +11590,9 @@
                 <w:sz w:val="20"/>
                 <w:szCs w:val="20"/>
               </w:rPr>
-              <w:t xml:space="preserve"> = "Production" </w:t>
-            </w:r>
-          </w:p>
-          <w:p>
-            <w:pPr>
-              <w:spacing w:line="240" w:lineRule="auto"/>
-              <w:ind w:left="360"/>
-            </w:pPr>
+              <w:t>urls</w:t>
+            </w:r>
+            <w:proofErr w:type="spellEnd"/>
             <w:r>
               <w:rPr>
                 <w:i/>
@@ -11825,29 +11600,9 @@
                 <w:sz w:val="20"/>
                 <w:szCs w:val="20"/>
               </w:rPr>
-              <w:t>dotnet .\QuickGridUrlNavigationSampleNET10To11.dll --</w:t>
-            </w:r>
-            <w:proofErr w:type="spellStart"/>
-            <w:r>
-              <w:rPr>
-                <w:i/>
-                <w:iCs/>
-                <w:sz w:val="20"/>
-                <w:szCs w:val="20"/>
-              </w:rPr>
-              <w:t>urls</w:t>
-            </w:r>
-            <w:proofErr w:type="spellEnd"/>
-            <w:r>
-              <w:rPr>
-                <w:i/>
-                <w:iCs/>
-                <w:sz w:val="20"/>
-                <w:szCs w:val="20"/>
-              </w:rPr>
               <w:t xml:space="preserve"> </w:t>
             </w:r>
-            <w:hyperlink r:id="rId71" w:history="1">
+            <w:hyperlink r:id="rId73" w:history="1">
               <w:r>
                 <w:rPr>
                   <w:rStyle w:val="Hyperlink"/>
@@ -11960,18 +11715,9 @@
           <w:i/>
           <w:iCs/>
         </w:rPr>
-        <w:t>Router</w:t>
-      </w:r>
-      <w:proofErr w:type="gramStart"/>
-      <w:r>
-        <w:rPr>
-          <w:i/>
-          <w:iCs/>
-        </w:rPr>
-        <w:t>.NotFoundPage</w:t>
+        <w:t>Router.NotFoundPage</w:t>
       </w:r>
       <w:proofErr w:type="spellEnd"/>
-      <w:proofErr w:type="gramEnd"/>
       <w:r>
         <w:t>, component metadata, reflection-based JSON serialization, type resolution, and Session property preservation.</w:t>
       </w:r>
@@ -12025,7 +11771,6 @@
         <w:t>: A suitable constructor for type '</w:t>
       </w:r>
       <w:proofErr w:type="spellStart"/>
-      <w:proofErr w:type="gramStart"/>
       <w:r>
         <w:rPr>
           <w:i/>
@@ -12034,7 +11779,6 @@
         <w:t>TempDataSessionValidation.Components.Pages.NotFound</w:t>
       </w:r>
       <w:proofErr w:type="spellEnd"/>
-      <w:proofErr w:type="gramEnd"/>
       <w:r>
         <w:rPr>
           <w:i/>
@@ -12078,7 +11822,7 @@
           <w:numId w:val="21"/>
         </w:numPr>
       </w:pPr>
-      <w:hyperlink r:id="rId72" w:history="1">
+      <w:hyperlink r:id="rId74" w:history="1">
         <w:r>
           <w:rPr>
             <w:rStyle w:val="Hyperlink"/>
@@ -12095,7 +11839,7 @@
           <w:numId w:val="21"/>
         </w:numPr>
       </w:pPr>
-      <w:hyperlink r:id="rId73" w:history="1">
+      <w:hyperlink r:id="rId75" w:history="1">
         <w:r>
           <w:rPr>
             <w:rStyle w:val="Hyperlink"/>
@@ -12171,7 +11915,7 @@
         </w:numPr>
         <w:ind w:left="1488"/>
       </w:pPr>
-      <w:hyperlink r:id="rId74" w:history="1">
+      <w:hyperlink r:id="rId76" w:history="1">
         <w:r>
           <w:rPr>
             <w:rStyle w:val="Hyperlink"/>
@@ -12224,7 +11968,6 @@
           <w:b/>
           <w:bCs/>
         </w:rPr>
-        <w:lastRenderedPageBreak/>
         <w:t>Breaking Change Documentation Verdict</w:t>
       </w:r>
       <w:r>
@@ -12247,7 +11990,7 @@
         </w:numPr>
         <w:ind w:left="1488"/>
       </w:pPr>
-      <w:hyperlink r:id="rId75" w:history="1">
+      <w:hyperlink r:id="rId77" w:history="1">
         <w:r>
           <w:rPr>
             <w:rStyle w:val="Hyperlink"/>
@@ -12326,15 +12069,7 @@
         <w:t xml:space="preserve">(random) </w:t>
       </w:r>
       <w:r>
-        <w:t xml:space="preserve">observation was identified while manually editing the </w:t>
-      </w:r>
-      <w:proofErr w:type="gramStart"/>
-      <w:r>
-        <w:t>sort</w:t>
-      </w:r>
-      <w:proofErr w:type="gramEnd"/>
-      <w:r>
-        <w:t xml:space="preserve"> query parameter directly in the browser URL. This behavior was observed across all successfully executed .NET 11 configurations and did not affect normal </w:t>
+        <w:t xml:space="preserve">observation was identified while manually editing the sort query parameter directly in the browser URL. This behavior was observed across all successfully executed .NET 11 configurations and did not affect normal </w:t>
       </w:r>
       <w:proofErr w:type="spellStart"/>
       <w:r>
@@ -12362,15 +12097,7 @@
     </w:p>
     <w:p>
       <w:r>
-        <w:t xml:space="preserve">When manually editing a URL containing a </w:t>
-      </w:r>
-      <w:proofErr w:type="gramStart"/>
-      <w:r>
-        <w:t>sort</w:t>
-      </w:r>
-      <w:proofErr w:type="gramEnd"/>
-      <w:r>
-        <w:t xml:space="preserve"> parameter, such as:</w:t>
+        <w:t>When manually editing a URL containing a sort parameter, such as:</w:t>
       </w:r>
     </w:p>
     <w:tbl>
@@ -12414,15 +12141,7 @@
     <w:p/>
     <w:p>
       <w:r>
-        <w:t xml:space="preserve">the </w:t>
-      </w:r>
-      <w:proofErr w:type="gramStart"/>
-      <w:r>
-        <w:t>sort</w:t>
-      </w:r>
-      <w:proofErr w:type="gramEnd"/>
-      <w:r>
-        <w:t xml:space="preserve"> value occasionally became normalized to lowercase after navigation:</w:t>
+        <w:t>the sort value occasionally became normalized to lowercase after navigation:</w:t>
       </w:r>
     </w:p>
     <w:tbl>
@@ -12468,24 +12187,11 @@
       <w:r>
         <w:t xml:space="preserve">In </w:t>
       </w:r>
-      <w:proofErr w:type="gramStart"/>
       <w:r>
         <w:t>this</w:t>
       </w:r>
       <w:r>
-        <w:t xml:space="preserve"> instances</w:t>
-      </w:r>
-      <w:proofErr w:type="gramEnd"/>
-      <w:r>
-        <w:t xml:space="preserve">, the grid UI did not reflect the expected </w:t>
-      </w:r>
-      <w:proofErr w:type="gramStart"/>
-      <w:r>
-        <w:t>sort</w:t>
-      </w:r>
-      <w:proofErr w:type="gramEnd"/>
-      <w:r>
-        <w:t xml:space="preserve"> state after the parameter normalization occurred.</w:t>
+        <w:t xml:space="preserve"> instances, the grid UI did not reflect the expected sort state after the parameter normalization occurred.</w:t>
       </w:r>
     </w:p>
     <w:p>
@@ -12517,6 +12223,7 @@
         </w:numPr>
       </w:pPr>
       <w:r>
+        <w:lastRenderedPageBreak/>
         <w:t>.NET 11 Default Build</w:t>
       </w:r>
     </w:p>
@@ -12558,7 +12265,6 @@
     </w:p>
     <w:p>
       <w:r>
-        <w:lastRenderedPageBreak/>
         <w:t>The behavior was observed in both:</w:t>
       </w:r>
     </w:p>
@@ -12724,7 +12430,7 @@
       </w:r>
     </w:p>
     <w:p>
-      <w:hyperlink r:id="rId76" w:history="1">
+      <w:hyperlink r:id="rId78" w:history="1">
         <w:r>
           <w:rPr>
             <w:rStyle w:val="Hyperlink"/>
@@ -12739,7 +12445,7 @@
       </w:r>
     </w:p>
     <w:p>
-      <w:hyperlink r:id="rId77" w:history="1">
+      <w:hyperlink r:id="rId79" w:history="1">
         <w:r>
           <w:rPr>
             <w:rStyle w:val="Hyperlink"/>
@@ -12910,6 +12616,7 @@
               <w:spacing w:after="160" w:line="278" w:lineRule="auto"/>
             </w:pPr>
             <w:r>
+              <w:lastRenderedPageBreak/>
               <w:t xml:space="preserve">URL generation by </w:t>
             </w:r>
             <w:proofErr w:type="spellStart"/>
@@ -13005,7 +12712,6 @@
               <w:spacing w:after="160" w:line="278" w:lineRule="auto"/>
             </w:pPr>
             <w:r>
-              <w:lastRenderedPageBreak/>
               <w:t>Manual URL editing</w:t>
             </w:r>
           </w:p>
@@ -13064,7 +12770,7 @@
       <w:r>
         <w:t xml:space="preserve">SSR: </w:t>
       </w:r>
-      <w:hyperlink r:id="rId78" w:history="1">
+      <w:hyperlink r:id="rId80" w:history="1">
         <w:r>
           <w:rPr>
             <w:rStyle w:val="Hyperlink"/>
@@ -13105,7 +12811,7 @@
       <w:r>
         <w:t xml:space="preserve">Server: </w:t>
       </w:r>
-      <w:hyperlink r:id="rId79" w:history="1">
+      <w:hyperlink r:id="rId81" w:history="1">
         <w:r>
           <w:rPr>
             <w:rStyle w:val="Hyperlink"/>
@@ -16033,7 +15739,7 @@
   <w:style w:type="paragraph" w:default="1" w:styleId="Normal">
     <w:name w:val="Normal"/>
     <w:qFormat/>
-    <w:rsid w:val="000A4486"/>
+    <w:rsid w:val="00465889"/>
   </w:style>
   <w:style w:type="paragraph" w:styleId="Heading1">
     <w:name w:val="heading 1"/>

</xml_diff>

<commit_message>
Updated the the validation report with documentation assessment
</commit_message>
<xml_diff>
--- a/Evidence/What QuickGrid's URL navigation changes for an existing app.docx
+++ b/Evidence/What QuickGrid's URL navigation changes for an existing app.docx
@@ -159,7 +159,7 @@
         </w:numPr>
       </w:pPr>
       <w:r>
-        <w:t>Trimmed Publish (attempted)</w:t>
+        <w:t xml:space="preserve">Trimmed Publish </w:t>
       </w:r>
     </w:p>
     <w:p>
@@ -224,7 +224,13 @@
         <w:t>Outcome:</w:t>
       </w:r>
       <w:r>
-        <w:t xml:space="preserve"> Partially Passed (Trimmed publish validation blocked by runtime exception)</w:t>
+        <w:t xml:space="preserve"> </w:t>
+      </w:r>
+      <w:r>
+        <w:t xml:space="preserve">Partially </w:t>
+      </w:r>
+      <w:r>
+        <w:t>Passed (Trimmed publish validation blocked by runtime exception)</w:t>
       </w:r>
     </w:p>
     <w:p/>
@@ -10475,7 +10481,7 @@
           <w:noProof/>
         </w:rPr>
         <w:drawing>
-          <wp:inline distT="0" distB="0" distL="0" distR="0" wp14:anchorId="3DA66B92" wp14:editId="6D3E4715">
+          <wp:inline distT="0" distB="0" distL="0" distR="0" wp14:anchorId="3DA66B92" wp14:editId="1A43B55A">
             <wp:extent cx="5943600" cy="1237615"/>
             <wp:effectExtent l="0" t="0" r="0" b="635"/>
             <wp:docPr id="2134330611" name="Picture 16"/>
@@ -11113,7 +11119,7 @@
           <w:noProof/>
         </w:rPr>
         <w:drawing>
-          <wp:inline distT="0" distB="0" distL="0" distR="0" wp14:anchorId="391BB097" wp14:editId="052B67EB">
+          <wp:inline distT="0" distB="0" distL="0" distR="0" wp14:anchorId="391BB097" wp14:editId="49E967E6">
             <wp:extent cx="5943600" cy="1616075"/>
             <wp:effectExtent l="0" t="0" r="0" b="3175"/>
             <wp:docPr id="771735196" name="Picture 22"/>
@@ -11731,7 +11737,7 @@
         </w:numPr>
       </w:pPr>
       <w:r>
-        <w:t>The trimmed executable started, but both the root route and /supported/set returned HTTP 500 during Razor component activation.</w:t>
+        <w:t>The trimmed axis is classified as a configuration limitation, not a regression.</w:t>
       </w:r>
     </w:p>
     <w:p>
@@ -11742,18 +11748,6 @@
           <w:numId w:val="10"/>
         </w:numPr>
       </w:pPr>
-      <w:r>
-        <w:t>The trimmed axis is classified as a configuration limitation, not a regression.</w:t>
-      </w:r>
-    </w:p>
-    <w:p>
-      <w:pPr>
-        <w:pStyle w:val="ListParagraph"/>
-        <w:numPr>
-          <w:ilvl w:val="0"/>
-          <w:numId w:val="10"/>
-        </w:numPr>
-      </w:pPr>
       <w:proofErr w:type="spellStart"/>
       <w:r>
         <w:rPr>
@@ -11768,23 +11762,42 @@
           <w:i/>
           <w:iCs/>
         </w:rPr>
-        <w:t>: A suitable constructor for type '</w:t>
-      </w:r>
-      <w:proofErr w:type="spellStart"/>
+        <w:t xml:space="preserve">: A suitable constructor for type </w:t>
+      </w:r>
       <w:r>
         <w:rPr>
           <w:i/>
           <w:iCs/>
         </w:rPr>
-        <w:t>TempDataSessionValidation.Components.Pages.NotFound</w:t>
-      </w:r>
-      <w:proofErr w:type="spellEnd"/>
+        <w:t>‘</w:t>
+      </w:r>
       <w:r>
         <w:rPr>
           <w:i/>
           <w:iCs/>
         </w:rPr>
-        <w:t>' could not be located</w:t>
+        <w:t>QuickGridUrlNavigationSampleNET10To11</w:t>
+      </w:r>
+      <w:r>
+        <w:rPr>
+          <w:i/>
+          <w:iCs/>
+        </w:rPr>
+        <w:t>.Components.Pages.NotFound</w:t>
+      </w:r>
+      <w:r>
+        <w:rPr>
+          <w:i/>
+          <w:iCs/>
+        </w:rPr>
+        <w:t xml:space="preserve">’ </w:t>
+      </w:r>
+      <w:r>
+        <w:rPr>
+          <w:i/>
+          <w:iCs/>
+        </w:rPr>
+        <w:t>could not be located</w:t>
       </w:r>
       <w:r>
         <w:t xml:space="preserve"> occurred while navigating to trimmed published localhost </w:t>
@@ -11920,7 +11933,19 @@
           <w:rPr>
             <w:rStyle w:val="Hyperlink"/>
           </w:rPr>
-          <w:t>ASP.NET Core Blazor `</w:t>
+          <w:t>ASP.NET C</w:t>
+        </w:r>
+        <w:r>
+          <w:rPr>
+            <w:rStyle w:val="Hyperlink"/>
+          </w:rPr>
+          <w:t>o</w:t>
+        </w:r>
+        <w:r>
+          <w:rPr>
+            <w:rStyle w:val="Hyperlink"/>
+          </w:rPr>
+          <w:t>re Blazor `</w:t>
         </w:r>
         <w:proofErr w:type="spellStart"/>
         <w:r>
@@ -11948,6 +11973,7 @@
         <w:ind w:left="1488"/>
       </w:pPr>
       <w:r>
+        <w:lastRenderedPageBreak/>
         <w:t xml:space="preserve">The reviewed documentation provides enough information to understand and validate the </w:t>
       </w:r>
       <w:proofErr w:type="spellStart"/>
@@ -11957,6 +11983,408 @@
       <w:proofErr w:type="spellEnd"/>
       <w:r>
         <w:t xml:space="preserve"> URL-navigation functionality introduced in .NET 11. Sorting, paging, URL-state restoration, and browser navigation scenarios were successfully reproduced using the available documentation. </w:t>
+      </w:r>
+    </w:p>
+    <w:p>
+      <w:pPr>
+        <w:ind w:left="720"/>
+        <w:rPr>
+          <w:b/>
+          <w:bCs/>
+        </w:rPr>
+      </w:pPr>
+      <w:r>
+        <w:rPr>
+          <w:b/>
+          <w:bCs/>
+        </w:rPr>
+        <w:t>Compatibility Switch Discoverability</w:t>
+      </w:r>
+    </w:p>
+    <w:p>
+      <w:pPr>
+        <w:ind w:left="720"/>
+        <w:rPr>
+          <w:b/>
+          <w:bCs/>
+        </w:rPr>
+      </w:pPr>
+      <w:r>
+        <w:t>The validation scenario requested confirmation of whether the compatibility switch name and configuration mechanism could be discovered from the reviewed documentation alone.</w:t>
+      </w:r>
+    </w:p>
+    <w:p>
+      <w:pPr>
+        <w:ind w:left="720"/>
+      </w:pPr>
+      <w:r>
+        <w:t xml:space="preserve">The reviewed </w:t>
+      </w:r>
+      <w:proofErr w:type="spellStart"/>
+      <w:r>
+        <w:t>QuickGrid</w:t>
+      </w:r>
+      <w:proofErr w:type="spellEnd"/>
+      <w:r>
+        <w:t xml:space="preserve"> documentation explicitly documents the compatibility switch:</w:t>
+      </w:r>
+    </w:p>
+    <w:tbl>
+      <w:tblPr>
+        <w:tblStyle w:val="TableGrid"/>
+        <w:tblW w:w="0" w:type="auto"/>
+        <w:tblInd w:w="720" w:type="dxa"/>
+        <w:tblLook w:val="04A0" w:firstRow="1" w:lastRow="0" w:firstColumn="1" w:lastColumn="0" w:noHBand="0" w:noVBand="1"/>
+      </w:tblPr>
+      <w:tblGrid>
+        <w:gridCol w:w="8630"/>
+      </w:tblGrid>
+      <w:tr>
+        <w:tc>
+          <w:tcPr>
+            <w:tcW w:w="9350" w:type="dxa"/>
+          </w:tcPr>
+          <w:p>
+            <w:pPr>
+              <w:spacing w:after="160" w:line="278" w:lineRule="auto"/>
+              <w:rPr>
+                <w:i/>
+                <w:iCs/>
+              </w:rPr>
+            </w:pPr>
+            <w:r>
+              <w:rPr>
+                <w:i/>
+                <w:iCs/>
+              </w:rPr>
+              <w:t>Microsoft.AspNetCore.Components.QuickGrid.EnableUrlBasedQuickGridNavigationAndSorting</w:t>
+            </w:r>
+          </w:p>
+        </w:tc>
+      </w:tr>
+    </w:tbl>
+    <w:p>
+      <w:pPr>
+        <w:ind w:left="720"/>
+      </w:pPr>
+      <w:r>
+        <w:t>and provides an example using:</w:t>
+      </w:r>
+    </w:p>
+    <w:tbl>
+      <w:tblPr>
+        <w:tblStyle w:val="TableGrid"/>
+        <w:tblW w:w="0" w:type="auto"/>
+        <w:tblInd w:w="720" w:type="dxa"/>
+        <w:tblLook w:val="04A0" w:firstRow="1" w:lastRow="0" w:firstColumn="1" w:lastColumn="0" w:noHBand="0" w:noVBand="1"/>
+      </w:tblPr>
+      <w:tblGrid>
+        <w:gridCol w:w="8630"/>
+      </w:tblGrid>
+      <w:tr>
+        <w:tc>
+          <w:tcPr>
+            <w:tcW w:w="9350" w:type="dxa"/>
+          </w:tcPr>
+          <w:p>
+            <w:pPr>
+              <w:spacing w:after="160" w:line="278" w:lineRule="auto"/>
+              <w:rPr>
+                <w:i/>
+                <w:iCs/>
+              </w:rPr>
+            </w:pPr>
+            <w:r>
+              <w:rPr>
+                <w:i/>
+                <w:iCs/>
+              </w:rPr>
+              <w:t>AppContext.SetSwitch("Microsoft.AspNetCore.Components.QuickGrid.EnableUrlBasedQuickGridNavigationAndSorting",false);</w:t>
+            </w:r>
+          </w:p>
+        </w:tc>
+      </w:tr>
+    </w:tbl>
+    <w:p>
+      <w:pPr>
+        <w:ind w:left="720"/>
+      </w:pPr>
+      <w:r>
+        <w:t>The documentation also explains:</w:t>
+      </w:r>
+    </w:p>
+    <w:p>
+      <w:pPr>
+        <w:pStyle w:val="ListParagraph"/>
+        <w:numPr>
+          <w:ilvl w:val="0"/>
+          <w:numId w:val="24"/>
+        </w:numPr>
+      </w:pPr>
+      <w:r>
+        <w:t>How to disable URL-based navigation.</w:t>
+      </w:r>
+    </w:p>
+    <w:p>
+      <w:pPr>
+        <w:pStyle w:val="ListParagraph"/>
+        <w:numPr>
+          <w:ilvl w:val="0"/>
+          <w:numId w:val="24"/>
+        </w:numPr>
+      </w:pPr>
+      <w:r>
+        <w:t>That button-based rendering is restored.</w:t>
+      </w:r>
+    </w:p>
+    <w:p>
+      <w:pPr>
+        <w:pStyle w:val="ListParagraph"/>
+        <w:numPr>
+          <w:ilvl w:val="0"/>
+          <w:numId w:val="24"/>
+        </w:numPr>
+      </w:pPr>
+      <w:r>
+        <w:t>That the switch only affects the rendered HTML element (&lt;a&gt; versus &lt;button&gt;).</w:t>
+      </w:r>
+    </w:p>
+    <w:p>
+      <w:pPr>
+        <w:pStyle w:val="ListParagraph"/>
+        <w:numPr>
+          <w:ilvl w:val="0"/>
+          <w:numId w:val="24"/>
+        </w:numPr>
+      </w:pPr>
+      <w:r>
+        <w:t xml:space="preserve">That </w:t>
+      </w:r>
+      <w:proofErr w:type="spellStart"/>
+      <w:r>
+        <w:t>QuickGrid</w:t>
+      </w:r>
+      <w:proofErr w:type="spellEnd"/>
+      <w:r>
+        <w:t xml:space="preserve"> continues to read and write URL state internally even when the switch is disabled.</w:t>
+      </w:r>
+    </w:p>
+    <w:p>
+      <w:pPr>
+        <w:ind w:left="720"/>
+        <w:rPr>
+          <w:b/>
+          <w:bCs/>
+        </w:rPr>
+      </w:pPr>
+      <w:r>
+        <w:rPr>
+          <w:b/>
+          <w:bCs/>
+        </w:rPr>
+        <w:t>Validation Result</w:t>
+      </w:r>
+    </w:p>
+    <w:p>
+      <w:pPr>
+        <w:ind w:left="720"/>
+      </w:pPr>
+      <w:r>
+        <w:rPr>
+          <w:b/>
+          <w:bCs/>
+        </w:rPr>
+        <w:t>Switch Name Discoverable from Documentation:</w:t>
+      </w:r>
+      <w:r>
+        <w:t xml:space="preserve"> Yes</w:t>
+      </w:r>
+    </w:p>
+    <w:p>
+      <w:pPr>
+        <w:ind w:left="720"/>
+      </w:pPr>
+      <w:proofErr w:type="spellStart"/>
+      <w:r>
+        <w:rPr>
+          <w:b/>
+          <w:bCs/>
+        </w:rPr>
+        <w:t>Program.cs</w:t>
+      </w:r>
+      <w:proofErr w:type="spellEnd"/>
+      <w:r>
+        <w:rPr>
+          <w:b/>
+          <w:bCs/>
+        </w:rPr>
+        <w:t xml:space="preserve"> Configuration Discoverable from Documentation:</w:t>
+      </w:r>
+      <w:r>
+        <w:t xml:space="preserve"> Yes</w:t>
+      </w:r>
+    </w:p>
+    <w:p>
+      <w:pPr>
+        <w:ind w:left="720"/>
+      </w:pPr>
+      <w:r>
+        <w:t xml:space="preserve">The switch name and its </w:t>
+      </w:r>
+      <w:proofErr w:type="spellStart"/>
+      <w:r>
+        <w:t>AppContext.SetSwitch</w:t>
+      </w:r>
+      <w:proofErr w:type="spellEnd"/>
+      <w:r>
+        <w:t xml:space="preserve"> configuration method were directly discoverable from the reviewed </w:t>
+      </w:r>
+      <w:proofErr w:type="spellStart"/>
+      <w:r>
+        <w:t>QuickGrid</w:t>
+      </w:r>
+      <w:proofErr w:type="spellEnd"/>
+      <w:r>
+        <w:t xml:space="preserve"> documentation.</w:t>
+      </w:r>
+    </w:p>
+    <w:p>
+      <w:pPr>
+        <w:ind w:left="720"/>
+        <w:rPr>
+          <w:b/>
+          <w:bCs/>
+        </w:rPr>
+      </w:pPr>
+      <w:r>
+        <w:rPr>
+          <w:b/>
+          <w:bCs/>
+        </w:rPr>
+        <w:t>Additional Observation</w:t>
+      </w:r>
+    </w:p>
+    <w:p>
+      <w:pPr>
+        <w:ind w:left="720"/>
+      </w:pPr>
+      <w:r>
+        <w:t xml:space="preserve">While the switch name and the </w:t>
+      </w:r>
+      <w:proofErr w:type="spellStart"/>
+      <w:r>
+        <w:t>Program.cs</w:t>
+      </w:r>
+      <w:proofErr w:type="spellEnd"/>
+      <w:r>
+        <w:t xml:space="preserve"> configuration approach are documented, the project-file configuration approach using:</w:t>
+      </w:r>
+    </w:p>
+    <w:tbl>
+      <w:tblPr>
+        <w:tblStyle w:val="TableGrid"/>
+        <w:tblW w:w="0" w:type="auto"/>
+        <w:tblInd w:w="720" w:type="dxa"/>
+        <w:tblLook w:val="04A0" w:firstRow="1" w:lastRow="0" w:firstColumn="1" w:lastColumn="0" w:noHBand="0" w:noVBand="1"/>
+      </w:tblPr>
+      <w:tblGrid>
+        <w:gridCol w:w="8630"/>
+      </w:tblGrid>
+      <w:tr>
+        <w:tc>
+          <w:tcPr>
+            <w:tcW w:w="9350" w:type="dxa"/>
+          </w:tcPr>
+          <w:p>
+            <w:pPr>
+              <w:spacing w:after="160" w:line="278" w:lineRule="auto"/>
+              <w:rPr>
+                <w:i/>
+                <w:iCs/>
+              </w:rPr>
+            </w:pPr>
+            <w:r>
+              <w:rPr>
+                <w:i/>
+                <w:iCs/>
+              </w:rPr>
+              <w:lastRenderedPageBreak/>
+              <w:t>&lt;</w:t>
+            </w:r>
+            <w:proofErr w:type="spellStart"/>
+            <w:r>
+              <w:rPr>
+                <w:i/>
+                <w:iCs/>
+              </w:rPr>
+              <w:t>RuntimeHostConfigurationOption</w:t>
+            </w:r>
+            <w:proofErr w:type="spellEnd"/>
+            <w:r>
+              <w:rPr>
+                <w:i/>
+                <w:iCs/>
+              </w:rPr>
+              <w:t xml:space="preserve"> Include="Microsoft.AspNetCore.Components.QuickGrid.EnableUrlBasedQuickGridNavigationAndSorting" Value="false" /&gt;</w:t>
+            </w:r>
+          </w:p>
+        </w:tc>
+      </w:tr>
+    </w:tbl>
+    <w:p>
+      <w:pPr>
+        <w:ind w:left="720"/>
+      </w:pPr>
+      <w:r>
+        <w:t xml:space="preserve">was not explicitly identified in the reviewed </w:t>
+      </w:r>
+      <w:proofErr w:type="spellStart"/>
+      <w:r>
+        <w:t>QuickGrid</w:t>
+      </w:r>
+      <w:proofErr w:type="spellEnd"/>
+      <w:r>
+        <w:t xml:space="preserve"> documentation and was discovered separately during validation.</w:t>
+      </w:r>
+    </w:p>
+    <w:p>
+      <w:pPr>
+        <w:ind w:left="720"/>
+        <w:rPr>
+          <w:b/>
+          <w:bCs/>
+        </w:rPr>
+      </w:pPr>
+      <w:r>
+        <w:rPr>
+          <w:b/>
+          <w:bCs/>
+        </w:rPr>
+        <w:t>Verdict</w:t>
+      </w:r>
+    </w:p>
+    <w:p>
+      <w:pPr>
+        <w:ind w:left="720"/>
+      </w:pPr>
+      <w:r>
+        <w:t xml:space="preserve">The </w:t>
+      </w:r>
+      <w:proofErr w:type="spellStart"/>
+      <w:r>
+        <w:t>QuickGrid</w:t>
+      </w:r>
+      <w:proofErr w:type="spellEnd"/>
+      <w:r>
+        <w:t xml:space="preserve"> documentation provides sufficient information to identify the compatibility switch and configure it using </w:t>
+      </w:r>
+      <w:proofErr w:type="spellStart"/>
+      <w:r>
+        <w:t>AppContext.SetSwitch</w:t>
+      </w:r>
+      <w:proofErr w:type="spellEnd"/>
+      <w:r>
+        <w:t>. Therefore, a developer investigating the URL-navigation behavior can discover the switch name from the reviewed documentation alone. The project-file configuration alternative was not explicitly documented in the reviewed material and required additional investigation.</w:t>
       </w:r>
     </w:p>
     <w:p>
@@ -12041,7 +12469,6 @@
         <w:t xml:space="preserve"> URL-navigation functionality itself.</w:t>
       </w:r>
     </w:p>
-    <w:p/>
     <w:p>
       <w:pPr>
         <w:rPr>
@@ -12163,6 +12590,7 @@
               <w:spacing w:after="160" w:line="278" w:lineRule="auto"/>
             </w:pPr>
             <w:r>
+              <w:lastRenderedPageBreak/>
               <w:t>?sort=</w:t>
             </w:r>
             <w:proofErr w:type="spellStart"/>
@@ -12223,7 +12651,6 @@
         </w:numPr>
       </w:pPr>
       <w:r>
-        <w:lastRenderedPageBreak/>
         <w:t>.NET 11 Default Build</w:t>
       </w:r>
     </w:p>
@@ -12456,6 +12883,7 @@
     </w:p>
     <w:p>
       <w:r>
+        <w:lastRenderedPageBreak/>
         <w:t>With this</w:t>
       </w:r>
       <w:r>
@@ -12616,7 +13044,6 @@
               <w:spacing w:after="160" w:line="278" w:lineRule="auto"/>
             </w:pPr>
             <w:r>
-              <w:lastRenderedPageBreak/>
               <w:t xml:space="preserve">URL generation by </w:t>
             </w:r>
             <w:proofErr w:type="spellStart"/>
@@ -12855,6 +13282,155 @@
 <file path=word/numbering.xml><?xml version="1.0" encoding="utf-8"?>
 <w:numbering xmlns:wpc="http://schemas.microsoft.com/office/word/2010/wordprocessingCanvas" xmlns:cx="http://schemas.microsoft.com/office/drawing/2014/chartex" xmlns:cx1="http://schemas.microsoft.com/office/drawing/2015/9/8/chartex" xmlns:cx2="http://schemas.microsoft.com/office/drawing/2015/10/21/chartex" xmlns:cx3="http://schemas.microsoft.com/office/drawing/2016/5/9/chartex" xmlns:cx4="http://schemas.microsoft.com/office/drawing/2016/5/10/chartex" xmlns:cx5="http://schemas.microsoft.com/office/drawing/2016/5/11/chartex" xmlns:cx6="http://schemas.microsoft.com/office/drawing/2016/5/12/chartex" xmlns:cx7="http://schemas.microsoft.com/office/drawing/2016/5/13/chartex" xmlns:cx8="http://schemas.microsoft.com/office/drawing/2016/5/14/chartex" xmlns:mc="http://schemas.openxmlformats.org/markup-compatibility/2006" xmlns:aink="http://schemas.microsoft.com/office/drawing/2016/ink" xmlns:am3d="http://schemas.microsoft.com/office/drawing/2017/model3d" xmlns:o="urn:schemas-microsoft-com:office:office" xmlns:oel="http://schemas.microsoft.com/office/2019/extlst" xmlns:r="http://schemas.openxmlformats.org/officeDocument/2006/relationships" xmlns:m="http://schemas.openxmlformats.org/officeDocument/2006/math" xmlns:v="urn:schemas-microsoft-com:vml" xmlns:wp14="http://schemas.microsoft.com/office/word/2010/wordprocessingDrawing" xmlns:wp="http://schemas.openxmlformats.org/drawingml/2006/wordprocessingDrawing" xmlns:w10="urn:schemas-microsoft-com:office:word" xmlns:w="http://schemas.openxmlformats.org/wordprocessingml/2006/main" xmlns:w14="http://schemas.microsoft.com/office/word/2010/wordml" xmlns:w15="http://schemas.microsoft.com/office/word/2012/wordml" xmlns:w16cex="http://schemas.microsoft.com/office/word/2018/wordml/cex" xmlns:w16cid="http://schemas.microsoft.com/office/word/2016/wordml/cid" xmlns:w16="http://schemas.microsoft.com/office/word/2018/wordml" xmlns:w16du="http://schemas.microsoft.com/office/word/2023/wordml/word16du" xmlns:w16sdtdh="http://schemas.microsoft.com/office/word/2020/wordml/sdtdatahash" xmlns:w16sdtfl="http://schemas.microsoft.com/office/word/2024/wordml/sdtformatlock" xmlns:w16se="http://schemas.microsoft.com/office/word/2015/wordml/symex" xmlns:wpg="http://schemas.microsoft.com/office/word/2010/wordprocessingGroup" xmlns:wpi="http://schemas.microsoft.com/office/word/2010/wordprocessingInk" xmlns:wne="http://schemas.microsoft.com/office/word/2006/wordml" xmlns:wps="http://schemas.microsoft.com/office/word/2010/wordprocessingShape" mc:Ignorable="w14 w15 w16se w16cid w16 w16cex w16sdtdh w16sdtfl w16du wp14">
   <w:abstractNum w:abstractNumId="0" w15:restartNumberingAfterBreak="0">
+    <w:nsid w:val="00EE52BF"/>
+    <w:multiLevelType w:val="multilevel"/>
+    <w:tmpl w:val="4D284CAE"/>
+    <w:lvl w:ilvl="0">
+      <w:start w:val="1"/>
+      <w:numFmt w:val="bullet"/>
+      <w:lvlText w:val=""/>
+      <w:lvlJc w:val="left"/>
+      <w:pPr>
+        <w:tabs>
+          <w:tab w:val="num" w:pos="720"/>
+        </w:tabs>
+        <w:ind w:left="720" w:hanging="360"/>
+      </w:pPr>
+      <w:rPr>
+        <w:rFonts w:ascii="Symbol" w:hAnsi="Symbol" w:hint="default"/>
+        <w:sz w:val="20"/>
+      </w:rPr>
+    </w:lvl>
+    <w:lvl w:ilvl="1" w:tentative="1">
+      <w:start w:val="1"/>
+      <w:numFmt w:val="bullet"/>
+      <w:lvlText w:val="o"/>
+      <w:lvlJc w:val="left"/>
+      <w:pPr>
+        <w:tabs>
+          <w:tab w:val="num" w:pos="1440"/>
+        </w:tabs>
+        <w:ind w:left="1440" w:hanging="360"/>
+      </w:pPr>
+      <w:rPr>
+        <w:rFonts w:ascii="Courier New" w:hAnsi="Courier New" w:hint="default"/>
+        <w:sz w:val="20"/>
+      </w:rPr>
+    </w:lvl>
+    <w:lvl w:ilvl="2" w:tentative="1">
+      <w:start w:val="1"/>
+      <w:numFmt w:val="bullet"/>
+      <w:lvlText w:val=""/>
+      <w:lvlJc w:val="left"/>
+      <w:pPr>
+        <w:tabs>
+          <w:tab w:val="num" w:pos="2160"/>
+        </w:tabs>
+        <w:ind w:left="2160" w:hanging="360"/>
+      </w:pPr>
+      <w:rPr>
+        <w:rFonts w:ascii="Wingdings" w:hAnsi="Wingdings" w:hint="default"/>
+        <w:sz w:val="20"/>
+      </w:rPr>
+    </w:lvl>
+    <w:lvl w:ilvl="3" w:tentative="1">
+      <w:start w:val="1"/>
+      <w:numFmt w:val="bullet"/>
+      <w:lvlText w:val=""/>
+      <w:lvlJc w:val="left"/>
+      <w:pPr>
+        <w:tabs>
+          <w:tab w:val="num" w:pos="2880"/>
+        </w:tabs>
+        <w:ind w:left="2880" w:hanging="360"/>
+      </w:pPr>
+      <w:rPr>
+        <w:rFonts w:ascii="Wingdings" w:hAnsi="Wingdings" w:hint="default"/>
+        <w:sz w:val="20"/>
+      </w:rPr>
+    </w:lvl>
+    <w:lvl w:ilvl="4" w:tentative="1">
+      <w:start w:val="1"/>
+      <w:numFmt w:val="bullet"/>
+      <w:lvlText w:val=""/>
+      <w:lvlJc w:val="left"/>
+      <w:pPr>
+        <w:tabs>
+          <w:tab w:val="num" w:pos="3600"/>
+        </w:tabs>
+        <w:ind w:left="3600" w:hanging="360"/>
+      </w:pPr>
+      <w:rPr>
+        <w:rFonts w:ascii="Wingdings" w:hAnsi="Wingdings" w:hint="default"/>
+        <w:sz w:val="20"/>
+      </w:rPr>
+    </w:lvl>
+    <w:lvl w:ilvl="5" w:tentative="1">
+      <w:start w:val="1"/>
+      <w:numFmt w:val="bullet"/>
+      <w:lvlText w:val=""/>
+      <w:lvlJc w:val="left"/>
+      <w:pPr>
+        <w:tabs>
+          <w:tab w:val="num" w:pos="4320"/>
+        </w:tabs>
+        <w:ind w:left="4320" w:hanging="360"/>
+      </w:pPr>
+      <w:rPr>
+        <w:rFonts w:ascii="Wingdings" w:hAnsi="Wingdings" w:hint="default"/>
+        <w:sz w:val="20"/>
+      </w:rPr>
+    </w:lvl>
+    <w:lvl w:ilvl="6" w:tentative="1">
+      <w:start w:val="1"/>
+      <w:numFmt w:val="bullet"/>
+      <w:lvlText w:val=""/>
+      <w:lvlJc w:val="left"/>
+      <w:pPr>
+        <w:tabs>
+          <w:tab w:val="num" w:pos="5040"/>
+        </w:tabs>
+        <w:ind w:left="5040" w:hanging="360"/>
+      </w:pPr>
+      <w:rPr>
+        <w:rFonts w:ascii="Wingdings" w:hAnsi="Wingdings" w:hint="default"/>
+        <w:sz w:val="20"/>
+      </w:rPr>
+    </w:lvl>
+    <w:lvl w:ilvl="7" w:tentative="1">
+      <w:start w:val="1"/>
+      <w:numFmt w:val="bullet"/>
+      <w:lvlText w:val=""/>
+      <w:lvlJc w:val="left"/>
+      <w:pPr>
+        <w:tabs>
+          <w:tab w:val="num" w:pos="5760"/>
+        </w:tabs>
+        <w:ind w:left="5760" w:hanging="360"/>
+      </w:pPr>
+      <w:rPr>
+        <w:rFonts w:ascii="Wingdings" w:hAnsi="Wingdings" w:hint="default"/>
+        <w:sz w:val="20"/>
+      </w:rPr>
+    </w:lvl>
+    <w:lvl w:ilvl="8" w:tentative="1">
+      <w:start w:val="1"/>
+      <w:numFmt w:val="bullet"/>
+      <w:lvlText w:val=""/>
+      <w:lvlJc w:val="left"/>
+      <w:pPr>
+        <w:tabs>
+          <w:tab w:val="num" w:pos="6480"/>
+        </w:tabs>
+        <w:ind w:left="6480" w:hanging="360"/>
+      </w:pPr>
+      <w:rPr>
+        <w:rFonts w:ascii="Wingdings" w:hAnsi="Wingdings" w:hint="default"/>
+        <w:sz w:val="20"/>
+      </w:rPr>
+    </w:lvl>
+  </w:abstractNum>
+  <w:abstractNum w:abstractNumId="1" w15:restartNumberingAfterBreak="0">
     <w:nsid w:val="04EA4661"/>
     <w:multiLevelType w:val="hybridMultilevel"/>
     <w:tmpl w:val="5C5CB5DA"/>
@@ -12967,7 +13543,7 @@
       </w:rPr>
     </w:lvl>
   </w:abstractNum>
-  <w:abstractNum w:abstractNumId="1" w15:restartNumberingAfterBreak="0">
+  <w:abstractNum w:abstractNumId="2" w15:restartNumberingAfterBreak="0">
     <w:nsid w:val="0C3F7630"/>
     <w:multiLevelType w:val="hybridMultilevel"/>
     <w:tmpl w:val="B0C28C5E"/>
@@ -13080,7 +13656,7 @@
       </w:rPr>
     </w:lvl>
   </w:abstractNum>
-  <w:abstractNum w:abstractNumId="2" w15:restartNumberingAfterBreak="0">
+  <w:abstractNum w:abstractNumId="3" w15:restartNumberingAfterBreak="0">
     <w:nsid w:val="11F5251B"/>
     <w:multiLevelType w:val="multilevel"/>
     <w:tmpl w:val="4C50293E"/>
@@ -13229,7 +13805,7 @@
       </w:rPr>
     </w:lvl>
   </w:abstractNum>
-  <w:abstractNum w:abstractNumId="3" w15:restartNumberingAfterBreak="0">
+  <w:abstractNum w:abstractNumId="4" w15:restartNumberingAfterBreak="0">
     <w:nsid w:val="12835EA6"/>
     <w:multiLevelType w:val="hybridMultilevel"/>
     <w:tmpl w:val="A8EC0CB6"/>
@@ -13315,7 +13891,7 @@
       </w:pPr>
     </w:lvl>
   </w:abstractNum>
-  <w:abstractNum w:abstractNumId="4" w15:restartNumberingAfterBreak="0">
+  <w:abstractNum w:abstractNumId="5" w15:restartNumberingAfterBreak="0">
     <w:nsid w:val="13F4272F"/>
     <w:multiLevelType w:val="hybridMultilevel"/>
     <w:tmpl w:val="FA4606E4"/>
@@ -13428,7 +14004,156 @@
       </w:rPr>
     </w:lvl>
   </w:abstractNum>
-  <w:abstractNum w:abstractNumId="5" w15:restartNumberingAfterBreak="0">
+  <w:abstractNum w:abstractNumId="6" w15:restartNumberingAfterBreak="0">
+    <w:nsid w:val="1CF64C4A"/>
+    <w:multiLevelType w:val="multilevel"/>
+    <w:tmpl w:val="E22E85B8"/>
+    <w:lvl w:ilvl="0">
+      <w:start w:val="1"/>
+      <w:numFmt w:val="bullet"/>
+      <w:lvlText w:val=""/>
+      <w:lvlJc w:val="left"/>
+      <w:pPr>
+        <w:tabs>
+          <w:tab w:val="num" w:pos="720"/>
+        </w:tabs>
+        <w:ind w:left="720" w:hanging="360"/>
+      </w:pPr>
+      <w:rPr>
+        <w:rFonts w:ascii="Symbol" w:hAnsi="Symbol" w:hint="default"/>
+        <w:sz w:val="20"/>
+      </w:rPr>
+    </w:lvl>
+    <w:lvl w:ilvl="1" w:tentative="1">
+      <w:start w:val="1"/>
+      <w:numFmt w:val="bullet"/>
+      <w:lvlText w:val="o"/>
+      <w:lvlJc w:val="left"/>
+      <w:pPr>
+        <w:tabs>
+          <w:tab w:val="num" w:pos="1440"/>
+        </w:tabs>
+        <w:ind w:left="1440" w:hanging="360"/>
+      </w:pPr>
+      <w:rPr>
+        <w:rFonts w:ascii="Courier New" w:hAnsi="Courier New" w:hint="default"/>
+        <w:sz w:val="20"/>
+      </w:rPr>
+    </w:lvl>
+    <w:lvl w:ilvl="2" w:tentative="1">
+      <w:start w:val="1"/>
+      <w:numFmt w:val="bullet"/>
+      <w:lvlText w:val=""/>
+      <w:lvlJc w:val="left"/>
+      <w:pPr>
+        <w:tabs>
+          <w:tab w:val="num" w:pos="2160"/>
+        </w:tabs>
+        <w:ind w:left="2160" w:hanging="360"/>
+      </w:pPr>
+      <w:rPr>
+        <w:rFonts w:ascii="Wingdings" w:hAnsi="Wingdings" w:hint="default"/>
+        <w:sz w:val="20"/>
+      </w:rPr>
+    </w:lvl>
+    <w:lvl w:ilvl="3" w:tentative="1">
+      <w:start w:val="1"/>
+      <w:numFmt w:val="bullet"/>
+      <w:lvlText w:val=""/>
+      <w:lvlJc w:val="left"/>
+      <w:pPr>
+        <w:tabs>
+          <w:tab w:val="num" w:pos="2880"/>
+        </w:tabs>
+        <w:ind w:left="2880" w:hanging="360"/>
+      </w:pPr>
+      <w:rPr>
+        <w:rFonts w:ascii="Wingdings" w:hAnsi="Wingdings" w:hint="default"/>
+        <w:sz w:val="20"/>
+      </w:rPr>
+    </w:lvl>
+    <w:lvl w:ilvl="4" w:tentative="1">
+      <w:start w:val="1"/>
+      <w:numFmt w:val="bullet"/>
+      <w:lvlText w:val=""/>
+      <w:lvlJc w:val="left"/>
+      <w:pPr>
+        <w:tabs>
+          <w:tab w:val="num" w:pos="3600"/>
+        </w:tabs>
+        <w:ind w:left="3600" w:hanging="360"/>
+      </w:pPr>
+      <w:rPr>
+        <w:rFonts w:ascii="Wingdings" w:hAnsi="Wingdings" w:hint="default"/>
+        <w:sz w:val="20"/>
+      </w:rPr>
+    </w:lvl>
+    <w:lvl w:ilvl="5" w:tentative="1">
+      <w:start w:val="1"/>
+      <w:numFmt w:val="bullet"/>
+      <w:lvlText w:val=""/>
+      <w:lvlJc w:val="left"/>
+      <w:pPr>
+        <w:tabs>
+          <w:tab w:val="num" w:pos="4320"/>
+        </w:tabs>
+        <w:ind w:left="4320" w:hanging="360"/>
+      </w:pPr>
+      <w:rPr>
+        <w:rFonts w:ascii="Wingdings" w:hAnsi="Wingdings" w:hint="default"/>
+        <w:sz w:val="20"/>
+      </w:rPr>
+    </w:lvl>
+    <w:lvl w:ilvl="6" w:tentative="1">
+      <w:start w:val="1"/>
+      <w:numFmt w:val="bullet"/>
+      <w:lvlText w:val=""/>
+      <w:lvlJc w:val="left"/>
+      <w:pPr>
+        <w:tabs>
+          <w:tab w:val="num" w:pos="5040"/>
+        </w:tabs>
+        <w:ind w:left="5040" w:hanging="360"/>
+      </w:pPr>
+      <w:rPr>
+        <w:rFonts w:ascii="Wingdings" w:hAnsi="Wingdings" w:hint="default"/>
+        <w:sz w:val="20"/>
+      </w:rPr>
+    </w:lvl>
+    <w:lvl w:ilvl="7" w:tentative="1">
+      <w:start w:val="1"/>
+      <w:numFmt w:val="bullet"/>
+      <w:lvlText w:val=""/>
+      <w:lvlJc w:val="left"/>
+      <w:pPr>
+        <w:tabs>
+          <w:tab w:val="num" w:pos="5760"/>
+        </w:tabs>
+        <w:ind w:left="5760" w:hanging="360"/>
+      </w:pPr>
+      <w:rPr>
+        <w:rFonts w:ascii="Wingdings" w:hAnsi="Wingdings" w:hint="default"/>
+        <w:sz w:val="20"/>
+      </w:rPr>
+    </w:lvl>
+    <w:lvl w:ilvl="8" w:tentative="1">
+      <w:start w:val="1"/>
+      <w:numFmt w:val="bullet"/>
+      <w:lvlText w:val=""/>
+      <w:lvlJc w:val="left"/>
+      <w:pPr>
+        <w:tabs>
+          <w:tab w:val="num" w:pos="6480"/>
+        </w:tabs>
+        <w:ind w:left="6480" w:hanging="360"/>
+      </w:pPr>
+      <w:rPr>
+        <w:rFonts w:ascii="Wingdings" w:hAnsi="Wingdings" w:hint="default"/>
+        <w:sz w:val="20"/>
+      </w:rPr>
+    </w:lvl>
+  </w:abstractNum>
+  <w:abstractNum w:abstractNumId="7" w15:restartNumberingAfterBreak="0">
     <w:nsid w:val="20AC1026"/>
     <w:multiLevelType w:val="hybridMultilevel"/>
     <w:tmpl w:val="5DFE33AC"/>
@@ -13541,7 +14266,7 @@
       </w:rPr>
     </w:lvl>
   </w:abstractNum>
-  <w:abstractNum w:abstractNumId="6" w15:restartNumberingAfterBreak="0">
+  <w:abstractNum w:abstractNumId="8" w15:restartNumberingAfterBreak="0">
     <w:nsid w:val="22F42792"/>
     <w:multiLevelType w:val="multilevel"/>
     <w:tmpl w:val="B202A47A"/>
@@ -13690,7 +14415,7 @@
       </w:rPr>
     </w:lvl>
   </w:abstractNum>
-  <w:abstractNum w:abstractNumId="7" w15:restartNumberingAfterBreak="0">
+  <w:abstractNum w:abstractNumId="9" w15:restartNumberingAfterBreak="0">
     <w:nsid w:val="353C7B08"/>
     <w:multiLevelType w:val="hybridMultilevel"/>
     <w:tmpl w:val="82022DAE"/>
@@ -13803,7 +14528,120 @@
       </w:rPr>
     </w:lvl>
   </w:abstractNum>
-  <w:abstractNum w:abstractNumId="8" w15:restartNumberingAfterBreak="0">
+  <w:abstractNum w:abstractNumId="10" w15:restartNumberingAfterBreak="0">
+    <w:nsid w:val="461F54BD"/>
+    <w:multiLevelType w:val="hybridMultilevel"/>
+    <w:tmpl w:val="2F58B598"/>
+    <w:lvl w:ilvl="0" w:tplc="04090001">
+      <w:start w:val="1"/>
+      <w:numFmt w:val="bullet"/>
+      <w:lvlText w:val=""/>
+      <w:lvlJc w:val="left"/>
+      <w:pPr>
+        <w:ind w:left="1440" w:hanging="360"/>
+      </w:pPr>
+      <w:rPr>
+        <w:rFonts w:ascii="Symbol" w:hAnsi="Symbol" w:hint="default"/>
+      </w:rPr>
+    </w:lvl>
+    <w:lvl w:ilvl="1" w:tplc="04090003" w:tentative="1">
+      <w:start w:val="1"/>
+      <w:numFmt w:val="bullet"/>
+      <w:lvlText w:val="o"/>
+      <w:lvlJc w:val="left"/>
+      <w:pPr>
+        <w:ind w:left="2160" w:hanging="360"/>
+      </w:pPr>
+      <w:rPr>
+        <w:rFonts w:ascii="Courier New" w:hAnsi="Courier New" w:cs="Courier New" w:hint="default"/>
+      </w:rPr>
+    </w:lvl>
+    <w:lvl w:ilvl="2" w:tplc="04090005" w:tentative="1">
+      <w:start w:val="1"/>
+      <w:numFmt w:val="bullet"/>
+      <w:lvlText w:val=""/>
+      <w:lvlJc w:val="left"/>
+      <w:pPr>
+        <w:ind w:left="2880" w:hanging="360"/>
+      </w:pPr>
+      <w:rPr>
+        <w:rFonts w:ascii="Wingdings" w:hAnsi="Wingdings" w:hint="default"/>
+      </w:rPr>
+    </w:lvl>
+    <w:lvl w:ilvl="3" w:tplc="04090001" w:tentative="1">
+      <w:start w:val="1"/>
+      <w:numFmt w:val="bullet"/>
+      <w:lvlText w:val=""/>
+      <w:lvlJc w:val="left"/>
+      <w:pPr>
+        <w:ind w:left="3600" w:hanging="360"/>
+      </w:pPr>
+      <w:rPr>
+        <w:rFonts w:ascii="Symbol" w:hAnsi="Symbol" w:hint="default"/>
+      </w:rPr>
+    </w:lvl>
+    <w:lvl w:ilvl="4" w:tplc="04090003" w:tentative="1">
+      <w:start w:val="1"/>
+      <w:numFmt w:val="bullet"/>
+      <w:lvlText w:val="o"/>
+      <w:lvlJc w:val="left"/>
+      <w:pPr>
+        <w:ind w:left="4320" w:hanging="360"/>
+      </w:pPr>
+      <w:rPr>
+        <w:rFonts w:ascii="Courier New" w:hAnsi="Courier New" w:cs="Courier New" w:hint="default"/>
+      </w:rPr>
+    </w:lvl>
+    <w:lvl w:ilvl="5" w:tplc="04090005" w:tentative="1">
+      <w:start w:val="1"/>
+      <w:numFmt w:val="bullet"/>
+      <w:lvlText w:val=""/>
+      <w:lvlJc w:val="left"/>
+      <w:pPr>
+        <w:ind w:left="5040" w:hanging="360"/>
+      </w:pPr>
+      <w:rPr>
+        <w:rFonts w:ascii="Wingdings" w:hAnsi="Wingdings" w:hint="default"/>
+      </w:rPr>
+    </w:lvl>
+    <w:lvl w:ilvl="6" w:tplc="04090001" w:tentative="1">
+      <w:start w:val="1"/>
+      <w:numFmt w:val="bullet"/>
+      <w:lvlText w:val=""/>
+      <w:lvlJc w:val="left"/>
+      <w:pPr>
+        <w:ind w:left="5760" w:hanging="360"/>
+      </w:pPr>
+      <w:rPr>
+        <w:rFonts w:ascii="Symbol" w:hAnsi="Symbol" w:hint="default"/>
+      </w:rPr>
+    </w:lvl>
+    <w:lvl w:ilvl="7" w:tplc="04090003" w:tentative="1">
+      <w:start w:val="1"/>
+      <w:numFmt w:val="bullet"/>
+      <w:lvlText w:val="o"/>
+      <w:lvlJc w:val="left"/>
+      <w:pPr>
+        <w:ind w:left="6480" w:hanging="360"/>
+      </w:pPr>
+      <w:rPr>
+        <w:rFonts w:ascii="Courier New" w:hAnsi="Courier New" w:cs="Courier New" w:hint="default"/>
+      </w:rPr>
+    </w:lvl>
+    <w:lvl w:ilvl="8" w:tplc="04090005" w:tentative="1">
+      <w:start w:val="1"/>
+      <w:numFmt w:val="bullet"/>
+      <w:lvlText w:val=""/>
+      <w:lvlJc w:val="left"/>
+      <w:pPr>
+        <w:ind w:left="7200" w:hanging="360"/>
+      </w:pPr>
+      <w:rPr>
+        <w:rFonts w:ascii="Wingdings" w:hAnsi="Wingdings" w:hint="default"/>
+      </w:rPr>
+    </w:lvl>
+  </w:abstractNum>
+  <w:abstractNum w:abstractNumId="11" w15:restartNumberingAfterBreak="0">
     <w:nsid w:val="50C902A0"/>
     <w:multiLevelType w:val="hybridMultilevel"/>
     <w:tmpl w:val="B86452AE"/>
@@ -13916,7 +14754,7 @@
       </w:rPr>
     </w:lvl>
   </w:abstractNum>
-  <w:abstractNum w:abstractNumId="9" w15:restartNumberingAfterBreak="0">
+  <w:abstractNum w:abstractNumId="12" w15:restartNumberingAfterBreak="0">
     <w:nsid w:val="5C340E0F"/>
     <w:multiLevelType w:val="hybridMultilevel"/>
     <w:tmpl w:val="2146E812"/>
@@ -14029,7 +14867,7 @@
       </w:rPr>
     </w:lvl>
   </w:abstractNum>
-  <w:abstractNum w:abstractNumId="10" w15:restartNumberingAfterBreak="0">
+  <w:abstractNum w:abstractNumId="13" w15:restartNumberingAfterBreak="0">
     <w:nsid w:val="5C376BCE"/>
     <w:multiLevelType w:val="hybridMultilevel"/>
     <w:tmpl w:val="3020A4D0"/>
@@ -14142,7 +14980,7 @@
       </w:rPr>
     </w:lvl>
   </w:abstractNum>
-  <w:abstractNum w:abstractNumId="11" w15:restartNumberingAfterBreak="0">
+  <w:abstractNum w:abstractNumId="14" w15:restartNumberingAfterBreak="0">
     <w:nsid w:val="5C6C670D"/>
     <w:multiLevelType w:val="hybridMultilevel"/>
     <w:tmpl w:val="39CE0FE4"/>
@@ -14255,7 +15093,7 @@
       </w:rPr>
     </w:lvl>
   </w:abstractNum>
-  <w:abstractNum w:abstractNumId="12" w15:restartNumberingAfterBreak="0">
+  <w:abstractNum w:abstractNumId="15" w15:restartNumberingAfterBreak="0">
     <w:nsid w:val="5EEA101D"/>
     <w:multiLevelType w:val="hybridMultilevel"/>
     <w:tmpl w:val="11ECD926"/>
@@ -14368,7 +15206,7 @@
       </w:rPr>
     </w:lvl>
   </w:abstractNum>
-  <w:abstractNum w:abstractNumId="13" w15:restartNumberingAfterBreak="0">
+  <w:abstractNum w:abstractNumId="16" w15:restartNumberingAfterBreak="0">
     <w:nsid w:val="662B5238"/>
     <w:multiLevelType w:val="hybridMultilevel"/>
     <w:tmpl w:val="CB6EE8C0"/>
@@ -14481,7 +15319,7 @@
       </w:rPr>
     </w:lvl>
   </w:abstractNum>
-  <w:abstractNum w:abstractNumId="14" w15:restartNumberingAfterBreak="0">
+  <w:abstractNum w:abstractNumId="17" w15:restartNumberingAfterBreak="0">
     <w:nsid w:val="68973A34"/>
     <w:multiLevelType w:val="hybridMultilevel"/>
     <w:tmpl w:val="252A2864"/>
@@ -14594,7 +15432,7 @@
       </w:rPr>
     </w:lvl>
   </w:abstractNum>
-  <w:abstractNum w:abstractNumId="15" w15:restartNumberingAfterBreak="0">
+  <w:abstractNum w:abstractNumId="18" w15:restartNumberingAfterBreak="0">
     <w:nsid w:val="6AA039F4"/>
     <w:multiLevelType w:val="hybridMultilevel"/>
     <w:tmpl w:val="E702B904"/>
@@ -14707,7 +15545,7 @@
       </w:rPr>
     </w:lvl>
   </w:abstractNum>
-  <w:abstractNum w:abstractNumId="16" w15:restartNumberingAfterBreak="0">
+  <w:abstractNum w:abstractNumId="19" w15:restartNumberingAfterBreak="0">
     <w:nsid w:val="6BB72097"/>
     <w:multiLevelType w:val="hybridMultilevel"/>
     <w:tmpl w:val="07746E4E"/>
@@ -14820,7 +15658,7 @@
       </w:rPr>
     </w:lvl>
   </w:abstractNum>
-  <w:abstractNum w:abstractNumId="17" w15:restartNumberingAfterBreak="0">
+  <w:abstractNum w:abstractNumId="20" w15:restartNumberingAfterBreak="0">
     <w:nsid w:val="7B205E3B"/>
     <w:multiLevelType w:val="hybridMultilevel"/>
     <w:tmpl w:val="8D0EC3F8"/>
@@ -14933,7 +15771,7 @@
       </w:rPr>
     </w:lvl>
   </w:abstractNum>
-  <w:abstractNum w:abstractNumId="18" w15:restartNumberingAfterBreak="0">
+  <w:abstractNum w:abstractNumId="21" w15:restartNumberingAfterBreak="0">
     <w:nsid w:val="7B68295A"/>
     <w:multiLevelType w:val="hybridMultilevel"/>
     <w:tmpl w:val="146240BE"/>
@@ -15046,7 +15884,7 @@
       </w:rPr>
     </w:lvl>
   </w:abstractNum>
-  <w:abstractNum w:abstractNumId="19" w15:restartNumberingAfterBreak="0">
+  <w:abstractNum w:abstractNumId="22" w15:restartNumberingAfterBreak="0">
     <w:nsid w:val="7DD2451C"/>
     <w:multiLevelType w:val="hybridMultilevel"/>
     <w:tmpl w:val="EB7A4F9A"/>
@@ -15159,7 +15997,7 @@
       </w:rPr>
     </w:lvl>
   </w:abstractNum>
-  <w:abstractNum w:abstractNumId="20" w15:restartNumberingAfterBreak="0">
+  <w:abstractNum w:abstractNumId="23" w15:restartNumberingAfterBreak="0">
     <w:nsid w:val="7F8E30CA"/>
     <w:multiLevelType w:val="multilevel"/>
     <w:tmpl w:val="E2509F4A"/>
@@ -15273,67 +16111,76 @@
     </w:lvl>
   </w:abstractNum>
   <w:num w:numId="1" w16cid:durableId="2113551837">
+    <w:abstractNumId w:val="4"/>
+  </w:num>
+  <w:num w:numId="2" w16cid:durableId="1180509085">
+    <w:abstractNumId w:val="17"/>
+  </w:num>
+  <w:num w:numId="3" w16cid:durableId="719477801">
+    <w:abstractNumId w:val="14"/>
+  </w:num>
+  <w:num w:numId="4" w16cid:durableId="185218928">
+    <w:abstractNumId w:val="21"/>
+  </w:num>
+  <w:num w:numId="5" w16cid:durableId="662046987">
+    <w:abstractNumId w:val="5"/>
+  </w:num>
+  <w:num w:numId="6" w16cid:durableId="18891784">
+    <w:abstractNumId w:val="9"/>
+  </w:num>
+  <w:num w:numId="7" w16cid:durableId="1731541130">
+    <w:abstractNumId w:val="11"/>
+  </w:num>
+  <w:num w:numId="8" w16cid:durableId="1870412852">
+    <w:abstractNumId w:val="13"/>
+  </w:num>
+  <w:num w:numId="9" w16cid:durableId="2141339984">
+    <w:abstractNumId w:val="19"/>
+  </w:num>
+  <w:num w:numId="10" w16cid:durableId="1855993595">
+    <w:abstractNumId w:val="2"/>
+  </w:num>
+  <w:num w:numId="11" w16cid:durableId="1165364523">
+    <w:abstractNumId w:val="23"/>
+  </w:num>
+  <w:num w:numId="12" w16cid:durableId="668606715">
+    <w:abstractNumId w:val="16"/>
+  </w:num>
+  <w:num w:numId="13" w16cid:durableId="1298805398">
     <w:abstractNumId w:val="3"/>
   </w:num>
-  <w:num w:numId="2" w16cid:durableId="1180509085">
-    <w:abstractNumId w:val="14"/>
-  </w:num>
-  <w:num w:numId="3" w16cid:durableId="719477801">
-    <w:abstractNumId w:val="11"/>
-  </w:num>
-  <w:num w:numId="4" w16cid:durableId="185218928">
+  <w:num w:numId="14" w16cid:durableId="1008286879">
     <w:abstractNumId w:val="18"/>
   </w:num>
-  <w:num w:numId="5" w16cid:durableId="662046987">
-    <w:abstractNumId w:val="4"/>
+  <w:num w:numId="15" w16cid:durableId="107236513">
+    <w:abstractNumId w:val="1"/>
   </w:num>
-  <w:num w:numId="6" w16cid:durableId="18891784">
+  <w:num w:numId="16" w16cid:durableId="207684814">
+    <w:abstractNumId w:val="20"/>
+  </w:num>
+  <w:num w:numId="17" w16cid:durableId="1504393994">
     <w:abstractNumId w:val="7"/>
   </w:num>
-  <w:num w:numId="7" w16cid:durableId="1731541130">
+  <w:num w:numId="18" w16cid:durableId="1757245300">
+    <w:abstractNumId w:val="22"/>
+  </w:num>
+  <w:num w:numId="19" w16cid:durableId="589898265">
+    <w:abstractNumId w:val="15"/>
+  </w:num>
+  <w:num w:numId="20" w16cid:durableId="1137914264">
     <w:abstractNumId w:val="8"/>
   </w:num>
-  <w:num w:numId="8" w16cid:durableId="1870412852">
-    <w:abstractNumId w:val="10"/>
+  <w:num w:numId="21" w16cid:durableId="1990088281">
+    <w:abstractNumId w:val="12"/>
   </w:num>
-  <w:num w:numId="9" w16cid:durableId="2141339984">
-    <w:abstractNumId w:val="16"/>
-  </w:num>
-  <w:num w:numId="10" w16cid:durableId="1855993595">
-    <w:abstractNumId w:val="1"/>
-  </w:num>
-  <w:num w:numId="11" w16cid:durableId="1165364523">
-    <w:abstractNumId w:val="20"/>
-  </w:num>
-  <w:num w:numId="12" w16cid:durableId="668606715">
-    <w:abstractNumId w:val="13"/>
-  </w:num>
-  <w:num w:numId="13" w16cid:durableId="1298805398">
-    <w:abstractNumId w:val="2"/>
-  </w:num>
-  <w:num w:numId="14" w16cid:durableId="1008286879">
-    <w:abstractNumId w:val="15"/>
-  </w:num>
-  <w:num w:numId="15" w16cid:durableId="107236513">
+  <w:num w:numId="22" w16cid:durableId="23987700">
     <w:abstractNumId w:val="0"/>
   </w:num>
-  <w:num w:numId="16" w16cid:durableId="207684814">
-    <w:abstractNumId w:val="17"/>
-  </w:num>
-  <w:num w:numId="17" w16cid:durableId="1504393994">
-    <w:abstractNumId w:val="5"/>
-  </w:num>
-  <w:num w:numId="18" w16cid:durableId="1757245300">
-    <w:abstractNumId w:val="19"/>
-  </w:num>
-  <w:num w:numId="19" w16cid:durableId="589898265">
-    <w:abstractNumId w:val="12"/>
-  </w:num>
-  <w:num w:numId="20" w16cid:durableId="1137914264">
+  <w:num w:numId="23" w16cid:durableId="795292121">
     <w:abstractNumId w:val="6"/>
   </w:num>
-  <w:num w:numId="21" w16cid:durableId="1990088281">
-    <w:abstractNumId w:val="9"/>
+  <w:num w:numId="24" w16cid:durableId="1503819318">
+    <w:abstractNumId w:val="10"/>
   </w:num>
   <w:numIdMacAtCleanup w:val="19"/>
 </w:numbering>

</xml_diff>

<commit_message>
Added the observation detail in report
</commit_message>
<xml_diff>
--- a/Evidence/What QuickGrid's URL navigation changes for an existing app.docx
+++ b/Evidence/What QuickGrid's URL navigation changes for an existing app.docx
@@ -233,7 +233,13 @@
         <w:t xml:space="preserve">Partially </w:t>
       </w:r>
       <w:r>
-        <w:t>Passed (Trimmed publish validation blocked by runtime exception)</w:t>
+        <w:t>Passed</w:t>
+      </w:r>
+      <w:r>
+        <w:t xml:space="preserve"> with observation</w:t>
+      </w:r>
+      <w:r>
+        <w:t xml:space="preserve"> (Trimmed publish validation blocked by runtime exception)</w:t>
       </w:r>
     </w:p>
     <w:p>

</xml_diff>

<commit_message>
Updated the trimmed publish validation in report
</commit_message>
<xml_diff>
--- a/Evidence/What QuickGrid's URL navigation changes for an existing app.docx
+++ b/Evidence/What QuickGrid's URL navigation changes for an existing app.docx
@@ -161,6 +161,9 @@
       <w:r>
         <w:t xml:space="preserve">Trimmed Publish </w:t>
       </w:r>
+      <w:r>
+        <w:t>(unsupported hosting configuration)</w:t>
+      </w:r>
     </w:p>
     <w:p>
       <w:pPr>
@@ -202,7 +205,7 @@
       <w:r>
         <w:t xml:space="preserve"> </w:t>
       </w:r>
-      <w:hyperlink r:id="rId6" w:history="1">
+      <w:hyperlink r:id="rId8" w:history="1">
         <w:r>
           <w:rPr>
             <w:rStyle w:val="Hyperlink"/>
@@ -230,16 +233,10 @@
         <w:t xml:space="preserve"> </w:t>
       </w:r>
       <w:r>
-        <w:t xml:space="preserve">Partially </w:t>
-      </w:r>
-      <w:r>
-        <w:t>Passed</w:t>
-      </w:r>
-      <w:r>
-        <w:t xml:space="preserve"> with observation</w:t>
-      </w:r>
-      <w:r>
-        <w:t xml:space="preserve"> (Trimmed publish validation blocked by runtime exception)</w:t>
+        <w:t>Partially Complete</w:t>
+      </w:r>
+      <w:r>
+        <w:t xml:space="preserve"> </w:t>
       </w:r>
     </w:p>
     <w:p>
@@ -271,7 +268,7 @@
         </w:numPr>
       </w:pPr>
       <w:r>
-        <w:t xml:space="preserve">However, trimmed publish switch validation could not be completed because the tested Blazor Web App configuration is not currently supported for trimming and failed before </w:t>
+        <w:t xml:space="preserve">Trimmed publish validation of the tested Blazor Web App scenario could not be completed because the selected hosting model is not supported for trimming and failed before </w:t>
       </w:r>
       <w:proofErr w:type="spellStart"/>
       <w:r>
@@ -279,7 +276,7 @@
       </w:r>
       <w:proofErr w:type="spellEnd"/>
       <w:r>
-        <w:t xml:space="preserve"> behavior could be inspected. </w:t>
+        <w:t xml:space="preserve"> behavior could be evaluated.</w:t>
       </w:r>
     </w:p>
     <w:p>
@@ -291,13 +288,39 @@
         </w:numPr>
       </w:pPr>
       <w:r>
-        <w:t>Therefore, the trimmed publish requirement remains Incomplete / Not Verifiable, pending clarification of a supported trimming scenario.</w:t>
+        <w:t xml:space="preserve">The observed runtime exception is not considered a </w:t>
+      </w:r>
+      <w:proofErr w:type="spellStart"/>
+      <w:r>
+        <w:t>QuickGrid</w:t>
+      </w:r>
+      <w:proofErr w:type="spellEnd"/>
+      <w:r>
+        <w:t xml:space="preserve"> issue.</w:t>
+      </w:r>
+    </w:p>
+    <w:p>
+      <w:pPr>
+        <w:pStyle w:val="ListParagraph"/>
+        <w:numPr>
+          <w:ilvl w:val="1"/>
+          <w:numId w:val="3"/>
+        </w:numPr>
+      </w:pPr>
+      <w:r>
+        <w:t xml:space="preserve">A supported trimmed configuration was not exercised as part of this validation; </w:t>
+      </w:r>
+      <w:r>
+        <w:t>therefore,</w:t>
+      </w:r>
+      <w:r>
+        <w:t xml:space="preserve"> the trimming requirement remains incomplete.</w:t>
       </w:r>
     </w:p>
     <w:p>
       <w:r>
         <w:pict w14:anchorId="1F96260C">
-          <v:rect id="_x0000_i1038" style="width:0;height:1.5pt" o:hralign="center" o:hrstd="t" o:hr="t" fillcolor="#a0a0a0" stroked="f"/>
+          <v:rect id="_x0000_i1060" style="width:0;height:1.5pt" o:hralign="center" o:hrstd="t" o:hr="t" fillcolor="#a0a0a0" stroked="f"/>
         </w:pict>
       </w:r>
     </w:p>
@@ -338,7 +361,7 @@
       <w:r>
         <w:t xml:space="preserve"> </w:t>
       </w:r>
-      <w:hyperlink r:id="rId7" w:history="1">
+      <w:hyperlink r:id="rId9" w:history="1">
         <w:r>
           <w:rPr>
             <w:rStyle w:val="Hyperlink"/>
@@ -472,7 +495,7 @@
             <w:pPr>
               <w:spacing w:after="160" w:line="278" w:lineRule="auto"/>
             </w:pPr>
-            <w:hyperlink r:id="rId8" w:history="1">
+            <w:hyperlink r:id="rId10" w:history="1">
               <w:r>
                 <w:rPr>
                   <w:rStyle w:val="Hyperlink"/>
@@ -499,7 +522,7 @@
             <w:tcW w:w="0" w:type="auto"/>
           </w:tcPr>
           <w:p>
-            <w:hyperlink r:id="rId9" w:history="1">
+            <w:hyperlink r:id="rId11" w:history="1">
               <w:r>
                 <w:rPr>
                   <w:rStyle w:val="Hyperlink"/>
@@ -534,7 +557,7 @@
             <w:pPr>
               <w:spacing w:after="160" w:line="278" w:lineRule="auto"/>
             </w:pPr>
-            <w:hyperlink r:id="rId10" w:history="1">
+            <w:hyperlink r:id="rId12" w:history="1">
               <w:r>
                 <w:rPr>
                   <w:rStyle w:val="Hyperlink"/>
@@ -552,13 +575,7 @@
           </w:tcPr>
           <w:p>
             <w:r>
-              <w:t>.NET 1</w:t>
-            </w:r>
-            <w:r>
-              <w:t>1</w:t>
-            </w:r>
-            <w:r>
-              <w:t xml:space="preserve"> UI selector validation</w:t>
+              <w:t>.NET 11 UI selector validation</w:t>
             </w:r>
           </w:p>
         </w:tc>
@@ -567,7 +584,7 @@
             <w:tcW w:w="0" w:type="auto"/>
           </w:tcPr>
           <w:p>
-            <w:hyperlink r:id="rId11" w:history="1">
+            <w:hyperlink r:id="rId13" w:history="1">
               <w:r>
                 <w:rPr>
                   <w:rStyle w:val="Hyperlink"/>
@@ -610,7 +627,7 @@
             <w:pPr>
               <w:spacing w:after="160" w:line="278" w:lineRule="auto"/>
             </w:pPr>
-            <w:hyperlink r:id="rId12" w:history="1">
+            <w:hyperlink r:id="rId14" w:history="1">
               <w:r>
                 <w:rPr>
                   <w:rStyle w:val="Hyperlink"/>
@@ -628,19 +645,7 @@
           </w:tcPr>
           <w:p>
             <w:r>
-              <w:t>.NET 1</w:t>
-            </w:r>
-            <w:r>
-              <w:t>1</w:t>
-            </w:r>
-            <w:r>
-              <w:t xml:space="preserve"> </w:t>
-            </w:r>
-            <w:r>
-              <w:t xml:space="preserve">switch enabled </w:t>
-            </w:r>
-            <w:r>
-              <w:t>UI selector validation</w:t>
+              <w:t>.NET 11 switch enabled UI selector validation</w:t>
             </w:r>
           </w:p>
         </w:tc>
@@ -649,7 +654,7 @@
             <w:tcW w:w="0" w:type="auto"/>
           </w:tcPr>
           <w:p>
-            <w:hyperlink r:id="rId13" w:history="1">
+            <w:hyperlink r:id="rId15" w:history="1">
               <w:r>
                 <w:rPr>
                   <w:rStyle w:val="Hyperlink"/>
@@ -684,7 +689,7 @@
             <w:pPr>
               <w:spacing w:after="160" w:line="278" w:lineRule="auto"/>
             </w:pPr>
-            <w:hyperlink r:id="rId14" w:history="1">
+            <w:hyperlink r:id="rId16" w:history="1">
               <w:r>
                 <w:rPr>
                   <w:rStyle w:val="Hyperlink"/>
@@ -717,7 +722,7 @@
             <w:tcW w:w="0" w:type="auto"/>
           </w:tcPr>
           <w:p>
-            <w:hyperlink r:id="rId15" w:history="1">
+            <w:hyperlink r:id="rId17" w:history="1">
               <w:r>
                 <w:rPr>
                   <w:rStyle w:val="Hyperlink"/>
@@ -735,13 +740,7 @@
           </w:tcPr>
           <w:p>
             <w:r>
-              <w:t xml:space="preserve">.NET 11 switch </w:t>
-            </w:r>
-            <w:r>
-              <w:t>removed</w:t>
-            </w:r>
-            <w:r>
-              <w:t xml:space="preserve"> UI selector validation</w:t>
+              <w:t>.NET 11 switch removed UI selector validation</w:t>
             </w:r>
           </w:p>
         </w:tc>
@@ -750,7 +749,7 @@
             <w:tcW w:w="0" w:type="auto"/>
           </w:tcPr>
           <w:p>
-            <w:hyperlink r:id="rId16" w:history="1">
+            <w:hyperlink r:id="rId18" w:history="1">
               <w:r>
                 <w:rPr>
                   <w:rStyle w:val="Hyperlink"/>
@@ -785,7 +784,7 @@
             <w:pPr>
               <w:spacing w:after="160" w:line="278" w:lineRule="auto"/>
             </w:pPr>
-            <w:hyperlink r:id="rId17" w:history="1">
+            <w:hyperlink r:id="rId19" w:history="1">
               <w:r>
                 <w:rPr>
                   <w:rStyle w:val="Hyperlink"/>
@@ -801,7 +800,7 @@
     <w:p>
       <w:r>
         <w:pict w14:anchorId="1FAD1392">
-          <v:rect id="_x0000_i1039" style="width:0;height:1.5pt" o:hralign="center" o:hrstd="t" o:hr="t" fillcolor="#a0a0a0" stroked="f"/>
+          <v:rect id="_x0000_i1026" style="width:0;height:1.5pt" o:hralign="center" o:hrstd="t" o:hr="t" fillcolor="#a0a0a0" stroked="f"/>
         </w:pict>
       </w:r>
     </w:p>
@@ -870,7 +869,7 @@
                     <pic:cNvPicPr/>
                   </pic:nvPicPr>
                   <pic:blipFill>
-                    <a:blip r:embed="rId18"/>
+                    <a:blip r:embed="rId20"/>
                     <a:stretch>
                       <a:fillRect/>
                     </a:stretch>
@@ -894,7 +893,7 @@
     <w:p>
       <w:r>
         <w:pict w14:anchorId="70907738">
-          <v:rect id="_x0000_i1026" style="width:0;height:1.5pt" o:hralign="center" o:hrstd="t" o:hr="t" fillcolor="#a0a0a0" stroked="f"/>
+          <v:rect id="_x0000_i1027" style="width:0;height:1.5pt" o:hralign="center" o:hrstd="t" o:hr="t" fillcolor="#a0a0a0" stroked="f"/>
         </w:pict>
       </w:r>
     </w:p>
@@ -1116,7 +1115,7 @@
     <w:p>
       <w:r>
         <w:pict w14:anchorId="5BE9F989">
-          <v:rect id="_x0000_i1034" style="width:0;height:1.5pt" o:hralign="center" o:hrstd="t" o:hr="t" fillcolor="#a0a0a0" stroked="f"/>
+          <v:rect id="_x0000_i1028" style="width:0;height:1.5pt" o:hralign="center" o:hrstd="t" o:hr="t" fillcolor="#a0a0a0" stroked="f"/>
         </w:pict>
       </w:r>
     </w:p>
@@ -3928,58 +3927,33 @@
               <w:ind w:left="360"/>
             </w:pPr>
             <w:r>
-              <w:t>Pass with observation</w:t>
-            </w:r>
-          </w:p>
-          <w:p>
-            <w:pPr>
-              <w:ind w:left="360"/>
-            </w:pPr>
-          </w:p>
-          <w:p>
-            <w:pPr>
-              <w:ind w:left="360"/>
-            </w:pPr>
-            <w:r>
-              <w:t xml:space="preserve">Intermittent sort parameter normalization </w:t>
+              <w:t>Pass</w:t>
+            </w:r>
+          </w:p>
+        </w:tc>
+        <w:tc>
+          <w:tcPr>
+            <w:tcW w:w="1810" w:type="dxa"/>
+            <w:hideMark/>
+          </w:tcPr>
+          <w:p>
+            <w:r>
+              <w:t xml:space="preserve">Valid URL parameters restored the expected </w:t>
+            </w:r>
+            <w:proofErr w:type="gramStart"/>
+            <w:r>
+              <w:t>sort</w:t>
+            </w:r>
+            <w:proofErr w:type="gramEnd"/>
+            <w:r>
+              <w:t xml:space="preserve"> state. Case-mismatched sort values did </w:t>
             </w:r>
             <w:r>
               <w:lastRenderedPageBreak/>
-              <w:t>observation documented separately.</w:t>
-            </w:r>
-          </w:p>
-          <w:p>
-            <w:pPr>
-              <w:ind w:left="360"/>
-            </w:pPr>
-          </w:p>
-        </w:tc>
-        <w:tc>
-          <w:tcPr>
-            <w:tcW w:w="1810" w:type="dxa"/>
-            <w:hideMark/>
-          </w:tcPr>
-          <w:p>
-            <w:r>
-              <w:lastRenderedPageBreak/>
-              <w:t>Valid URL parameters restored expected state.</w:t>
-            </w:r>
-            <w:r>
-              <w:t xml:space="preserve"> </w:t>
-            </w:r>
-          </w:p>
-          <w:p>
-            <w:r>
-              <w:t xml:space="preserve">But randomly typed sort parameter </w:t>
-            </w:r>
-            <w:r>
-              <w:lastRenderedPageBreak/>
-              <w:t>normalized to lower case and sorin</w:t>
-            </w:r>
-            <w:r>
-              <w:t>g not reflected in grid UI.</w:t>
-            </w:r>
-          </w:p>
+              <w:t>not restore sorting and are treated as invalid user-supplied state.</w:t>
+            </w:r>
+          </w:p>
+          <w:p/>
         </w:tc>
       </w:tr>
       <w:tr>
@@ -4029,20 +4003,7 @@
               <w:ind w:left="360"/>
             </w:pPr>
             <w:r>
-              <w:t>Pass with observation</w:t>
-            </w:r>
-          </w:p>
-          <w:p>
-            <w:pPr>
-              <w:ind w:left="360"/>
-            </w:pPr>
-          </w:p>
-          <w:p>
-            <w:pPr>
-              <w:ind w:left="360"/>
-            </w:pPr>
-            <w:r>
-              <w:t>Intermittent sort parameter normalization observation</w:t>
+              <w:t>Pass</w:t>
             </w:r>
           </w:p>
         </w:tc>
@@ -4053,22 +4014,24 @@
           </w:tcPr>
           <w:p>
             <w:r>
-              <w:t xml:space="preserve">Grid </w:t>
+              <w:t>Grid is sorted correctly.</w:t>
+            </w:r>
+          </w:p>
+          <w:p/>
+          <w:p>
+            <w:r>
+              <w:t xml:space="preserve">Valid URL parameters restored the expected </w:t>
             </w:r>
             <w:proofErr w:type="gramStart"/>
             <w:r>
-              <w:t>sorted</w:t>
+              <w:t>sort</w:t>
             </w:r>
             <w:proofErr w:type="gramEnd"/>
             <w:r>
-              <w:t xml:space="preserve"> correctly.</w:t>
-            </w:r>
-          </w:p>
-          <w:p>
-            <w:r>
-              <w:t>But randomly typed sort parameter normalized to lower case and soring not reflected in grid UI.</w:t>
-            </w:r>
-          </w:p>
+              <w:t xml:space="preserve"> state. Case-mismatched sort values did not restore sorting and are treated as invalid user-supplied state.</w:t>
+            </w:r>
+          </w:p>
+          <w:p/>
         </w:tc>
       </w:tr>
       <w:tr>
@@ -4118,20 +4081,7 @@
               <w:ind w:left="360"/>
             </w:pPr>
             <w:r>
-              <w:t>Pass with observation</w:t>
-            </w:r>
-          </w:p>
-          <w:p>
-            <w:pPr>
-              <w:ind w:left="360"/>
-            </w:pPr>
-          </w:p>
-          <w:p>
-            <w:pPr>
-              <w:ind w:left="360"/>
-            </w:pPr>
-            <w:r>
-              <w:t>Intermittent sort parameter normalization observation</w:t>
+              <w:t>Pass</w:t>
             </w:r>
           </w:p>
         </w:tc>
@@ -4144,20 +4094,28 @@
             <w:r>
               <w:t xml:space="preserve">Grid </w:t>
             </w:r>
+            <w:r>
+              <w:t>is sorted</w:t>
+            </w:r>
+            <w:r>
+              <w:t xml:space="preserve"> correctly.</w:t>
+            </w:r>
+          </w:p>
+          <w:p/>
+          <w:p>
+            <w:r>
+              <w:t xml:space="preserve">Valid URL parameters restored the expected </w:t>
+            </w:r>
             <w:proofErr w:type="gramStart"/>
             <w:r>
-              <w:t>sorted</w:t>
+              <w:t>sort</w:t>
             </w:r>
             <w:proofErr w:type="gramEnd"/>
             <w:r>
-              <w:t xml:space="preserve"> correctly.</w:t>
-            </w:r>
-          </w:p>
-          <w:p>
-            <w:r>
-              <w:t>But randomly typed sort parameter normalized to lower case and soring not reflected in grid UI.</w:t>
-            </w:r>
-          </w:p>
+              <w:t xml:space="preserve"> state. Case-mismatched sort values did not restore sorting and are treated as invalid user-supplied state.</w:t>
+            </w:r>
+          </w:p>
+          <w:p/>
         </w:tc>
       </w:tr>
       <w:tr>
@@ -5513,7 +5471,15 @@
                 <w:b/>
                 <w:bCs/>
               </w:rPr>
-              <w:t>Interactive Server:</w:t>
+              <w:t xml:space="preserve">Interactive </w:t>
+            </w:r>
+            <w:r>
+              <w:rPr>
+                <w:b/>
+                <w:bCs/>
+              </w:rPr>
+              <w:lastRenderedPageBreak/>
+              <w:t>Server:</w:t>
             </w:r>
             <w:r>
               <w:t xml:space="preserve"> Sorting continued to work through </w:t>
@@ -6244,7 +6210,11 @@
               <w:t xml:space="preserve"> interaction</w:t>
             </w:r>
             <w:r>
-              <w:t xml:space="preserve"> and URL updated correctly</w:t>
+              <w:t xml:space="preserve"> and </w:t>
+            </w:r>
+            <w:r>
+              <w:lastRenderedPageBreak/>
+              <w:t>URL updated correctly</w:t>
             </w:r>
             <w:r>
               <w:t>.</w:t>
@@ -6384,11 +6354,7 @@
           </w:tcPr>
           <w:p>
             <w:r>
-              <w:t xml:space="preserve">Publish completed </w:t>
-            </w:r>
-            <w:r>
-              <w:lastRenderedPageBreak/>
-              <w:t>successfully with 15 trim warnings.</w:t>
+              <w:t>Publish completed successfully with 15 trim warnings.</w:t>
             </w:r>
           </w:p>
         </w:tc>
@@ -6943,6 +6909,7 @@
           <w:sz w:val="28"/>
           <w:szCs w:val="28"/>
         </w:rPr>
+        <w:lastRenderedPageBreak/>
         <w:t>.NET 10</w:t>
       </w:r>
     </w:p>
@@ -7026,7 +6993,6 @@
           </w:tcPr>
           <w:p>
             <w:r>
-              <w:lastRenderedPageBreak/>
               <w:t>Verify sortable column header HTML structure renders as button elements</w:t>
             </w:r>
           </w:p>
@@ -7036,7 +7002,7 @@
             <w:tcW w:w="5238" w:type="dxa"/>
           </w:tcPr>
           <w:p>
-            <w:hyperlink r:id="rId19" w:history="1">
+            <w:hyperlink r:id="rId21" w:history="1">
               <w:r>
                 <w:rPr>
                   <w:rStyle w:val="Hyperlink"/>
@@ -7046,7 +7012,7 @@
             </w:hyperlink>
           </w:p>
           <w:p>
-            <w:hyperlink r:id="rId20" w:history="1">
+            <w:hyperlink r:id="rId22" w:history="1">
               <w:r>
                 <w:rPr>
                   <w:rStyle w:val="Hyperlink"/>
@@ -7073,7 +7039,7 @@
             <w:tcW w:w="5238" w:type="dxa"/>
           </w:tcPr>
           <w:p>
-            <w:hyperlink r:id="rId21" w:tooltip="DN10_StaticSSR_PaginatorMarkup.png" w:history="1">
+            <w:hyperlink r:id="rId23" w:tooltip="DN10_StaticSSR_PaginatorMarkup.png" w:history="1">
               <w:r>
                 <w:rPr>
                   <w:rStyle w:val="Hyperlink"/>
@@ -7083,7 +7049,7 @@
             </w:hyperlink>
           </w:p>
           <w:p>
-            <w:hyperlink r:id="rId22" w:tooltip="DN10_StaticSSR_PaginatorMarkup.txt" w:history="1">
+            <w:hyperlink r:id="rId24" w:tooltip="DN10_StaticSSR_PaginatorMarkup.txt" w:history="1">
               <w:r>
                 <w:rPr>
                   <w:rStyle w:val="Hyperlink"/>
@@ -7110,7 +7076,7 @@
             <w:tcW w:w="5238" w:type="dxa"/>
           </w:tcPr>
           <w:p>
-            <w:hyperlink r:id="rId23" w:tooltip="DN10_StaticSSR_SortBehavior.mp4" w:history="1">
+            <w:hyperlink r:id="rId25" w:tooltip="DN10_StaticSSR_SortBehavior.mp4" w:history="1">
               <w:r>
                 <w:rPr>
                   <w:rStyle w:val="Hyperlink"/>
@@ -7137,7 +7103,7 @@
             <w:tcW w:w="5238" w:type="dxa"/>
           </w:tcPr>
           <w:p>
-            <w:hyperlink r:id="rId24" w:tooltip="DN10_StaticSSR_PageBehavior.mp4" w:history="1">
+            <w:hyperlink r:id="rId26" w:tooltip="DN10_StaticSSR_PageBehavior.mp4" w:history="1">
               <w:r>
                 <w:rPr>
                   <w:rStyle w:val="Hyperlink"/>
@@ -7258,7 +7224,7 @@
             <w:tcW w:w="5238" w:type="dxa"/>
           </w:tcPr>
           <w:p>
-            <w:hyperlink r:id="rId25" w:tooltip="DN10_Server_HeaderMarkup.png" w:history="1">
+            <w:hyperlink r:id="rId27" w:tooltip="DN10_Server_HeaderMarkup.png" w:history="1">
               <w:r>
                 <w:rPr>
                   <w:rStyle w:val="Hyperlink"/>
@@ -7268,7 +7234,7 @@
             </w:hyperlink>
           </w:p>
           <w:p>
-            <w:hyperlink r:id="rId26" w:tooltip="DN10_Server_HeaderMarkup.txt" w:history="1">
+            <w:hyperlink r:id="rId28" w:tooltip="DN10_Server_HeaderMarkup.txt" w:history="1">
               <w:r>
                 <w:rPr>
                   <w:rStyle w:val="Hyperlink"/>
@@ -7295,7 +7261,7 @@
             <w:tcW w:w="5238" w:type="dxa"/>
           </w:tcPr>
           <w:p>
-            <w:hyperlink r:id="rId27" w:tooltip="DN10_Server_PaginatorMarkup.png" w:history="1">
+            <w:hyperlink r:id="rId29" w:tooltip="DN10_Server_PaginatorMarkup.png" w:history="1">
               <w:r>
                 <w:rPr>
                   <w:rStyle w:val="Hyperlink"/>
@@ -7305,7 +7271,7 @@
             </w:hyperlink>
           </w:p>
           <w:p>
-            <w:hyperlink r:id="rId28" w:tooltip="DN10_Server_PaginatorMarkup.txt" w:history="1">
+            <w:hyperlink r:id="rId30" w:tooltip="DN10_Server_PaginatorMarkup.txt" w:history="1">
               <w:r>
                 <w:rPr>
                   <w:rStyle w:val="Hyperlink"/>
@@ -7332,7 +7298,7 @@
             <w:tcW w:w="5238" w:type="dxa"/>
           </w:tcPr>
           <w:p>
-            <w:hyperlink r:id="rId29" w:tooltip="DN10_Server_SortBehavior.mp4" w:history="1">
+            <w:hyperlink r:id="rId31" w:tooltip="DN10_Server_SortBehavior.mp4" w:history="1">
               <w:r>
                 <w:rPr>
                   <w:rStyle w:val="Hyperlink"/>
@@ -7359,7 +7325,7 @@
             <w:tcW w:w="5238" w:type="dxa"/>
           </w:tcPr>
           <w:p>
-            <w:hyperlink r:id="rId30" w:tooltip="DN10_Server_PageBehavior.mp4" w:history="1">
+            <w:hyperlink r:id="rId32" w:tooltip="DN10_Server_PageBehavior.mp4" w:history="1">
               <w:r>
                 <w:rPr>
                   <w:rStyle w:val="Hyperlink"/>
@@ -7498,7 +7464,7 @@
             <w:tcW w:w="5238" w:type="dxa"/>
           </w:tcPr>
           <w:p>
-            <w:hyperlink r:id="rId31" w:tooltip="DN11_Default_StaticSSR_HeaderMarkup.png" w:history="1">
+            <w:hyperlink r:id="rId33" w:tooltip="DN11_Default_StaticSSR_HeaderMarkup.png" w:history="1">
               <w:r>
                 <w:rPr>
                   <w:rStyle w:val="Hyperlink"/>
@@ -7508,7 +7474,7 @@
             </w:hyperlink>
           </w:p>
           <w:p>
-            <w:hyperlink r:id="rId32" w:tooltip="DN11_Default_StaticSSR_HeaderMarkup.txt" w:history="1">
+            <w:hyperlink r:id="rId34" w:tooltip="DN11_Default_StaticSSR_HeaderMarkup.txt" w:history="1">
               <w:r>
                 <w:rPr>
                   <w:rStyle w:val="Hyperlink"/>
@@ -7535,7 +7501,7 @@
             <w:tcW w:w="5238" w:type="dxa"/>
           </w:tcPr>
           <w:p>
-            <w:hyperlink r:id="rId33" w:tooltip="DN11_Default_StaticSSR_PaginatorMarkup.png" w:history="1">
+            <w:hyperlink r:id="rId35" w:tooltip="DN11_Default_StaticSSR_PaginatorMarkup.png" w:history="1">
               <w:r>
                 <w:rPr>
                   <w:rStyle w:val="Hyperlink"/>
@@ -7545,7 +7511,7 @@
             </w:hyperlink>
           </w:p>
           <w:p>
-            <w:hyperlink r:id="rId34" w:tooltip="DN11_Default_StaticSSR_PaginatorMarkup.txt" w:history="1">
+            <w:hyperlink r:id="rId36" w:tooltip="DN11_Default_StaticSSR_PaginatorMarkup.txt" w:history="1">
               <w:r>
                 <w:rPr>
                   <w:rStyle w:val="Hyperlink"/>
@@ -7572,7 +7538,7 @@
             <w:tcW w:w="5238" w:type="dxa"/>
           </w:tcPr>
           <w:p>
-            <w:hyperlink r:id="rId35" w:tooltip="DN11_Default_StaticSSR_URLSort.mp4" w:history="1">
+            <w:hyperlink r:id="rId37" w:tooltip="DN11_Default_StaticSSR_URLSort.mp4" w:history="1">
               <w:r>
                 <w:rPr>
                   <w:rStyle w:val="Hyperlink"/>
@@ -7590,6 +7556,7 @@
           </w:tcPr>
           <w:p>
             <w:r>
+              <w:lastRenderedPageBreak/>
               <w:t xml:space="preserve">Verify paging updates URL query parameters </w:t>
             </w:r>
           </w:p>
@@ -7599,7 +7566,7 @@
             <w:tcW w:w="5238" w:type="dxa"/>
           </w:tcPr>
           <w:p>
-            <w:hyperlink r:id="rId36" w:tooltip="DN11_Default_StaticSSR_URLPaging.mp4" w:history="1">
+            <w:hyperlink r:id="rId38" w:tooltip="DN11_Default_StaticSSR_URLPaging.mp4" w:history="1">
               <w:r>
                 <w:rPr>
                   <w:rStyle w:val="Hyperlink"/>
@@ -7676,7 +7643,6 @@
                 <w:b/>
                 <w:bCs/>
               </w:rPr>
-              <w:lastRenderedPageBreak/>
               <w:t>Scenario</w:t>
             </w:r>
           </w:p>
@@ -7720,7 +7686,7 @@
             <w:tcW w:w="5238" w:type="dxa"/>
           </w:tcPr>
           <w:p>
-            <w:hyperlink r:id="rId37" w:tooltip="DN11_Default_Server_HeaderMarkup.png" w:history="1">
+            <w:hyperlink r:id="rId39" w:tooltip="DN11_Default_Server_HeaderMarkup.png" w:history="1">
               <w:r>
                 <w:rPr>
                   <w:rStyle w:val="Hyperlink"/>
@@ -7730,7 +7696,7 @@
             </w:hyperlink>
           </w:p>
           <w:p>
-            <w:hyperlink r:id="rId38" w:tooltip="DN11_Default_Server_HeaderMarkup.txt" w:history="1">
+            <w:hyperlink r:id="rId40" w:tooltip="DN11_Default_Server_HeaderMarkup.txt" w:history="1">
               <w:r>
                 <w:rPr>
                   <w:rStyle w:val="Hyperlink"/>
@@ -7757,7 +7723,7 @@
             <w:tcW w:w="5238" w:type="dxa"/>
           </w:tcPr>
           <w:p>
-            <w:hyperlink r:id="rId39" w:tooltip="DN11_Default_Server_PaginatorMarkup.png" w:history="1">
+            <w:hyperlink r:id="rId41" w:tooltip="DN11_Default_Server_PaginatorMarkup.png" w:history="1">
               <w:r>
                 <w:rPr>
                   <w:rStyle w:val="Hyperlink"/>
@@ -7767,7 +7733,7 @@
             </w:hyperlink>
           </w:p>
           <w:p>
-            <w:hyperlink r:id="rId40" w:tooltip="DN11_Default_Server_PaginatorMarkup.txt" w:history="1">
+            <w:hyperlink r:id="rId42" w:tooltip="DN11_Default_Server_PaginatorMarkup.txt" w:history="1">
               <w:r>
                 <w:rPr>
                   <w:rStyle w:val="Hyperlink"/>
@@ -7794,7 +7760,7 @@
             <w:tcW w:w="5238" w:type="dxa"/>
           </w:tcPr>
           <w:p>
-            <w:hyperlink r:id="rId41" w:tooltip="DN11_Default_Server_URLSort.mp4" w:history="1">
+            <w:hyperlink r:id="rId43" w:tooltip="DN11_Default_Server_URLSort.mp4" w:history="1">
               <w:r>
                 <w:rPr>
                   <w:rStyle w:val="Hyperlink"/>
@@ -7821,7 +7787,7 @@
             <w:tcW w:w="5238" w:type="dxa"/>
           </w:tcPr>
           <w:p>
-            <w:hyperlink r:id="rId42" w:tooltip="DN11_Default_Server_URLPaging.mp4" w:history="1">
+            <w:hyperlink r:id="rId44" w:tooltip="DN11_Default_Server_URLPaging.mp4" w:history="1">
               <w:r>
                 <w:rPr>
                   <w:rStyle w:val="Hyperlink"/>
@@ -7960,7 +7926,7 @@
             <w:tcW w:w="7620" w:type="dxa"/>
           </w:tcPr>
           <w:p>
-            <w:hyperlink r:id="rId43" w:tooltip="DN11_Default_StaticSSR_HeaderMarkup_NormalPublish_Output.png" w:history="1">
+            <w:hyperlink r:id="rId45" w:tooltip="DN11_Default_StaticSSR_HeaderMarkup_NormalPublish_Output.png" w:history="1">
               <w:r>
                 <w:rPr>
                   <w:rStyle w:val="Hyperlink"/>
@@ -7970,7 +7936,7 @@
             </w:hyperlink>
           </w:p>
           <w:p>
-            <w:hyperlink r:id="rId44" w:tooltip="DN11_Default_StaticSSR_HeaderMarkup_NormalPublish_Output.txt" w:history="1">
+            <w:hyperlink r:id="rId46" w:tooltip="DN11_Default_StaticSSR_HeaderMarkup_NormalPublish_Output.txt" w:history="1">
               <w:r>
                 <w:rPr>
                   <w:rStyle w:val="Hyperlink"/>
@@ -7997,7 +7963,7 @@
             <w:tcW w:w="7620" w:type="dxa"/>
           </w:tcPr>
           <w:p>
-            <w:hyperlink r:id="rId45" w:tooltip="DN11_Default_StaticSSR_PaginatorMarkup_NormalPublish_Output.png" w:history="1">
+            <w:hyperlink r:id="rId47" w:tooltip="DN11_Default_StaticSSR_PaginatorMarkup_NormalPublish_Output.png" w:history="1">
               <w:r>
                 <w:rPr>
                   <w:rStyle w:val="Hyperlink"/>
@@ -8007,7 +7973,7 @@
             </w:hyperlink>
           </w:p>
           <w:p>
-            <w:hyperlink r:id="rId46" w:tooltip="DN11_Default_StaticSSR_PaginatorMarkup_NormalPublish_Output.txt" w:history="1">
+            <w:hyperlink r:id="rId48" w:tooltip="DN11_Default_StaticSSR_PaginatorMarkup_NormalPublish_Output.txt" w:history="1">
               <w:r>
                 <w:rPr>
                   <w:rStyle w:val="Hyperlink"/>
@@ -8040,7 +8006,7 @@
             <w:tcW w:w="7620" w:type="dxa"/>
           </w:tcPr>
           <w:p>
-            <w:hyperlink r:id="rId47" w:tooltip="DN11_Default_StaticSSR_NormalPublish_Output.mp4" w:history="1">
+            <w:hyperlink r:id="rId49" w:tooltip="DN11_Default_StaticSSR_NormalPublish_Output.mp4" w:history="1">
               <w:r>
                 <w:rPr>
                   <w:rStyle w:val="Hyperlink"/>
@@ -8074,6 +8040,7 @@
           <w:sz w:val="28"/>
           <w:szCs w:val="28"/>
         </w:rPr>
+        <w:lastRenderedPageBreak/>
         <w:t>S</w:t>
       </w:r>
       <w:r>
@@ -8149,11 +8116,7 @@
           </w:tcPr>
           <w:p>
             <w:r>
-              <w:t xml:space="preserve">Verify published Interactive Server </w:t>
-            </w:r>
-            <w:r>
-              <w:lastRenderedPageBreak/>
-              <w:t>retains anchor-based header rendering</w:t>
+              <w:t>Verify published Interactive Server retains anchor-based header rendering</w:t>
             </w:r>
           </w:p>
         </w:tc>
@@ -8162,7 +8125,7 @@
             <w:tcW w:w="5238" w:type="dxa"/>
           </w:tcPr>
           <w:p>
-            <w:hyperlink r:id="rId48" w:tooltip="DN11_Default_Server_HeaderMarkup_NormalPublish_Output.png" w:history="1">
+            <w:hyperlink r:id="rId50" w:tooltip="DN11_Default_Server_HeaderMarkup_NormalPublish_Output.png" w:history="1">
               <w:r>
                 <w:rPr>
                   <w:rStyle w:val="Hyperlink"/>
@@ -8172,7 +8135,7 @@
             </w:hyperlink>
           </w:p>
           <w:p>
-            <w:hyperlink r:id="rId49" w:tooltip="DN11_Default_Server_HeaderMarkup_NormalPublish_Output.txt" w:history="1">
+            <w:hyperlink r:id="rId51" w:tooltip="DN11_Default_Server_HeaderMarkup_NormalPublish_Output.txt" w:history="1">
               <w:r>
                 <w:rPr>
                   <w:rStyle w:val="Hyperlink"/>
@@ -8199,7 +8162,7 @@
             <w:tcW w:w="5238" w:type="dxa"/>
           </w:tcPr>
           <w:p>
-            <w:hyperlink r:id="rId50" w:tooltip="DN11_Default_Server_PaginatorMarkup_NormalPublish_Output.png" w:history="1">
+            <w:hyperlink r:id="rId52" w:tooltip="DN11_Default_Server_PaginatorMarkup_NormalPublish_Output.png" w:history="1">
               <w:r>
                 <w:rPr>
                   <w:rStyle w:val="Hyperlink"/>
@@ -8209,7 +8172,7 @@
             </w:hyperlink>
           </w:p>
           <w:p>
-            <w:hyperlink r:id="rId51" w:tooltip="DN11_Default_Server_PaginatorMarkup_NormalPublish_Output.txt" w:history="1">
+            <w:hyperlink r:id="rId53" w:tooltip="DN11_Default_Server_PaginatorMarkup_NormalPublish_Output.txt" w:history="1">
               <w:r>
                 <w:rPr>
                   <w:rStyle w:val="Hyperlink"/>
@@ -8242,7 +8205,7 @@
             <w:tcW w:w="5238" w:type="dxa"/>
           </w:tcPr>
           <w:p>
-            <w:hyperlink r:id="rId52" w:tooltip="DN11_Default_Server_NormalPublish_Output.mp4" w:history="1">
+            <w:hyperlink r:id="rId54" w:tooltip="DN11_Default_Server_NormalPublish_Output.mp4" w:history="1">
               <w:r>
                 <w:rPr>
                   <w:rStyle w:val="Hyperlink"/>
@@ -8409,7 +8372,7 @@
             <w:tcW w:w="5238" w:type="dxa"/>
           </w:tcPr>
           <w:p>
-            <w:hyperlink r:id="rId53" w:tooltip="DN11_Switch_StaticSSR_HeaderMarkup_NormalPublish_ProgramFile.png" w:history="1">
+            <w:hyperlink r:id="rId55" w:tooltip="DN11_Switch_StaticSSR_HeaderMarkup_NormalPublish_ProgramFile.png" w:history="1">
               <w:r>
                 <w:rPr>
                   <w:rStyle w:val="Hyperlink"/>
@@ -8419,7 +8382,7 @@
             </w:hyperlink>
           </w:p>
           <w:p>
-            <w:hyperlink r:id="rId54" w:tooltip="DN11_Switch_StaticSSR_HeaderMarkup_NormalPublish_ProgramFile.txt" w:history="1">
+            <w:hyperlink r:id="rId56" w:tooltip="DN11_Switch_StaticSSR_HeaderMarkup_NormalPublish_ProgramFile.txt" w:history="1">
               <w:r>
                 <w:rPr>
                   <w:rStyle w:val="Hyperlink"/>
@@ -8454,7 +8417,7 @@
             <w:tcW w:w="5238" w:type="dxa"/>
           </w:tcPr>
           <w:p>
-            <w:hyperlink r:id="rId55" w:tooltip="DN11_Switch_StaticSSR_PaginatorMarkup_NormalPublish_ProgramFile.png" w:history="1">
+            <w:hyperlink r:id="rId57" w:tooltip="DN11_Switch_StaticSSR_PaginatorMarkup_NormalPublish_ProgramFile.png" w:history="1">
               <w:r>
                 <w:rPr>
                   <w:rStyle w:val="Hyperlink"/>
@@ -8464,7 +8427,7 @@
             </w:hyperlink>
           </w:p>
           <w:p>
-            <w:hyperlink r:id="rId56" w:tooltip="DN11_Switch_StaticSSR_PaginatorMarkup_NormalPublish_ProgramFile.txt" w:history="1">
+            <w:hyperlink r:id="rId58" w:tooltip="DN11_Switch_StaticSSR_PaginatorMarkup_NormalPublish_ProgramFile.txt" w:history="1">
               <w:r>
                 <w:rPr>
                   <w:rStyle w:val="Hyperlink"/>
@@ -8575,7 +8538,6 @@
           </w:tcPr>
           <w:p>
             <w:r>
-              <w:lastRenderedPageBreak/>
               <w:t xml:space="preserve">Verify switch configured through </w:t>
             </w:r>
             <w:proofErr w:type="spellStart"/>
@@ -8593,7 +8555,7 @@
             <w:tcW w:w="5238" w:type="dxa"/>
           </w:tcPr>
           <w:p>
-            <w:hyperlink r:id="rId57" w:tooltip="DN11_Switch_Server_HeaderMarkup_NormalPublish_ProgramFile.png" w:history="1">
+            <w:hyperlink r:id="rId59" w:tooltip="DN11_Switch_Server_HeaderMarkup_NormalPublish_ProgramFile.png" w:history="1">
               <w:r>
                 <w:rPr>
                   <w:rStyle w:val="Hyperlink"/>
@@ -8603,7 +8565,7 @@
             </w:hyperlink>
           </w:p>
           <w:p>
-            <w:hyperlink r:id="rId58" w:tooltip="DN11_Switch_Server_HeaderMarkup_NormalPublish_ProgramFile.txt" w:history="1">
+            <w:hyperlink r:id="rId60" w:tooltip="DN11_Switch_Server_HeaderMarkup_NormalPublish_ProgramFile.txt" w:history="1">
               <w:r>
                 <w:rPr>
                   <w:rStyle w:val="Hyperlink"/>
@@ -8638,7 +8600,7 @@
             <w:tcW w:w="5238" w:type="dxa"/>
           </w:tcPr>
           <w:p>
-            <w:hyperlink r:id="rId59" w:tooltip="DN11_Switch_Server_PaginatorMarkup_NormalPublish_ProgramFile.png" w:history="1">
+            <w:hyperlink r:id="rId61" w:tooltip="DN11_Switch_Server_PaginatorMarkup_NormalPublish_ProgramFile.png" w:history="1">
               <w:r>
                 <w:rPr>
                   <w:rStyle w:val="Hyperlink"/>
@@ -8648,7 +8610,7 @@
             </w:hyperlink>
           </w:p>
           <w:p>
-            <w:hyperlink r:id="rId60" w:tooltip="DN11_Switch_Server_PaginatorMarkup_NormalPublish_ProgramFile.txt" w:history="1">
+            <w:hyperlink r:id="rId62" w:tooltip="DN11_Switch_Server_PaginatorMarkup_NormalPublish_ProgramFile.txt" w:history="1">
               <w:r>
                 <w:rPr>
                   <w:rStyle w:val="Hyperlink"/>
@@ -8795,7 +8757,7 @@
             <w:tcW w:w="5238" w:type="dxa"/>
           </w:tcPr>
           <w:p>
-            <w:hyperlink r:id="rId61" w:tooltip="DN11_Switch_StaticSSR_HeaderMarkup_NormalPublish_ProjectFile.png" w:history="1">
+            <w:hyperlink r:id="rId63" w:tooltip="DN11_Switch_StaticSSR_HeaderMarkup_NormalPublish_ProjectFile.png" w:history="1">
               <w:r>
                 <w:rPr>
                   <w:rStyle w:val="Hyperlink"/>
@@ -8805,7 +8767,7 @@
             </w:hyperlink>
           </w:p>
           <w:p>
-            <w:hyperlink r:id="rId62" w:tooltip="DN11_Switch_StaticSSR_HeaderMarkup_NormalPublish_ProjectFile.txt" w:history="1">
+            <w:hyperlink r:id="rId64" w:tooltip="DN11_Switch_StaticSSR_HeaderMarkup_NormalPublish_ProjectFile.txt" w:history="1">
               <w:r>
                 <w:rPr>
                   <w:rStyle w:val="Hyperlink"/>
@@ -8840,7 +8802,7 @@
             <w:tcW w:w="5238" w:type="dxa"/>
           </w:tcPr>
           <w:p>
-            <w:hyperlink r:id="rId63" w:tooltip="DN11_Switch_StaticSSR_PaginatorMarkup_NormalPublish_ProjectFile.png" w:history="1">
+            <w:hyperlink r:id="rId65" w:tooltip="DN11_Switch_StaticSSR_PaginatorMarkup_NormalPublish_ProjectFile.png" w:history="1">
               <w:r>
                 <w:rPr>
                   <w:rStyle w:val="Hyperlink"/>
@@ -8850,7 +8812,7 @@
             </w:hyperlink>
           </w:p>
           <w:p>
-            <w:hyperlink r:id="rId64" w:tooltip="DN11_Switch_StaticSSR_PaginatorMarkup_NormalPublish_ProjectFile.txt" w:history="1">
+            <w:hyperlink r:id="rId66" w:tooltip="DN11_Switch_StaticSSR_PaginatorMarkup_NormalPublish_ProjectFile.txt" w:history="1">
               <w:r>
                 <w:rPr>
                   <w:rStyle w:val="Hyperlink"/>
@@ -8961,6 +8923,7 @@
           </w:tcPr>
           <w:p>
             <w:r>
+              <w:lastRenderedPageBreak/>
               <w:t xml:space="preserve">Verify </w:t>
             </w:r>
             <w:proofErr w:type="spellStart"/>
@@ -8978,7 +8941,7 @@
             <w:tcW w:w="5238" w:type="dxa"/>
           </w:tcPr>
           <w:p>
-            <w:hyperlink r:id="rId65" w:tooltip="DN11_Switch_Server_HeaderMarkup_NormalPublish_ProjectFile.png" w:history="1">
+            <w:hyperlink r:id="rId67" w:tooltip="DN11_Switch_Server_HeaderMarkup_NormalPublish_ProjectFile.png" w:history="1">
               <w:r>
                 <w:rPr>
                   <w:rStyle w:val="Hyperlink"/>
@@ -8988,7 +8951,7 @@
             </w:hyperlink>
           </w:p>
           <w:p>
-            <w:hyperlink r:id="rId66" w:tooltip="DN11_Switch_Server_HeaderMarkup_NormalPublish_ProjectFile.txt" w:history="1">
+            <w:hyperlink r:id="rId68" w:tooltip="DN11_Switch_Server_HeaderMarkup_NormalPublish_ProjectFile.txt" w:history="1">
               <w:r>
                 <w:rPr>
                   <w:rStyle w:val="Hyperlink"/>
@@ -9010,11 +8973,7 @@
             </w:r>
             <w:proofErr w:type="spellStart"/>
             <w:r>
-              <w:t>RuntimeHostConfiguration</w:t>
-            </w:r>
-            <w:r>
-              <w:lastRenderedPageBreak/>
-              <w:t>Option</w:t>
+              <w:t>RuntimeHostConfigurationOption</w:t>
             </w:r>
             <w:proofErr w:type="spellEnd"/>
             <w:r>
@@ -9027,7 +8986,7 @@
             <w:tcW w:w="5238" w:type="dxa"/>
           </w:tcPr>
           <w:p>
-            <w:hyperlink r:id="rId67" w:tooltip="DN11_Switch_Server_PaginatorMarkup_NormalPublish_ProjectFile.png" w:history="1">
+            <w:hyperlink r:id="rId69" w:tooltip="DN11_Switch_Server_PaginatorMarkup_NormalPublish_ProjectFile.png" w:history="1">
               <w:r>
                 <w:rPr>
                   <w:rStyle w:val="Hyperlink"/>
@@ -9037,7 +8996,7 @@
             </w:hyperlink>
           </w:p>
           <w:p>
-            <w:hyperlink r:id="rId68" w:tooltip="DN11_Switch_Server_PaginatorMarkup_NormalPublish_ProjectFile.txt" w:history="1">
+            <w:hyperlink r:id="rId70" w:tooltip="DN11_Switch_Server_PaginatorMarkup_NormalPublish_ProjectFile.txt" w:history="1">
               <w:r>
                 <w:rPr>
                   <w:rStyle w:val="Hyperlink"/>
@@ -9075,25 +9034,7 @@
           <w:sz w:val="28"/>
           <w:szCs w:val="28"/>
         </w:rPr>
-        <w:t xml:space="preserve"> (Switch </w:t>
-      </w:r>
-      <w:r>
-        <w:rPr>
-          <w:b/>
-          <w:bCs/>
-          <w:sz w:val="28"/>
-          <w:szCs w:val="28"/>
-        </w:rPr>
-        <w:t>removed</w:t>
-      </w:r>
-      <w:r>
-        <w:rPr>
-          <w:b/>
-          <w:bCs/>
-          <w:sz w:val="28"/>
-          <w:szCs w:val="28"/>
-        </w:rPr>
-        <w:t xml:space="preserve"> Publish)</w:t>
+        <w:t xml:space="preserve"> (Switch removed Publish)</w:t>
       </w:r>
     </w:p>
     <w:p>
@@ -9197,7 +9138,7 @@
             <w:tcW w:w="5238" w:type="dxa"/>
           </w:tcPr>
           <w:p>
-            <w:hyperlink r:id="rId69" w:tooltip="DN11_SwitchRemoved_StaticSSR_HeaderMarkup_NormalPublish.png" w:history="1">
+            <w:hyperlink r:id="rId71" w:tooltip="DN11_SwitchRemoved_StaticSSR_HeaderMarkup_NormalPublish.png" w:history="1">
               <w:r>
                 <w:rPr>
                   <w:rStyle w:val="Hyperlink"/>
@@ -9207,7 +9148,7 @@
             </w:hyperlink>
           </w:p>
           <w:p>
-            <w:hyperlink r:id="rId70" w:tooltip="DN11_SwitchRemoved_StaticSSR_HeaderMarkup_NormalPublish.txt" w:history="1">
+            <w:hyperlink r:id="rId72" w:tooltip="DN11_SwitchRemoved_StaticSSR_HeaderMarkup_NormalPublish.txt" w:history="1">
               <w:r>
                 <w:rPr>
                   <w:rStyle w:val="Hyperlink"/>
@@ -9246,7 +9187,7 @@
             <w:tcW w:w="5238" w:type="dxa"/>
           </w:tcPr>
           <w:p>
-            <w:hyperlink r:id="rId71" w:tooltip="DN11_SwitchRemoved_StaticSSR_PaginatorMarkup_NormalPublish.png" w:history="1">
+            <w:hyperlink r:id="rId73" w:tooltip="DN11_SwitchRemoved_StaticSSR_PaginatorMarkup_NormalPublish.png" w:history="1">
               <w:r>
                 <w:rPr>
                   <w:rStyle w:val="Hyperlink"/>
@@ -9256,7 +9197,7 @@
             </w:hyperlink>
           </w:p>
           <w:p>
-            <w:hyperlink r:id="rId72" w:tooltip="DN11_SwitchRemoved_StaticSSR_PaginatorMarkup_NormalPublish.txt" w:history="1">
+            <w:hyperlink r:id="rId74" w:tooltip="DN11_SwitchRemoved_StaticSSR_PaginatorMarkup_NormalPublish.txt" w:history="1">
               <w:r>
                 <w:rPr>
                   <w:rStyle w:val="Hyperlink"/>
@@ -9388,7 +9329,7 @@
             <w:tcW w:w="6264" w:type="dxa"/>
           </w:tcPr>
           <w:p>
-            <w:hyperlink r:id="rId73" w:tooltip="DN11_SwitchRemoved_Server_HeaderMarkup_NormalPublish.png" w:history="1">
+            <w:hyperlink r:id="rId75" w:tooltip="DN11_SwitchRemoved_Server_HeaderMarkup_NormalPublish.png" w:history="1">
               <w:r>
                 <w:rPr>
                   <w:rStyle w:val="Hyperlink"/>
@@ -9398,7 +9339,7 @@
             </w:hyperlink>
           </w:p>
           <w:p>
-            <w:hyperlink r:id="rId74" w:tooltip="DN11_SwitchRemoved_Server_HeaderMarkup_NormalPublish.txt" w:history="1">
+            <w:hyperlink r:id="rId76" w:tooltip="DN11_SwitchRemoved_Server_HeaderMarkup_NormalPublish.txt" w:history="1">
               <w:r>
                 <w:rPr>
                   <w:rStyle w:val="Hyperlink"/>
@@ -9437,7 +9378,7 @@
             <w:tcW w:w="6264" w:type="dxa"/>
           </w:tcPr>
           <w:p>
-            <w:hyperlink r:id="rId75" w:tooltip="DN11_SwitchRemoved_Server_PaginatorMarkup_NormalPublish.png" w:history="1">
+            <w:hyperlink r:id="rId77" w:tooltip="DN11_SwitchRemoved_Server_PaginatorMarkup_NormalPublish.png" w:history="1">
               <w:r>
                 <w:rPr>
                   <w:rStyle w:val="Hyperlink"/>
@@ -9447,7 +9388,7 @@
             </w:hyperlink>
           </w:p>
           <w:p>
-            <w:hyperlink r:id="rId76" w:tooltip="DN11_SwitchRemoved_Server_PaginatorMarkup_NormalPublish.txt" w:history="1">
+            <w:hyperlink r:id="rId78" w:tooltip="DN11_SwitchRemoved_Server_PaginatorMarkup_NormalPublish.txt" w:history="1">
               <w:r>
                 <w:rPr>
                   <w:rStyle w:val="Hyperlink"/>
@@ -9508,6 +9449,7 @@
                 <w:b/>
                 <w:bCs/>
               </w:rPr>
+              <w:lastRenderedPageBreak/>
               <w:t>Scenario</w:t>
             </w:r>
           </w:p>
@@ -9562,11 +9504,7 @@
           </w:tcPr>
           <w:p>
             <w:r>
-              <w:t xml:space="preserve">Verify .NET 10 UI </w:t>
-            </w:r>
-            <w:r>
-              <w:lastRenderedPageBreak/>
-              <w:t>Selector</w:t>
+              <w:t>Verify .NET 10 UI Selector</w:t>
             </w:r>
           </w:p>
         </w:tc>
@@ -9575,7 +9513,7 @@
             <w:tcW w:w="3117" w:type="dxa"/>
           </w:tcPr>
           <w:p>
-            <w:hyperlink r:id="rId77" w:tooltip="DN10_StaticSSR_UI_Selector.mp4" w:history="1">
+            <w:hyperlink r:id="rId79" w:tooltip="DN10_StaticSSR_UI_Selector.mp4" w:history="1">
               <w:r>
                 <w:rPr>
                   <w:rStyle w:val="Hyperlink"/>
@@ -9590,7 +9528,7 @@
             <w:tcW w:w="4168" w:type="dxa"/>
           </w:tcPr>
           <w:p>
-            <w:hyperlink r:id="rId78" w:tooltip="DN10_Server_UI_Selector.mp4" w:history="1">
+            <w:hyperlink r:id="rId80" w:tooltip="DN10_Server_UI_Selector.mp4" w:history="1">
               <w:r>
                 <w:rPr>
                   <w:rStyle w:val="Hyperlink"/>
@@ -9608,13 +9546,7 @@
           </w:tcPr>
           <w:p>
             <w:r>
-              <w:t>Verify .NET 1</w:t>
-            </w:r>
-            <w:r>
-              <w:t>1</w:t>
-            </w:r>
-            <w:r>
-              <w:t xml:space="preserve"> UI Selector</w:t>
+              <w:t>Verify .NET 11 UI Selector</w:t>
             </w:r>
           </w:p>
         </w:tc>
@@ -9623,7 +9555,7 @@
             <w:tcW w:w="3117" w:type="dxa"/>
           </w:tcPr>
           <w:p>
-            <w:hyperlink r:id="rId79" w:tooltip="DN11_StaticSSR_UI_Selector.mp4" w:history="1">
+            <w:hyperlink r:id="rId81" w:tooltip="DN11_StaticSSR_UI_Selector.mp4" w:history="1">
               <w:r>
                 <w:rPr>
                   <w:rStyle w:val="Hyperlink"/>
@@ -9638,7 +9570,7 @@
             <w:tcW w:w="4168" w:type="dxa"/>
           </w:tcPr>
           <w:p>
-            <w:hyperlink r:id="rId80" w:tooltip="DN11_Server_UI_Selector.mp4" w:history="1">
+            <w:hyperlink r:id="rId82" w:tooltip="DN11_Server_UI_Selector.mp4" w:history="1">
               <w:r>
                 <w:rPr>
                   <w:rStyle w:val="Hyperlink"/>
@@ -9656,16 +9588,7 @@
           </w:tcPr>
           <w:p>
             <w:r>
-              <w:t>Verify .NET 1</w:t>
-            </w:r>
-            <w:r>
-              <w:t>1</w:t>
-            </w:r>
-            <w:r>
-              <w:t xml:space="preserve"> UI Selector</w:t>
-            </w:r>
-            <w:r>
-              <w:t xml:space="preserve"> with switch enabled</w:t>
+              <w:t>Verify .NET 11 UI Selector with switch enabled</w:t>
             </w:r>
           </w:p>
         </w:tc>
@@ -9674,7 +9597,7 @@
             <w:tcW w:w="3117" w:type="dxa"/>
           </w:tcPr>
           <w:p>
-            <w:hyperlink r:id="rId81" w:tooltip="DN11_Switch_StaticSSR_UI_Selector_NormalPublish.png" w:history="1">
+            <w:hyperlink r:id="rId83" w:tooltip="DN11_Switch_StaticSSR_UI_Selector_NormalPublish.png" w:history="1">
               <w:r>
                 <w:rPr>
                   <w:rStyle w:val="Hyperlink"/>
@@ -9689,7 +9612,7 @@
             <w:tcW w:w="4168" w:type="dxa"/>
           </w:tcPr>
           <w:p>
-            <w:hyperlink r:id="rId82" w:tooltip="DN11_Switch_Server_UI_Selector_NormalPublish.png" w:history="1">
+            <w:hyperlink r:id="rId84" w:tooltip="DN11_Switch_Server_UI_Selector_NormalPublish.png" w:history="1">
               <w:r>
                 <w:rPr>
                   <w:rStyle w:val="Hyperlink"/>
@@ -9707,10 +9630,7 @@
           </w:tcPr>
           <w:p>
             <w:r>
-              <w:t xml:space="preserve">Verify .NET 11 UI Selector with switch </w:t>
-            </w:r>
-            <w:r>
-              <w:t>removed</w:t>
+              <w:t>Verify .NET 11 UI Selector with switch removed</w:t>
             </w:r>
           </w:p>
         </w:tc>
@@ -9719,7 +9639,7 @@
             <w:tcW w:w="3117" w:type="dxa"/>
           </w:tcPr>
           <w:p>
-            <w:hyperlink r:id="rId83" w:tooltip="DN11_SwitchRemoved_StaticSSR_UI_Selector_NormalPublish.png" w:history="1">
+            <w:hyperlink r:id="rId85" w:tooltip="DN11_SwitchRemoved_StaticSSR_UI_Selector_NormalPublish.png" w:history="1">
               <w:r>
                 <w:rPr>
                   <w:rStyle w:val="Hyperlink"/>
@@ -9734,7 +9654,7 @@
             <w:tcW w:w="4168" w:type="dxa"/>
           </w:tcPr>
           <w:p>
-            <w:hyperlink r:id="rId84" w:tooltip="DN11_SwitchRemoved_Server_UI_Selector_NormalPublish.png" w:history="1">
+            <w:hyperlink r:id="rId86" w:tooltip="DN11_SwitchRemoved_Server_UI_Selector_NormalPublish.png" w:history="1">
               <w:r>
                 <w:rPr>
                   <w:rStyle w:val="Hyperlink"/>
@@ -9750,7 +9670,7 @@
     <w:p>
       <w:r>
         <w:pict w14:anchorId="59B7271B">
-          <v:rect id="_x0000_i1027" style="width:0;height:1.5pt" o:hralign="center" o:hrstd="t" o:hr="t" fillcolor="#a0a0a0" stroked="f"/>
+          <v:rect id="_x0000_i1029" style="width:0;height:1.5pt" o:hralign="center" o:hrstd="t" o:hr="t" fillcolor="#a0a0a0" stroked="f"/>
         </w:pict>
       </w:r>
     </w:p>
@@ -9896,6 +9816,7 @@
                 <w:i/>
                 <w:iCs/>
               </w:rPr>
+              <w:lastRenderedPageBreak/>
               <w:t>&lt;button class="col-title" type="button" b-b7yucal7gj=""&gt; …</w:t>
             </w:r>
           </w:p>
@@ -9910,6 +9831,7 @@
               <w:spacing w:after="160" w:line="278" w:lineRule="auto"/>
             </w:pPr>
             <w:r>
+              <w:lastRenderedPageBreak/>
               <w:t>Button</w:t>
             </w:r>
           </w:p>
@@ -9922,6 +9844,7 @@
                 <w:i/>
                 <w:iCs/>
               </w:rPr>
+              <w:lastRenderedPageBreak/>
               <w:t>…</w:t>
             </w:r>
             <w:r>
@@ -10343,6 +10266,7 @@
     </w:p>
     <w:p>
       <w:r>
+        <w:lastRenderedPageBreak/>
         <w:t>Proof:</w:t>
       </w:r>
     </w:p>
@@ -10351,7 +10275,7 @@
         <w:tab/>
         <w:t xml:space="preserve">.NET 10 sample commit: </w:t>
       </w:r>
-      <w:hyperlink r:id="rId85" w:history="1">
+      <w:hyperlink r:id="rId87" w:history="1">
         <w:r>
           <w:rPr>
             <w:rStyle w:val="Hyperlink"/>
@@ -10390,11 +10314,10 @@
     </w:p>
     <w:p>
       <w:r>
-        <w:lastRenderedPageBreak/>
         <w:tab/>
         <w:t xml:space="preserve">.NET 10 to 11 upgraded sample commit: </w:t>
       </w:r>
-      <w:hyperlink r:id="rId86" w:history="1">
+      <w:hyperlink r:id="rId88" w:history="1">
         <w:r>
           <w:rPr>
             <w:rStyle w:val="Hyperlink"/>
@@ -10644,7 +10567,7 @@
       <w:r>
         <w:t xml:space="preserve">Proof: </w:t>
       </w:r>
-      <w:hyperlink r:id="rId87" w:history="1">
+      <w:hyperlink r:id="rId89" w:history="1">
         <w:r>
           <w:rPr>
             <w:rStyle w:val="Hyperlink"/>
@@ -10782,7 +10705,7 @@
       <w:r>
         <w:t xml:space="preserve">Proof: </w:t>
       </w:r>
-      <w:hyperlink r:id="rId88" w:history="1">
+      <w:hyperlink r:id="rId90" w:history="1">
         <w:r>
           <w:rPr>
             <w:rStyle w:val="Hyperlink"/>
@@ -10887,6 +10810,7 @@
         </w:numPr>
       </w:pPr>
       <w:r>
+        <w:lastRenderedPageBreak/>
         <w:t>Paginator controls reverted from anchor (&lt;a&gt;) elements to button (&lt;button&gt;) elements.</w:t>
       </w:r>
     </w:p>
@@ -10911,7 +10835,6 @@
         </w:numPr>
       </w:pPr>
       <w:r>
-        <w:lastRenderedPageBreak/>
         <w:t xml:space="preserve">Interactive Server continued to support sorting and paging through </w:t>
       </w:r>
       <w:proofErr w:type="spellStart"/>
@@ -10958,7 +10881,7 @@
     <w:p>
       <w:r>
         <w:pict w14:anchorId="698BD933">
-          <v:rect id="_x0000_i1028" style="width:0;height:1.5pt" o:hralign="center" o:hrstd="t" o:hr="t" fillcolor="#a0a0a0" stroked="f"/>
+          <v:rect id="_x0000_i1030" style="width:0;height:1.5pt" o:hralign="center" o:hrstd="t" o:hr="t" fillcolor="#a0a0a0" stroked="f"/>
         </w:pict>
       </w:r>
     </w:p>
@@ -11116,7 +11039,7 @@
         <w:spacing w:line="240" w:lineRule="auto"/>
         <w:ind w:left="720" w:firstLine="720"/>
       </w:pPr>
-      <w:hyperlink r:id="rId89" w:history="1">
+      <w:hyperlink r:id="rId91" w:history="1">
         <w:r>
           <w:rPr>
             <w:rStyle w:val="Hyperlink"/>
@@ -11147,7 +11070,7 @@
         <w:spacing w:line="240" w:lineRule="auto"/>
         <w:ind w:left="720" w:firstLine="720"/>
       </w:pPr>
-      <w:hyperlink r:id="rId90" w:history="1">
+      <w:hyperlink r:id="rId92" w:history="1">
         <w:r>
           <w:rPr>
             <w:rStyle w:val="Hyperlink"/>
@@ -11170,7 +11093,7 @@
         <w:spacing w:line="240" w:lineRule="auto"/>
         <w:ind w:left="720" w:firstLine="720"/>
       </w:pPr>
-      <w:hyperlink r:id="rId91" w:history="1">
+      <w:hyperlink r:id="rId93" w:history="1">
         <w:r>
           <w:rPr>
             <w:rStyle w:val="Hyperlink"/>
@@ -11197,7 +11120,7 @@
     <w:p>
       <w:r>
         <w:pict w14:anchorId="6BEAA841">
-          <v:rect id="_x0000_i1029" style="width:0;height:1.5pt" o:hralign="center" o:hrstd="t" o:hr="t" fillcolor="#a0a0a0" stroked="f"/>
+          <v:rect id="_x0000_i1031" style="width:0;height:1.5pt" o:hralign="center" o:hrstd="t" o:hr="t" fillcolor="#a0a0a0" stroked="f"/>
         </w:pict>
       </w:r>
     </w:p>
@@ -11213,6 +11136,7 @@
           <w:b/>
           <w:bCs/>
         </w:rPr>
+        <w:lastRenderedPageBreak/>
         <w:t>Interactive Server</w:t>
       </w:r>
     </w:p>
@@ -11246,7 +11170,6 @@
         </w:numPr>
       </w:pPr>
       <w:r>
-        <w:lastRenderedPageBreak/>
         <w:t>Paginator controls rendered as anchor (&lt;a&gt;) elements.</w:t>
       </w:r>
     </w:p>
@@ -11324,7 +11247,7 @@
         <w:spacing w:line="240" w:lineRule="auto"/>
         <w:ind w:left="720" w:firstLine="720"/>
       </w:pPr>
-      <w:hyperlink r:id="rId92" w:history="1">
+      <w:hyperlink r:id="rId94" w:history="1">
         <w:r>
           <w:rPr>
             <w:rStyle w:val="Hyperlink"/>
@@ -11347,7 +11270,7 @@
         <w:spacing w:line="240" w:lineRule="auto"/>
         <w:ind w:left="720" w:firstLine="720"/>
       </w:pPr>
-      <w:hyperlink r:id="rId93" w:history="1">
+      <w:hyperlink r:id="rId95" w:history="1">
         <w:r>
           <w:rPr>
             <w:rStyle w:val="Hyperlink"/>
@@ -11378,7 +11301,7 @@
         <w:spacing w:line="240" w:lineRule="auto"/>
         <w:ind w:left="1440"/>
       </w:pPr>
-      <w:hyperlink r:id="rId94" w:history="1">
+      <w:hyperlink r:id="rId96" w:history="1">
         <w:r>
           <w:rPr>
             <w:rStyle w:val="Hyperlink"/>
@@ -11622,6 +11545,7 @@
           <w:b/>
           <w:bCs/>
         </w:rPr>
+        <w:lastRenderedPageBreak/>
         <w:t>Warning 2</w:t>
       </w:r>
     </w:p>
@@ -11698,7 +11622,6 @@
               <w:ind w:left="360"/>
             </w:pPr>
             <w:r>
-              <w:lastRenderedPageBreak/>
               <w:t>The section with ID '</w:t>
             </w:r>
             <w:proofErr w:type="spellStart"/>
@@ -11750,7 +11673,6 @@
           <w:b/>
           <w:bCs/>
         </w:rPr>
-        <w:lastRenderedPageBreak/>
         <w:t>Observation:</w:t>
       </w:r>
     </w:p>
@@ -11821,7 +11743,7 @@
           <w:noProof/>
         </w:rPr>
         <w:drawing>
-          <wp:inline distT="0" distB="0" distL="0" distR="0" wp14:anchorId="3DA66B92" wp14:editId="2B3AF294">
+          <wp:inline distT="0" distB="0" distL="0" distR="0" wp14:anchorId="3DA66B92" wp14:editId="7CE38464">
             <wp:extent cx="5943600" cy="1237615"/>
             <wp:effectExtent l="0" t="0" r="0" b="635"/>
             <wp:docPr id="2134330611" name="Picture 16"/>
@@ -11838,7 +11760,7 @@
                     </pic:cNvPicPr>
                   </pic:nvPicPr>
                   <pic:blipFill>
-                    <a:blip r:embed="rId95" cstate="print">
+                    <a:blip r:embed="rId97" cstate="print">
                       <a:extLst>
                         <a:ext uri="{28A0092B-C50C-407E-A947-70E740481C1C}">
                           <a14:useLocalDpi xmlns:a14="http://schemas.microsoft.com/office/drawing/2010/main" val="0"/>
@@ -12117,7 +12039,7 @@
               </w:rPr>
               <w:t xml:space="preserve"> </w:t>
             </w:r>
-            <w:hyperlink r:id="rId96" w:history="1">
+            <w:hyperlink r:id="rId98" w:history="1">
               <w:r>
                 <w:rPr>
                   <w:rStyle w:val="Hyperlink"/>
@@ -12227,6 +12149,7 @@
               <w:ind w:left="360"/>
             </w:pPr>
             <w:r>
+              <w:lastRenderedPageBreak/>
               <w:t xml:space="preserve">warn: </w:t>
             </w:r>
             <w:proofErr w:type="spellStart"/>
@@ -12264,7 +12187,6 @@
           <w:b/>
           <w:bCs/>
         </w:rPr>
-        <w:lastRenderedPageBreak/>
         <w:t>Observation:</w:t>
       </w:r>
     </w:p>
@@ -12515,7 +12437,7 @@
           <w:noProof/>
         </w:rPr>
         <w:drawing>
-          <wp:inline distT="0" distB="0" distL="0" distR="0" wp14:anchorId="391BB097" wp14:editId="090F4E49">
+          <wp:inline distT="0" distB="0" distL="0" distR="0" wp14:anchorId="391BB097" wp14:editId="0492556A">
             <wp:extent cx="5943600" cy="1616075"/>
             <wp:effectExtent l="0" t="0" r="0" b="3175"/>
             <wp:docPr id="771735196" name="Picture 22"/>
@@ -12532,7 +12454,7 @@
                     </pic:cNvPicPr>
                   </pic:nvPicPr>
                   <pic:blipFill>
-                    <a:blip r:embed="rId97" cstate="print">
+                    <a:blip r:embed="rId99" cstate="print">
                       <a:extLst>
                         <a:ext uri="{28A0092B-C50C-407E-A947-70E740481C1C}">
                           <a14:useLocalDpi xmlns:a14="http://schemas.microsoft.com/office/drawing/2010/main" val="0"/>
@@ -12565,7 +12487,7 @@
       </w:r>
       <w:r>
         <w:pict w14:anchorId="6694D28F">
-          <v:rect id="_x0000_i1030" style="width:0;height:1.5pt" o:hralign="center" o:hrstd="t" o:hr="t" fillcolor="#a0a0a0" stroked="f"/>
+          <v:rect id="_x0000_i1032" style="width:0;height:1.5pt" o:hralign="center" o:hrstd="t" o:hr="t" fillcolor="#a0a0a0" stroked="f"/>
         </w:pict>
       </w:r>
     </w:p>
@@ -12829,6 +12751,7 @@
                       <w:sz w:val="20"/>
                       <w:szCs w:val="20"/>
                     </w:rPr>
+                    <w:lastRenderedPageBreak/>
                     <w:t>In project file</w:t>
                   </w:r>
                 </w:p>
@@ -12850,7 +12773,6 @@
                       <w:sz w:val="20"/>
                       <w:szCs w:val="20"/>
                     </w:rPr>
-                    <w:lastRenderedPageBreak/>
                     <w:t>&lt;</w:t>
                   </w:r>
                   <w:proofErr w:type="spellStart"/>
@@ -13068,7 +12990,7 @@
               </w:rPr>
               <w:t xml:space="preserve"> </w:t>
             </w:r>
-            <w:hyperlink r:id="rId98" w:history="1">
+            <w:hyperlink r:id="rId100" w:history="1">
               <w:r>
                 <w:rPr>
                   <w:rStyle w:val="Hyperlink"/>
@@ -13205,8 +13127,69 @@
           <w:numId w:val="10"/>
         </w:numPr>
       </w:pPr>
-      <w:r>
-        <w:t>The trimmed axis is classified as a configuration limitation, not a regression.</w:t>
+      <w:proofErr w:type="spellStart"/>
+      <w:r>
+        <w:rPr>
+          <w:i/>
+          <w:iCs/>
+        </w:rPr>
+        <w:t>System.InvalidOperationException</w:t>
+      </w:r>
+      <w:proofErr w:type="spellEnd"/>
+      <w:r>
+        <w:rPr>
+          <w:i/>
+          <w:iCs/>
+        </w:rPr>
+        <w:t xml:space="preserve">: A suitable constructor for type </w:t>
+      </w:r>
+      <w:r>
+        <w:rPr>
+          <w:i/>
+          <w:iCs/>
+        </w:rPr>
+        <w:t>‘</w:t>
+      </w:r>
+      <w:proofErr w:type="gramStart"/>
+      <w:r>
+        <w:rPr>
+          <w:i/>
+          <w:iCs/>
+        </w:rPr>
+        <w:t>QuickGridUrlNavigationSampleNET10To11</w:t>
+      </w:r>
+      <w:r>
+        <w:rPr>
+          <w:i/>
+          <w:iCs/>
+        </w:rPr>
+        <w:t>.Components.Pages.NotFound</w:t>
+      </w:r>
+      <w:proofErr w:type="gramEnd"/>
+      <w:r>
+        <w:rPr>
+          <w:i/>
+          <w:iCs/>
+        </w:rPr>
+        <w:t xml:space="preserve">’ </w:t>
+      </w:r>
+      <w:r>
+        <w:rPr>
+          <w:i/>
+          <w:iCs/>
+        </w:rPr>
+        <w:t>could not be located</w:t>
+      </w:r>
+      <w:r>
+        <w:t xml:space="preserve"> occurred while navigating to trimmed published localhost </w:t>
+      </w:r>
+      <w:proofErr w:type="spellStart"/>
+      <w:r>
+        <w:t>url</w:t>
+      </w:r>
+      <w:proofErr w:type="spellEnd"/>
+      <w:r>
+        <w:t>.</w:t>
       </w:r>
     </w:p>
     <w:p>
@@ -13217,69 +13200,16 @@
           <w:numId w:val="10"/>
         </w:numPr>
       </w:pPr>
+      <w:r>
+        <w:t xml:space="preserve">The observed failure occurred in an unsupported trimmed Razor Components / Interactive Server configuration and is not considered a </w:t>
+      </w:r>
       <w:proofErr w:type="spellStart"/>
       <w:r>
-        <w:rPr>
-          <w:i/>
-          <w:iCs/>
-        </w:rPr>
-        <w:t>System.InvalidOperationException</w:t>
+        <w:t>QuickGrid</w:t>
       </w:r>
       <w:proofErr w:type="spellEnd"/>
       <w:r>
-        <w:rPr>
-          <w:i/>
-          <w:iCs/>
-        </w:rPr>
-        <w:t xml:space="preserve">: A suitable constructor for type </w:t>
-      </w:r>
-      <w:r>
-        <w:rPr>
-          <w:i/>
-          <w:iCs/>
-        </w:rPr>
-        <w:t>‘</w:t>
-      </w:r>
-      <w:proofErr w:type="gramStart"/>
-      <w:r>
-        <w:rPr>
-          <w:i/>
-          <w:iCs/>
-        </w:rPr>
-        <w:t>QuickGridUrlNavigationSampleNET10To11</w:t>
-      </w:r>
-      <w:r>
-        <w:rPr>
-          <w:i/>
-          <w:iCs/>
-        </w:rPr>
-        <w:t>.Components.Pages.NotFound</w:t>
-      </w:r>
-      <w:proofErr w:type="gramEnd"/>
-      <w:r>
-        <w:rPr>
-          <w:i/>
-          <w:iCs/>
-        </w:rPr>
-        <w:t xml:space="preserve">’ </w:t>
-      </w:r>
-      <w:r>
-        <w:rPr>
-          <w:i/>
-          <w:iCs/>
-        </w:rPr>
-        <w:t>could not be located</w:t>
-      </w:r>
-      <w:r>
-        <w:t xml:space="preserve"> occurred while navigating to trimmed published localhost </w:t>
-      </w:r>
-      <w:proofErr w:type="spellStart"/>
-      <w:r>
-        <w:t>url</w:t>
-      </w:r>
-      <w:proofErr w:type="spellEnd"/>
-      <w:r>
-        <w:t>.</w:t>
+        <w:t xml:space="preserve"> regression.</w:t>
       </w:r>
     </w:p>
     <w:p>
@@ -13330,7 +13260,47 @@
         </w:numPr>
       </w:pPr>
       <w:r>
-        <w:t>No conclusion can be drawn regarding compatibility switch behavior under trimming based on the collected evidence. Clarification from the issue owner is required regarding the intended supported trimmed configuration for this validation.</w:t>
+        <w:t>No conclusion can be drawn regarding compatibility switch behavior under trimming from the collected evidence because the tested hosting model is not supported for trimming.</w:t>
+      </w:r>
+    </w:p>
+    <w:p>
+      <w:pPr>
+        <w:pStyle w:val="ListParagraph"/>
+        <w:numPr>
+          <w:ilvl w:val="0"/>
+          <w:numId w:val="10"/>
+        </w:numPr>
+      </w:pPr>
+      <w:r>
+        <w:t xml:space="preserve">The observed runtime exception occurred before </w:t>
+      </w:r>
+      <w:proofErr w:type="spellStart"/>
+      <w:r>
+        <w:t>QuickGrid</w:t>
+      </w:r>
+      <w:proofErr w:type="spellEnd"/>
+      <w:r>
+        <w:t xml:space="preserve"> behavior could be evaluated and should not be interpreted as a </w:t>
+      </w:r>
+      <w:proofErr w:type="spellStart"/>
+      <w:r>
+        <w:t>QuickGrid</w:t>
+      </w:r>
+      <w:proofErr w:type="spellEnd"/>
+      <w:r>
+        <w:t xml:space="preserve"> issue.</w:t>
+      </w:r>
+    </w:p>
+    <w:p>
+      <w:pPr>
+        <w:pStyle w:val="ListParagraph"/>
+        <w:numPr>
+          <w:ilvl w:val="0"/>
+          <w:numId w:val="10"/>
+        </w:numPr>
+      </w:pPr>
+      <w:r>
+        <w:t>A supported trimmed configuration was not included in this validation; therefore, the trimming requirement remains incomplete.</w:t>
       </w:r>
     </w:p>
     <w:p>
@@ -13346,6 +13316,7 @@
           <w:b/>
           <w:bCs/>
         </w:rPr>
+        <w:lastRenderedPageBreak/>
         <w:t>Evidence</w:t>
       </w:r>
     </w:p>
@@ -13357,7 +13328,7 @@
           <w:numId w:val="21"/>
         </w:numPr>
       </w:pPr>
-      <w:hyperlink r:id="rId99" w:history="1">
+      <w:hyperlink r:id="rId101" w:history="1">
         <w:r>
           <w:rPr>
             <w:rStyle w:val="Hyperlink"/>
@@ -13374,7 +13345,7 @@
           <w:numId w:val="21"/>
         </w:numPr>
       </w:pPr>
-      <w:hyperlink r:id="rId100" w:history="1">
+      <w:hyperlink r:id="rId102" w:history="1">
         <w:r>
           <w:rPr>
             <w:rStyle w:val="Hyperlink"/>
@@ -13400,7 +13371,6 @@
           <w:sz w:val="32"/>
           <w:szCs w:val="32"/>
         </w:rPr>
-        <w:lastRenderedPageBreak/>
         <w:t>Documentation Assessment</w:t>
       </w:r>
     </w:p>
@@ -13451,7 +13421,7 @@
         </w:numPr>
         <w:ind w:left="1488"/>
       </w:pPr>
-      <w:hyperlink r:id="rId101" w:history="1">
+      <w:hyperlink r:id="rId103" w:history="1">
         <w:r>
           <w:rPr>
             <w:rStyle w:val="Hyperlink"/>
@@ -13750,6 +13720,7 @@
           <w:b/>
           <w:bCs/>
         </w:rPr>
+        <w:lastRenderedPageBreak/>
         <w:t>Switch Name Discoverable from Documentation:</w:t>
       </w:r>
       <w:r>
@@ -13785,7 +13756,6 @@
         <w:ind w:left="720"/>
       </w:pPr>
       <w:r>
-        <w:lastRenderedPageBreak/>
         <w:t xml:space="preserve">The switch name and its </w:t>
       </w:r>
       <w:proofErr w:type="spellStart"/>
@@ -13990,7 +13960,7 @@
         </w:numPr>
         <w:ind w:left="1488"/>
       </w:pPr>
-      <w:hyperlink r:id="rId102" w:history="1">
+      <w:hyperlink r:id="rId104" w:history="1">
         <w:r>
           <w:rPr>
             <w:rStyle w:val="Hyperlink"/>
@@ -14057,63 +14027,17 @@
           <w:sz w:val="32"/>
           <w:szCs w:val="32"/>
         </w:rPr>
-        <w:t>Unexpected Observation: Manual URL Editing and Sort Parameter Normalization</w:t>
-      </w:r>
-    </w:p>
-    <w:p>
-      <w:r>
-        <w:t>During validation of URL-based sorting behavior introduced in .NET 11, an intermittent</w:t>
-      </w:r>
-      <w:r>
-        <w:t xml:space="preserve"> </w:t>
-      </w:r>
-      <w:r>
-        <w:t xml:space="preserve">observation was identified while manually editing the </w:t>
-      </w:r>
-      <w:proofErr w:type="gramStart"/>
-      <w:r>
-        <w:t>sort</w:t>
-      </w:r>
-      <w:proofErr w:type="gramEnd"/>
-      <w:r>
-        <w:t xml:space="preserve"> query parameter directly in the browser URL. This behavior was observed across all successfully executed .NET 11 configurations and did not affect normal </w:t>
-      </w:r>
-      <w:proofErr w:type="spellStart"/>
-      <w:r>
-        <w:t>QuickGrid</w:t>
-      </w:r>
-      <w:proofErr w:type="spellEnd"/>
-      <w:r>
-        <w:t xml:space="preserve"> interactions.</w:t>
-      </w:r>
-    </w:p>
-    <w:p>
-      <w:pPr>
-        <w:rPr>
-          <w:b/>
-          <w:bCs/>
-        </w:rPr>
-      </w:pPr>
-      <w:r>
-        <w:rPr>
-          <w:b/>
-          <w:bCs/>
-        </w:rPr>
-        <w:t>Observation</w:t>
-      </w:r>
-    </w:p>
-    <w:p>
-      <w:r>
-        <w:lastRenderedPageBreak/>
-        <w:t xml:space="preserve">When manually editing a URL containing a </w:t>
-      </w:r>
-      <w:proofErr w:type="gramStart"/>
-      <w:r>
-        <w:t>sort</w:t>
-      </w:r>
-      <w:proofErr w:type="gramEnd"/>
-      <w:r>
-        <w:t xml:space="preserve"> parameter, such as:</w:t>
+        <w:t>Manual URL Editing Validation</w:t>
+      </w:r>
+    </w:p>
+    <w:p>
+      <w:r>
+        <w:t>During manual URL-edit testing, sorting behaved correctly when valid property names were supplied.</w:t>
+      </w:r>
+    </w:p>
+    <w:p>
+      <w:r>
+        <w:t>Example:</w:t>
       </w:r>
     </w:p>
     <w:tbl>
@@ -14123,17 +14047,14 @@
         <w:tblLook w:val="04A0" w:firstRow="1" w:lastRow="0" w:firstColumn="1" w:lastColumn="0" w:noHBand="0" w:noVBand="1"/>
       </w:tblPr>
       <w:tblGrid>
-        <w:gridCol w:w="3983"/>
+        <w:gridCol w:w="4135"/>
       </w:tblGrid>
       <w:tr>
         <w:tc>
           <w:tcPr>
-            <w:tcW w:w="3505" w:type="dxa"/>
-          </w:tcPr>
-          <w:p>
-            <w:pPr>
-              <w:spacing w:after="160" w:line="278" w:lineRule="auto"/>
-            </w:pPr>
+            <w:tcW w:w="4135" w:type="dxa"/>
+          </w:tcPr>
+          <w:p>
             <w:r>
               <w:t>?sort=</w:t>
             </w:r>
@@ -14147,10 +14068,7 @@
             </w:r>
             <w:proofErr w:type="spellStart"/>
             <w:r>
-              <w:t>asc</w:t>
-            </w:r>
-            <w:r>
-              <w:t>&amp;page</w:t>
+              <w:t>asc&amp;page</w:t>
             </w:r>
             <w:proofErr w:type="spellEnd"/>
             <w:r>
@@ -14163,15 +14081,27 @@
     <w:p/>
     <w:p>
       <w:r>
-        <w:t xml:space="preserve">the </w:t>
-      </w:r>
-      <w:proofErr w:type="gramStart"/>
-      <w:r>
-        <w:t>sort</w:t>
-      </w:r>
-      <w:proofErr w:type="gramEnd"/>
-      <w:r>
-        <w:t xml:space="preserve"> value occasionally became normalized to lowercase after navigation:</w:t>
+        <w:t xml:space="preserve">The grid restored the expected sort and paging state, and the URL remained functional. </w:t>
+      </w:r>
+    </w:p>
+    <w:p>
+      <w:pPr>
+        <w:rPr>
+          <w:b/>
+          <w:bCs/>
+        </w:rPr>
+      </w:pPr>
+      <w:r>
+        <w:rPr>
+          <w:b/>
+          <w:bCs/>
+        </w:rPr>
+        <w:t>Observation</w:t>
+      </w:r>
+    </w:p>
+    <w:p>
+      <w:r>
+        <w:t>Manual testing also included entering case-mismatched sort values such as:</w:t>
       </w:r>
     </w:p>
     <w:tbl>
@@ -14181,17 +14111,14 @@
         <w:tblLook w:val="04A0" w:firstRow="1" w:lastRow="0" w:firstColumn="1" w:lastColumn="0" w:noHBand="0" w:noVBand="1"/>
       </w:tblPr>
       <w:tblGrid>
-        <w:gridCol w:w="3946"/>
+        <w:gridCol w:w="4135"/>
       </w:tblGrid>
       <w:tr>
         <w:tc>
           <w:tcPr>
-            <w:tcW w:w="3505" w:type="dxa"/>
-          </w:tcPr>
-          <w:p>
-            <w:pPr>
-              <w:spacing w:after="160" w:line="278" w:lineRule="auto"/>
-            </w:pPr>
+            <w:tcW w:w="4135" w:type="dxa"/>
+          </w:tcPr>
+          <w:p>
             <w:r>
               <w:t>?sort=</w:t>
             </w:r>
@@ -14205,10 +14132,7 @@
             </w:r>
             <w:proofErr w:type="spellStart"/>
             <w:r>
-              <w:t>asc</w:t>
-            </w:r>
-            <w:r>
-              <w:t>&amp;page</w:t>
+              <w:t>asc&amp;page</w:t>
             </w:r>
             <w:proofErr w:type="spellEnd"/>
             <w:r>
@@ -14221,18 +14145,15 @@
     <w:p/>
     <w:p>
       <w:r>
-        <w:t xml:space="preserve">In </w:t>
+        <w:t xml:space="preserve">In this case, the grid did not reflect the expected </w:t>
       </w:r>
       <w:proofErr w:type="gramStart"/>
       <w:r>
-        <w:t>this</w:t>
-      </w:r>
-      <w:r>
-        <w:t xml:space="preserve"> instances</w:t>
+        <w:t>sort</w:t>
       </w:r>
       <w:proofErr w:type="gramEnd"/>
       <w:r>
-        <w:t xml:space="preserve">, the grid UI did not reflect the expected </w:t>
+        <w:t xml:space="preserve"> state because the supplied </w:t>
       </w:r>
       <w:proofErr w:type="gramStart"/>
       <w:r>
@@ -14240,27 +14161,12 @@
       </w:r>
       <w:proofErr w:type="gramEnd"/>
       <w:r>
-        <w:t xml:space="preserve"> state after the parameter normalization occurred.</w:t>
-      </w:r>
-    </w:p>
-    <w:p>
-      <w:pPr>
-        <w:rPr>
-          <w:b/>
-          <w:bCs/>
-        </w:rPr>
-      </w:pPr>
-      <w:r>
-        <w:rPr>
-          <w:b/>
-          <w:bCs/>
-        </w:rPr>
-        <w:t>Scope</w:t>
-      </w:r>
-    </w:p>
-    <w:p>
-      <w:r>
-        <w:t>The behavior was observed during:</w:t>
+        <w:t xml:space="preserve"> value did not match the expected property name. </w:t>
+      </w:r>
+    </w:p>
+    <w:p>
+      <w:r>
+        <w:t>Repeated validation confirmed:</w:t>
       </w:r>
     </w:p>
     <w:p>
@@ -14268,11 +14174,11 @@
         <w:pStyle w:val="ListParagraph"/>
         <w:numPr>
           <w:ilvl w:val="0"/>
-          <w:numId w:val="16"/>
+          <w:numId w:val="36"/>
         </w:numPr>
       </w:pPr>
       <w:r>
-        <w:t>.NET 11 Default Build</w:t>
+        <w:t xml:space="preserve">sort=Name restored the expected sorting behavior. </w:t>
       </w:r>
     </w:p>
     <w:p>
@@ -14280,11 +14186,11 @@
         <w:pStyle w:val="ListParagraph"/>
         <w:numPr>
           <w:ilvl w:val="0"/>
-          <w:numId w:val="16"/>
+          <w:numId w:val="36"/>
         </w:numPr>
       </w:pPr>
       <w:r>
-        <w:t>.NET 11 Published Output</w:t>
+        <w:t xml:space="preserve">sort=name did not restore the expected sorting behavior. </w:t>
       </w:r>
     </w:p>
     <w:p>
@@ -14292,11 +14198,19 @@
         <w:pStyle w:val="ListParagraph"/>
         <w:numPr>
           <w:ilvl w:val="0"/>
-          <w:numId w:val="16"/>
+          <w:numId w:val="36"/>
         </w:numPr>
       </w:pPr>
       <w:r>
-        <w:t>.NET 11 with Compatibility Switch (Runtime Configuration)</w:t>
+        <w:t xml:space="preserve">Normal </w:t>
+      </w:r>
+      <w:proofErr w:type="spellStart"/>
+      <w:r>
+        <w:t>QuickGrid</w:t>
+      </w:r>
+      <w:proofErr w:type="spellEnd"/>
+      <w:r>
+        <w:t xml:space="preserve"> interactions continued to generate valid URLs and restore state correctly. </w:t>
       </w:r>
     </w:p>
     <w:p>
@@ -14304,16 +14218,11 @@
         <w:pStyle w:val="ListParagraph"/>
         <w:numPr>
           <w:ilvl w:val="0"/>
-          <w:numId w:val="16"/>
+          <w:numId w:val="36"/>
         </w:numPr>
       </w:pPr>
       <w:r>
-        <w:t>.NET 11 with Compatibility Switch (Published Output)</w:t>
-      </w:r>
-    </w:p>
-    <w:p>
-      <w:r>
-        <w:t>The behavior was observed in both:</w:t>
+        <w:t xml:space="preserve">Browser Back/Forward navigation continued to function correctly. </w:t>
       </w:r>
     </w:p>
     <w:p>
@@ -14321,11 +14230,42 @@
         <w:pStyle w:val="ListParagraph"/>
         <w:numPr>
           <w:ilvl w:val="0"/>
-          <w:numId w:val="15"/>
+          <w:numId w:val="36"/>
         </w:numPr>
       </w:pPr>
       <w:r>
-        <w:t>Static SSR</w:t>
+        <w:t xml:space="preserve">Copying and reopening </w:t>
+      </w:r>
+      <w:proofErr w:type="spellStart"/>
+      <w:r>
+        <w:t>QuickGrid</w:t>
+      </w:r>
+      <w:proofErr w:type="spellEnd"/>
+      <w:r>
+        <w:t>-generated URLs restored the expected state correctly.</w:t>
+      </w:r>
+      <w:r>
+        <w:t xml:space="preserve"> </w:t>
+      </w:r>
+    </w:p>
+    <w:p>
+      <w:pPr>
+        <w:rPr>
+          <w:b/>
+          <w:bCs/>
+        </w:rPr>
+      </w:pPr>
+      <w:r>
+        <w:rPr>
+          <w:b/>
+          <w:bCs/>
+        </w:rPr>
+        <w:t>Scope</w:t>
+      </w:r>
+    </w:p>
+    <w:p>
+      <w:r>
+        <w:t>The behavior was evaluated in:</w:t>
       </w:r>
     </w:p>
     <w:p>
@@ -14333,26 +14273,11 @@
         <w:pStyle w:val="ListParagraph"/>
         <w:numPr>
           <w:ilvl w:val="0"/>
-          <w:numId w:val="15"/>
+          <w:numId w:val="35"/>
         </w:numPr>
       </w:pPr>
       <w:r>
-        <w:t>Interactive Server</w:t>
-      </w:r>
-    </w:p>
-    <w:p>
-      <w:pPr>
-        <w:rPr>
-          <w:b/>
-          <w:bCs/>
-        </w:rPr>
-      </w:pPr>
-      <w:r>
-        <w:rPr>
-          <w:b/>
-          <w:bCs/>
-        </w:rPr>
-        <w:t>Important Notes</w:t>
+        <w:t xml:space="preserve">.NET 11 Default Build. </w:t>
       </w:r>
     </w:p>
     <w:p>
@@ -14360,11 +14285,11 @@
         <w:pStyle w:val="ListParagraph"/>
         <w:numPr>
           <w:ilvl w:val="0"/>
-          <w:numId w:val="14"/>
+          <w:numId w:val="35"/>
         </w:numPr>
       </w:pPr>
       <w:r>
-        <w:t>The behavior was only observed while manually editing the URL.</w:t>
+        <w:t xml:space="preserve">.NET 11 Published Output. </w:t>
       </w:r>
     </w:p>
     <w:p>
@@ -14372,19 +14297,11 @@
         <w:pStyle w:val="ListParagraph"/>
         <w:numPr>
           <w:ilvl w:val="0"/>
-          <w:numId w:val="14"/>
+          <w:numId w:val="35"/>
         </w:numPr>
       </w:pPr>
       <w:r>
-        <w:t xml:space="preserve">Normal </w:t>
-      </w:r>
-      <w:proofErr w:type="spellStart"/>
-      <w:r>
-        <w:t>QuickGrid</w:t>
-      </w:r>
-      <w:proofErr w:type="spellEnd"/>
-      <w:r>
-        <w:t xml:space="preserve"> interactions (clicking sortable column headers) consistently generated valid URLs and restored the expected grid state.</w:t>
+        <w:t xml:space="preserve">.NET 11 with Compatibility Switch Enabled. </w:t>
       </w:r>
     </w:p>
     <w:p>
@@ -14392,31 +14309,11 @@
         <w:pStyle w:val="ListParagraph"/>
         <w:numPr>
           <w:ilvl w:val="0"/>
-          <w:numId w:val="14"/>
+          <w:numId w:val="35"/>
         </w:numPr>
       </w:pPr>
       <w:r>
-        <w:t xml:space="preserve">Copying URLs generated by </w:t>
-      </w:r>
-      <w:proofErr w:type="spellStart"/>
-      <w:r>
-        <w:t>QuickGrid</w:t>
-      </w:r>
-      <w:proofErr w:type="spellEnd"/>
-      <w:r>
-        <w:t xml:space="preserve"> and opening them in a new browser tab restored the expected sort and paging state successfully.</w:t>
-      </w:r>
-    </w:p>
-    <w:p>
-      <w:pPr>
-        <w:pStyle w:val="ListParagraph"/>
-        <w:numPr>
-          <w:ilvl w:val="0"/>
-          <w:numId w:val="14"/>
-        </w:numPr>
-      </w:pPr>
-      <w:r>
-        <w:t>Sorting and paging functionality remained fully operational through normal UI interaction paths.</w:t>
+        <w:t>.NET 11 Published Output with Compatibility Switch Enabled</w:t>
       </w:r>
     </w:p>
     <w:p>
@@ -14431,817 +14328,89 @@
           <w:b/>
           <w:bCs/>
         </w:rPr>
-        <w:t>Example</w:t>
-      </w:r>
-    </w:p>
-    <w:p>
-      <w:r>
-        <w:t>Manually entered:</w:t>
-      </w:r>
-    </w:p>
-    <w:p>
-      <w:hyperlink r:id="rId103" w:history="1">
-        <w:r>
-          <w:rPr>
-            <w:rStyle w:val="Hyperlink"/>
-          </w:rPr>
-          <w:t>http://localhost:5041/quickgrid-interactive?sort=Name&amp;amp;direction=asc</w:t>
-        </w:r>
-      </w:hyperlink>
-    </w:p>
-    <w:p>
-      <w:r>
-        <w:t>Observed after navigation:</w:t>
-      </w:r>
-    </w:p>
-    <w:p>
-      <w:hyperlink r:id="rId104" w:history="1">
-        <w:r>
-          <w:rPr>
-            <w:rStyle w:val="Hyperlink"/>
-          </w:rPr>
-          <w:t>http://localhost:5041/quickgrid-interactive?sort=name&amp;amp;direction=asc</w:t>
-        </w:r>
-      </w:hyperlink>
-    </w:p>
-    <w:p>
-      <w:r>
-        <w:t>With this</w:t>
-      </w:r>
-      <w:r>
-        <w:t>, the grid UI did not reflect the expected state after the parameter value was normalized.</w:t>
-      </w:r>
-    </w:p>
-    <w:p>
-      <w:pPr>
+        <w:t>Classification</w:t>
+      </w:r>
+    </w:p>
+    <w:p>
+      <w:r>
         <w:rPr>
           <w:b/>
           <w:bCs/>
         </w:rPr>
-      </w:pPr>
-      <w:r>
+        <w:t>Status: Pass</w:t>
+      </w:r>
+    </w:p>
+    <w:p>
+      <w:r>
+        <w:t>The required manual URL-editing validation scenarios behaved correctly when valid URL state was supplied.</w:t>
+      </w:r>
+    </w:p>
+    <w:p>
+      <w:pPr>
+        <w:rPr>
+          <w:i/>
+          <w:iCs/>
+        </w:rPr>
+      </w:pPr>
+      <w:r>
+        <w:t xml:space="preserve">Case-mismatched values </w:t>
+      </w:r>
+      <w:r>
+        <w:t>such as</w:t>
+      </w:r>
+      <w:r>
+        <w:t xml:space="preserve"> </w:t>
+      </w:r>
+      <w:r>
+        <w:rPr>
+          <w:i/>
+          <w:iCs/>
+        </w:rPr>
+        <w:t>sort=name</w:t>
+      </w:r>
+      <w:r>
+        <w:rPr>
+          <w:i/>
+          <w:iCs/>
+        </w:rPr>
+        <w:t>.</w:t>
+      </w:r>
+    </w:p>
+    <w:p>
+      <w:r>
+        <w:t xml:space="preserve">did not restore the expected sorting behavior and are classified as invalid user-supplied URL state rather than a </w:t>
+      </w:r>
+      <w:proofErr w:type="spellStart"/>
+      <w:r>
+        <w:t>QuickGrid</w:t>
+      </w:r>
+      <w:proofErr w:type="spellEnd"/>
+      <w:r>
+        <w:t xml:space="preserve"> or framework normalization issue. </w:t>
+      </w:r>
+    </w:p>
+    <w:p>
+      <w:pPr>
         <w:rPr>
           <w:b/>
           <w:bCs/>
         </w:rPr>
-        <w:t>Impact Assessment</w:t>
-      </w:r>
-    </w:p>
-    <w:tbl>
-      <w:tblPr>
-        <w:tblStyle w:val="TableGrid"/>
-        <w:tblW w:w="0" w:type="auto"/>
-        <w:tblLook w:val="04A0" w:firstRow="1" w:lastRow="0" w:firstColumn="1" w:lastColumn="0" w:noHBand="0" w:noVBand="1"/>
-      </w:tblPr>
-      <w:tblGrid>
-        <w:gridCol w:w="5238"/>
-        <w:gridCol w:w="2719"/>
-      </w:tblGrid>
-      <w:tr>
-        <w:tc>
-          <w:tcPr>
-            <w:tcW w:w="0" w:type="auto"/>
-            <w:hideMark/>
-          </w:tcPr>
-          <w:p>
-            <w:pPr>
-              <w:spacing w:after="160" w:line="278" w:lineRule="auto"/>
-              <w:jc w:val="center"/>
-              <w:rPr>
-                <w:b/>
-                <w:bCs/>
-              </w:rPr>
-            </w:pPr>
-            <w:r>
-              <w:rPr>
-                <w:b/>
-                <w:bCs/>
-              </w:rPr>
-              <w:t>Area</w:t>
-            </w:r>
-          </w:p>
-        </w:tc>
-        <w:tc>
-          <w:tcPr>
-            <w:tcW w:w="0" w:type="auto"/>
-            <w:hideMark/>
-          </w:tcPr>
-          <w:p>
-            <w:pPr>
-              <w:spacing w:after="160" w:line="278" w:lineRule="auto"/>
-              <w:jc w:val="center"/>
-              <w:rPr>
-                <w:b/>
-                <w:bCs/>
-              </w:rPr>
-            </w:pPr>
-            <w:r>
-              <w:rPr>
-                <w:b/>
-                <w:bCs/>
-              </w:rPr>
-              <w:t>Impact</w:t>
-            </w:r>
-          </w:p>
-        </w:tc>
-      </w:tr>
-      <w:tr>
-        <w:tc>
-          <w:tcPr>
-            <w:tcW w:w="0" w:type="auto"/>
-            <w:hideMark/>
-          </w:tcPr>
-          <w:p>
-            <w:pPr>
-              <w:spacing w:after="160" w:line="278" w:lineRule="auto"/>
-            </w:pPr>
-            <w:proofErr w:type="spellStart"/>
-            <w:r>
-              <w:t>QuickGrid</w:t>
-            </w:r>
-            <w:proofErr w:type="spellEnd"/>
-            <w:r>
-              <w:t xml:space="preserve"> sorting through UI</w:t>
-            </w:r>
-          </w:p>
-        </w:tc>
-        <w:tc>
-          <w:tcPr>
-            <w:tcW w:w="0" w:type="auto"/>
-            <w:hideMark/>
-          </w:tcPr>
-          <w:p>
-            <w:pPr>
-              <w:spacing w:after="160" w:line="278" w:lineRule="auto"/>
-            </w:pPr>
-            <w:r>
-              <w:t>No impact</w:t>
-            </w:r>
-          </w:p>
-        </w:tc>
-      </w:tr>
-      <w:tr>
-        <w:tc>
-          <w:tcPr>
-            <w:tcW w:w="0" w:type="auto"/>
-            <w:hideMark/>
-          </w:tcPr>
-          <w:p>
-            <w:pPr>
-              <w:spacing w:after="160" w:line="278" w:lineRule="auto"/>
-            </w:pPr>
-            <w:proofErr w:type="spellStart"/>
-            <w:r>
-              <w:t>QuickGrid</w:t>
-            </w:r>
-            <w:proofErr w:type="spellEnd"/>
-            <w:r>
-              <w:t xml:space="preserve"> paging through UI</w:t>
-            </w:r>
-          </w:p>
-        </w:tc>
-        <w:tc>
-          <w:tcPr>
-            <w:tcW w:w="0" w:type="auto"/>
-            <w:hideMark/>
-          </w:tcPr>
-          <w:p>
-            <w:pPr>
-              <w:spacing w:after="160" w:line="278" w:lineRule="auto"/>
-            </w:pPr>
-            <w:r>
-              <w:t>No impact</w:t>
-            </w:r>
-          </w:p>
-        </w:tc>
-      </w:tr>
-      <w:tr>
-        <w:tc>
-          <w:tcPr>
-            <w:tcW w:w="0" w:type="auto"/>
-            <w:hideMark/>
-          </w:tcPr>
-          <w:p>
-            <w:pPr>
-              <w:spacing w:after="160" w:line="278" w:lineRule="auto"/>
-            </w:pPr>
-            <w:r>
-              <w:t xml:space="preserve">URL generation by </w:t>
-            </w:r>
-            <w:proofErr w:type="spellStart"/>
-            <w:r>
-              <w:t>QuickGrid</w:t>
-            </w:r>
-            <w:proofErr w:type="spellEnd"/>
-          </w:p>
-        </w:tc>
-        <w:tc>
-          <w:tcPr>
-            <w:tcW w:w="0" w:type="auto"/>
-            <w:hideMark/>
-          </w:tcPr>
-          <w:p>
-            <w:pPr>
-              <w:spacing w:after="160" w:line="278" w:lineRule="auto"/>
-            </w:pPr>
-            <w:r>
-              <w:t>No impact</w:t>
-            </w:r>
-          </w:p>
-        </w:tc>
-      </w:tr>
-      <w:tr>
-        <w:tc>
-          <w:tcPr>
-            <w:tcW w:w="0" w:type="auto"/>
-            <w:hideMark/>
-          </w:tcPr>
-          <w:p>
-            <w:pPr>
-              <w:spacing w:after="160" w:line="278" w:lineRule="auto"/>
-            </w:pPr>
-            <w:r>
-              <w:t>Browser Back/Forward navigation</w:t>
-            </w:r>
-          </w:p>
-        </w:tc>
-        <w:tc>
-          <w:tcPr>
-            <w:tcW w:w="0" w:type="auto"/>
-            <w:hideMark/>
-          </w:tcPr>
-          <w:p>
-            <w:pPr>
-              <w:spacing w:after="160" w:line="278" w:lineRule="auto"/>
-            </w:pPr>
-            <w:r>
-              <w:t>No impact</w:t>
-            </w:r>
-          </w:p>
-        </w:tc>
-      </w:tr>
-      <w:tr>
-        <w:tc>
-          <w:tcPr>
-            <w:tcW w:w="0" w:type="auto"/>
-            <w:hideMark/>
-          </w:tcPr>
-          <w:p>
-            <w:pPr>
-              <w:spacing w:after="160" w:line="278" w:lineRule="auto"/>
-            </w:pPr>
-            <w:r>
-              <w:t>Opening framework-generated URLs in a new tab</w:t>
-            </w:r>
-          </w:p>
-        </w:tc>
-        <w:tc>
-          <w:tcPr>
-            <w:tcW w:w="0" w:type="auto"/>
-            <w:hideMark/>
-          </w:tcPr>
-          <w:p>
-            <w:pPr>
-              <w:spacing w:after="160" w:line="278" w:lineRule="auto"/>
-            </w:pPr>
-            <w:r>
-              <w:t>No impact</w:t>
-            </w:r>
-          </w:p>
-        </w:tc>
-      </w:tr>
-      <w:tr>
-        <w:tc>
-          <w:tcPr>
-            <w:tcW w:w="0" w:type="auto"/>
-            <w:hideMark/>
-          </w:tcPr>
-          <w:p>
-            <w:pPr>
-              <w:spacing w:after="160" w:line="278" w:lineRule="auto"/>
-            </w:pPr>
-            <w:r>
-              <w:t>Manual URL editing</w:t>
-            </w:r>
-          </w:p>
-        </w:tc>
-        <w:tc>
-          <w:tcPr>
-            <w:tcW w:w="0" w:type="auto"/>
-            <w:hideMark/>
-          </w:tcPr>
-          <w:p>
-            <w:pPr>
-              <w:spacing w:after="160" w:line="278" w:lineRule="auto"/>
-            </w:pPr>
-            <w:r>
-              <w:t>Intermittent observation</w:t>
-            </w:r>
-          </w:p>
-        </w:tc>
-      </w:tr>
-    </w:tbl>
-    <w:p>
-      <w:pPr>
+      </w:pPr>
+      <w:r>
         <w:rPr>
           <w:b/>
           <w:bCs/>
         </w:rPr>
-      </w:pPr>
-    </w:p>
-    <w:p>
-      <w:pPr>
-        <w:rPr>
-          <w:b/>
-          <w:bCs/>
-          <w:sz w:val="28"/>
-          <w:szCs w:val="28"/>
-        </w:rPr>
-      </w:pPr>
-      <w:r>
-        <w:rPr>
-          <w:b/>
-          <w:bCs/>
-          <w:sz w:val="28"/>
-          <w:szCs w:val="28"/>
-        </w:rPr>
-        <w:t>Reproduction Steps</w:t>
-      </w:r>
-    </w:p>
-    <w:p>
-      <w:pPr>
-        <w:pStyle w:val="ListParagraph"/>
-        <w:numPr>
-          <w:ilvl w:val="0"/>
-          <w:numId w:val="29"/>
-        </w:numPr>
-      </w:pPr>
-      <w:r>
-        <w:t>Launch the application.</w:t>
-      </w:r>
-    </w:p>
-    <w:p>
-      <w:pPr>
-        <w:pStyle w:val="ListParagraph"/>
-        <w:numPr>
-          <w:ilvl w:val="0"/>
-          <w:numId w:val="29"/>
-        </w:numPr>
-      </w:pPr>
-      <w:r>
-        <w:t>Navigate to:</w:t>
-      </w:r>
-      <w:r>
-        <w:t xml:space="preserve"> </w:t>
-      </w:r>
-      <w:hyperlink r:id="rId105" w:history="1">
-        <w:r>
-          <w:rPr>
-            <w:rStyle w:val="Hyperlink"/>
-          </w:rPr>
-          <w:t>http://localhost:5041/quickgrid-interactive</w:t>
-        </w:r>
-      </w:hyperlink>
-      <w:r>
-        <w:t xml:space="preserve"> or </w:t>
-      </w:r>
-      <w:hyperlink r:id="rId106" w:history="1">
-        <w:r>
-          <w:rPr>
-            <w:rStyle w:val="Hyperlink"/>
-          </w:rPr>
-          <w:t>http://localhost:5041/quickgrid-</w:t>
-        </w:r>
-        <w:r>
-          <w:rPr>
-            <w:rStyle w:val="Hyperlink"/>
-          </w:rPr>
-          <w:t>static</w:t>
-        </w:r>
-      </w:hyperlink>
-    </w:p>
-    <w:p>
-      <w:pPr>
-        <w:pStyle w:val="ListParagraph"/>
-        <w:numPr>
-          <w:ilvl w:val="0"/>
-          <w:numId w:val="29"/>
-        </w:numPr>
-      </w:pPr>
-      <w:r>
-        <w:t>Manually edit the URL to:</w:t>
-      </w:r>
-      <w:r>
-        <w:t xml:space="preserve"> </w:t>
-      </w:r>
-      <w:hyperlink r:id="rId107" w:history="1">
-        <w:r>
-          <w:rPr>
-            <w:rStyle w:val="Hyperlink"/>
-          </w:rPr>
-          <w:t>http://localhost:5041/quickgrid-interactive?sort=Name&amp;direction=asc&amp;page=3</w:t>
-        </w:r>
-      </w:hyperlink>
-    </w:p>
-    <w:p>
-      <w:pPr>
-        <w:pStyle w:val="ListParagraph"/>
-        <w:numPr>
-          <w:ilvl w:val="0"/>
-          <w:numId w:val="29"/>
-        </w:numPr>
-      </w:pPr>
-      <w:r>
-        <w:t>Press Enter and verify the grid state.</w:t>
-      </w:r>
-    </w:p>
-    <w:p>
-      <w:pPr>
-        <w:pStyle w:val="ListParagraph"/>
-        <w:numPr>
-          <w:ilvl w:val="0"/>
-          <w:numId w:val="29"/>
-        </w:numPr>
-      </w:pPr>
-      <w:r>
-        <w:t>Repeat the manual URL-entry operation multiple times.</w:t>
-      </w:r>
-    </w:p>
-    <w:p>
-      <w:pPr>
-        <w:rPr>
-          <w:b/>
-          <w:bCs/>
-        </w:rPr>
-      </w:pPr>
-      <w:r>
-        <w:rPr>
-          <w:b/>
-          <w:bCs/>
-        </w:rPr>
-        <w:t>Expected Result</w:t>
-      </w:r>
-    </w:p>
-    <w:tbl>
-      <w:tblPr>
-        <w:tblStyle w:val="TableGrid"/>
-        <w:tblW w:w="0" w:type="auto"/>
-        <w:tblLook w:val="04A0" w:firstRow="1" w:lastRow="0" w:firstColumn="1" w:lastColumn="0" w:noHBand="0" w:noVBand="1"/>
-      </w:tblPr>
-      <w:tblGrid>
-        <w:gridCol w:w="9350"/>
-      </w:tblGrid>
-      <w:tr>
-        <w:tc>
-          <w:tcPr>
-            <w:tcW w:w="9350" w:type="dxa"/>
-          </w:tcPr>
-          <w:p>
-            <w:r>
-              <w:t>http://localhost:5041/quickgrid-interactive?sort=Name&amp;direction=asc&amp;page=3</w:t>
-            </w:r>
-          </w:p>
-        </w:tc>
-      </w:tr>
-    </w:tbl>
-    <w:p>
-      <w:pPr>
-        <w:pStyle w:val="ListParagraph"/>
-        <w:numPr>
-          <w:ilvl w:val="0"/>
-          <w:numId w:val="30"/>
-        </w:numPr>
-      </w:pPr>
-      <w:r>
-        <w:t xml:space="preserve">The </w:t>
-      </w:r>
-      <w:proofErr w:type="gramStart"/>
-      <w:r>
-        <w:t>sort</w:t>
-      </w:r>
-      <w:proofErr w:type="gramEnd"/>
-      <w:r>
-        <w:t xml:space="preserve"> parameter remains Name.</w:t>
-      </w:r>
-    </w:p>
-    <w:p>
-      <w:pPr>
-        <w:pStyle w:val="ListParagraph"/>
-        <w:numPr>
-          <w:ilvl w:val="0"/>
-          <w:numId w:val="30"/>
-        </w:numPr>
-      </w:pPr>
-      <w:r>
-        <w:t>Page 3 is displayed.</w:t>
-      </w:r>
-    </w:p>
-    <w:p>
-      <w:pPr>
-        <w:pStyle w:val="ListParagraph"/>
-        <w:numPr>
-          <w:ilvl w:val="0"/>
-          <w:numId w:val="30"/>
-        </w:numPr>
-      </w:pPr>
-      <w:r>
-        <w:t>The grid is sorted by the Name column in ascending order.</w:t>
-      </w:r>
-    </w:p>
-    <w:p>
-      <w:pPr>
-        <w:rPr>
-          <w:b/>
-          <w:bCs/>
-        </w:rPr>
-      </w:pPr>
-      <w:r>
-        <w:rPr>
-          <w:b/>
-          <w:bCs/>
-        </w:rPr>
-        <w:t>Observed Result</w:t>
-      </w:r>
-    </w:p>
-    <w:p>
-      <w:pPr>
-        <w:pStyle w:val="ListParagraph"/>
-        <w:numPr>
-          <w:ilvl w:val="0"/>
-          <w:numId w:val="28"/>
-        </w:numPr>
-      </w:pPr>
-      <w:r>
-        <w:t>In most executions, the expected sort and paging state are restored correctly.</w:t>
-      </w:r>
-    </w:p>
-    <w:p>
-      <w:pPr>
-        <w:pStyle w:val="ListParagraph"/>
-        <w:numPr>
-          <w:ilvl w:val="0"/>
-          <w:numId w:val="28"/>
-        </w:numPr>
-      </w:pPr>
-      <w:r>
-        <w:t>However, intermittently, the URL changes to:</w:t>
-      </w:r>
-    </w:p>
-    <w:tbl>
-      <w:tblPr>
-        <w:tblStyle w:val="TableGrid"/>
-        <w:tblW w:w="0" w:type="auto"/>
-        <w:tblInd w:w="720" w:type="dxa"/>
-        <w:tblLook w:val="04A0" w:firstRow="1" w:lastRow="0" w:firstColumn="1" w:lastColumn="0" w:noHBand="0" w:noVBand="1"/>
-      </w:tblPr>
-      <w:tblGrid>
-        <w:gridCol w:w="8630"/>
-      </w:tblGrid>
-      <w:tr>
-        <w:tc>
-          <w:tcPr>
-            <w:tcW w:w="9350" w:type="dxa"/>
-          </w:tcPr>
-          <w:p>
-            <w:pPr>
-              <w:pStyle w:val="ListParagraph"/>
-              <w:ind w:left="0"/>
-            </w:pPr>
-            <w:r>
-              <w:t>http://localhost:5041/quickgrid-interactive?sort=name&amp;direction=asc&amp;page=3</w:t>
-            </w:r>
-          </w:p>
-        </w:tc>
-      </w:tr>
-    </w:tbl>
-    <w:p>
-      <w:pPr>
-        <w:pStyle w:val="ListParagraph"/>
-        <w:numPr>
-          <w:ilvl w:val="0"/>
-          <w:numId w:val="28"/>
-        </w:numPr>
-      </w:pPr>
-      <w:r>
-        <w:t xml:space="preserve">where the </w:t>
-      </w:r>
-      <w:proofErr w:type="gramStart"/>
-      <w:r>
-        <w:t>sort</w:t>
-      </w:r>
-      <w:proofErr w:type="gramEnd"/>
-      <w:r>
-        <w:t xml:space="preserve"> parameter value is normalized from:</w:t>
-      </w:r>
-    </w:p>
-    <w:p>
-      <w:pPr>
-        <w:pStyle w:val="ListParagraph"/>
-        <w:numPr>
-          <w:ilvl w:val="1"/>
-          <w:numId w:val="28"/>
-        </w:numPr>
-        <w:rPr>
-          <w:i/>
-          <w:iCs/>
-        </w:rPr>
-      </w:pPr>
-      <w:r>
-        <w:rPr>
-          <w:i/>
-          <w:iCs/>
-        </w:rPr>
+        <w:t>Evidence</w:t>
+      </w:r>
+    </w:p>
+    <w:p>
+      <w:pPr>
+        <w:ind w:left="360"/>
+      </w:pPr>
+      <w:r>
         <w:lastRenderedPageBreak/>
-        <w:t>Name</w:t>
-      </w:r>
-      <w:r>
-        <w:rPr>
-          <w:i/>
-          <w:iCs/>
-        </w:rPr>
-        <w:t xml:space="preserve"> </w:t>
-      </w:r>
-      <w:r>
-        <w:t>to</w:t>
-      </w:r>
-      <w:r>
-        <w:t xml:space="preserve"> </w:t>
-      </w:r>
-      <w:r>
-        <w:rPr>
-          <w:i/>
-          <w:iCs/>
-        </w:rPr>
-        <w:t>name</w:t>
-      </w:r>
-    </w:p>
-    <w:p>
-      <w:pPr>
-        <w:pStyle w:val="ListParagraph"/>
-        <w:numPr>
-          <w:ilvl w:val="0"/>
-          <w:numId w:val="28"/>
-        </w:numPr>
-      </w:pPr>
-      <w:r>
-        <w:t>After this occurs:</w:t>
-      </w:r>
-    </w:p>
-    <w:p>
-      <w:pPr>
-        <w:pStyle w:val="ListParagraph"/>
-        <w:numPr>
-          <w:ilvl w:val="1"/>
-          <w:numId w:val="28"/>
-        </w:numPr>
-      </w:pPr>
-      <w:r>
-        <w:t>Page navigation continues to function correctly.</w:t>
-      </w:r>
-    </w:p>
-    <w:p>
-      <w:pPr>
-        <w:pStyle w:val="ListParagraph"/>
-        <w:numPr>
-          <w:ilvl w:val="1"/>
-          <w:numId w:val="28"/>
-        </w:numPr>
-      </w:pPr>
-      <w:r>
-        <w:t xml:space="preserve">The grid does not reflect the expected </w:t>
-      </w:r>
-      <w:proofErr w:type="gramStart"/>
-      <w:r>
-        <w:t>sort</w:t>
-      </w:r>
-      <w:proofErr w:type="gramEnd"/>
-      <w:r>
-        <w:t xml:space="preserve"> state for the Name column.</w:t>
-      </w:r>
-    </w:p>
-    <w:p>
-      <w:pPr>
-        <w:rPr>
-          <w:b/>
-          <w:bCs/>
-        </w:rPr>
-      </w:pPr>
-      <w:r>
-        <w:rPr>
-          <w:b/>
-          <w:bCs/>
-        </w:rPr>
-        <w:t>Scope</w:t>
-      </w:r>
-    </w:p>
-    <w:p>
-      <w:r>
-        <w:t>The same behavior was observed:</w:t>
-      </w:r>
-    </w:p>
-    <w:p>
-      <w:pPr>
-        <w:pStyle w:val="ListParagraph"/>
-        <w:numPr>
-          <w:ilvl w:val="0"/>
-          <w:numId w:val="26"/>
-        </w:numPr>
-      </w:pPr>
-      <w:r>
-        <w:t>With the compatibility switch enabled.</w:t>
-      </w:r>
-    </w:p>
-    <w:p>
-      <w:pPr>
-        <w:pStyle w:val="ListParagraph"/>
-        <w:numPr>
-          <w:ilvl w:val="0"/>
-          <w:numId w:val="26"/>
-        </w:numPr>
-      </w:pPr>
-      <w:r>
-        <w:t>With the compatibility switch disabled.</w:t>
-      </w:r>
-    </w:p>
-    <w:p>
-      <w:pPr>
-        <w:pStyle w:val="ListParagraph"/>
-        <w:numPr>
-          <w:ilvl w:val="0"/>
-          <w:numId w:val="26"/>
-        </w:numPr>
-      </w:pPr>
-      <w:r>
-        <w:t>In development execution.</w:t>
-      </w:r>
-    </w:p>
-    <w:p>
-      <w:pPr>
-        <w:pStyle w:val="ListParagraph"/>
-        <w:numPr>
-          <w:ilvl w:val="0"/>
-          <w:numId w:val="26"/>
-        </w:numPr>
-      </w:pPr>
-      <w:r>
-        <w:t>In published output.</w:t>
-      </w:r>
-    </w:p>
-    <w:p>
-      <w:r>
-        <w:t>Therefore, the observation does not appear to be related to the compatibility switch itself.</w:t>
-      </w:r>
-    </w:p>
-    <w:p>
-      <w:r>
-        <w:rPr>
-          <w:b/>
-          <w:bCs/>
-        </w:rPr>
-        <w:t>Status:</w:t>
-      </w:r>
-      <w:r>
-        <w:t xml:space="preserve"> Intermittent Reproducible Observation</w:t>
-      </w:r>
-    </w:p>
-    <w:p>
-      <w:pPr>
-        <w:pStyle w:val="ListParagraph"/>
-        <w:numPr>
-          <w:ilvl w:val="0"/>
-          <w:numId w:val="25"/>
-        </w:numPr>
-      </w:pPr>
-      <w:r>
-        <w:t xml:space="preserve">The behavior can be reproduced through repeated manual URL-entry testing, but the exact trigger that causes the parameter normalization from Name to name has not yet been identified. Further investigation is required to determine whether the normalization is introduced by the application, routing infrastructure, or </w:t>
-      </w:r>
-      <w:proofErr w:type="spellStart"/>
-      <w:r>
-        <w:t>QuickGrid</w:t>
-      </w:r>
-      <w:proofErr w:type="spellEnd"/>
-      <w:r>
-        <w:t xml:space="preserve"> URL-state processing.</w:t>
-      </w:r>
-    </w:p>
-    <w:p>
-      <w:pPr>
-        <w:rPr>
-          <w:b/>
-          <w:bCs/>
-        </w:rPr>
-      </w:pPr>
-      <w:r>
-        <w:rPr>
-          <w:b/>
-          <w:bCs/>
-        </w:rPr>
-        <w:t>Evidence</w:t>
-      </w:r>
-    </w:p>
-    <w:p>
-      <w:r>
-        <w:t>Refer to the attached video evidence demonstrating the parameter normalization behavior during manual URL editing:</w:t>
+        <w:t>Refer to the attached video evidence demonstrating manual URL-editing validation and the behavior of case-mismatched sort values during testing.</w:t>
       </w:r>
     </w:p>
     <w:p>
@@ -15254,7 +14423,7 @@
       <w:r>
         <w:t xml:space="preserve">SSR: </w:t>
       </w:r>
-      <w:hyperlink r:id="rId108" w:history="1">
+      <w:hyperlink r:id="rId105" w:history="1">
         <w:r>
           <w:rPr>
             <w:rStyle w:val="Hyperlink"/>
@@ -15295,7 +14464,7 @@
       <w:r>
         <w:t xml:space="preserve">Server: </w:t>
       </w:r>
-      <w:hyperlink r:id="rId109" w:history="1">
+      <w:hyperlink r:id="rId106" w:history="1">
         <w:r>
           <w:rPr>
             <w:rStyle w:val="Hyperlink"/>
@@ -15327,6 +14496,7 @@
       </w:hyperlink>
     </w:p>
     <w:sectPr>
+      <w:headerReference w:type="default" r:id="rId107"/>
       <w:pgSz w:w="12240" w:h="15840"/>
       <w:pgMar w:top="1440" w:right="1440" w:bottom="1440" w:left="1440" w:header="720" w:footer="720" w:gutter="0"/>
       <w:cols w:space="720"/>
@@ -15336,6 +14506,74 @@
 </w:document>
 </file>
 
+<file path=word/endnotes.xml><?xml version="1.0" encoding="utf-8"?>
+<w:endnotes xmlns:wpc="http://schemas.microsoft.com/office/word/2010/wordprocessingCanvas" xmlns:cx="http://schemas.microsoft.com/office/drawing/2014/chartex" xmlns:cx1="http://schemas.microsoft.com/office/drawing/2015/9/8/chartex" xmlns:cx2="http://schemas.microsoft.com/office/drawing/2015/10/21/chartex" xmlns:cx3="http://schemas.microsoft.com/office/drawing/2016/5/9/chartex" xmlns:cx4="http://schemas.microsoft.com/office/drawing/2016/5/10/chartex" xmlns:cx5="http://schemas.microsoft.com/office/drawing/2016/5/11/chartex" xmlns:cx6="http://schemas.microsoft.com/office/drawing/2016/5/12/chartex" xmlns:cx7="http://schemas.microsoft.com/office/drawing/2016/5/13/chartex" xmlns:cx8="http://schemas.microsoft.com/office/drawing/2016/5/14/chartex" xmlns:mc="http://schemas.openxmlformats.org/markup-compatibility/2006" xmlns:aink="http://schemas.microsoft.com/office/drawing/2016/ink" xmlns:am3d="http://schemas.microsoft.com/office/drawing/2017/model3d" xmlns:o="urn:schemas-microsoft-com:office:office" xmlns:oel="http://schemas.microsoft.com/office/2019/extlst" xmlns:r="http://schemas.openxmlformats.org/officeDocument/2006/relationships" xmlns:m="http://schemas.openxmlformats.org/officeDocument/2006/math" xmlns:v="urn:schemas-microsoft-com:vml" xmlns:wp14="http://schemas.microsoft.com/office/word/2010/wordprocessingDrawing" xmlns:wp="http://schemas.openxmlformats.org/drawingml/2006/wordprocessingDrawing" xmlns:w10="urn:schemas-microsoft-com:office:word" xmlns:w="http://schemas.openxmlformats.org/wordprocessingml/2006/main" xmlns:w14="http://schemas.microsoft.com/office/word/2010/wordml" xmlns:w15="http://schemas.microsoft.com/office/word/2012/wordml" xmlns:w16cex="http://schemas.microsoft.com/office/word/2018/wordml/cex" xmlns:w16cid="http://schemas.microsoft.com/office/word/2016/wordml/cid" xmlns:w16="http://schemas.microsoft.com/office/word/2018/wordml" xmlns:w16du="http://schemas.microsoft.com/office/word/2023/wordml/word16du" xmlns:w16sdtdh="http://schemas.microsoft.com/office/word/2020/wordml/sdtdatahash" xmlns:w16sdtfl="http://schemas.microsoft.com/office/word/2024/wordml/sdtformatlock" xmlns:w16se="http://schemas.microsoft.com/office/word/2015/wordml/symex" xmlns:wpg="http://schemas.microsoft.com/office/word/2010/wordprocessingGroup" xmlns:wpi="http://schemas.microsoft.com/office/word/2010/wordprocessingInk" xmlns:wne="http://schemas.microsoft.com/office/word/2006/wordml" xmlns:wps="http://schemas.microsoft.com/office/word/2010/wordprocessingShape" mc:Ignorable="w14 w15 w16se w16cid w16 w16cex w16sdtdh w16sdtfl w16du wp14">
+  <w:endnote w:type="separator" w:id="-1">
+    <w:p>
+      <w:pPr>
+        <w:spacing w:after="0" w:line="240" w:lineRule="auto"/>
+      </w:pPr>
+      <w:r>
+        <w:separator/>
+      </w:r>
+    </w:p>
+  </w:endnote>
+  <w:endnote w:type="continuationSeparator" w:id="0">
+    <w:p>
+      <w:pPr>
+        <w:spacing w:after="0" w:line="240" w:lineRule="auto"/>
+      </w:pPr>
+      <w:r>
+        <w:continuationSeparator/>
+      </w:r>
+    </w:p>
+  </w:endnote>
+</w:endnotes>
+</file>
+
+<file path=word/footnotes.xml><?xml version="1.0" encoding="utf-8"?>
+<w:footnotes xmlns:wpc="http://schemas.microsoft.com/office/word/2010/wordprocessingCanvas" xmlns:cx="http://schemas.microsoft.com/office/drawing/2014/chartex" xmlns:cx1="http://schemas.microsoft.com/office/drawing/2015/9/8/chartex" xmlns:cx2="http://schemas.microsoft.com/office/drawing/2015/10/21/chartex" xmlns:cx3="http://schemas.microsoft.com/office/drawing/2016/5/9/chartex" xmlns:cx4="http://schemas.microsoft.com/office/drawing/2016/5/10/chartex" xmlns:cx5="http://schemas.microsoft.com/office/drawing/2016/5/11/chartex" xmlns:cx6="http://schemas.microsoft.com/office/drawing/2016/5/12/chartex" xmlns:cx7="http://schemas.microsoft.com/office/drawing/2016/5/13/chartex" xmlns:cx8="http://schemas.microsoft.com/office/drawing/2016/5/14/chartex" xmlns:mc="http://schemas.openxmlformats.org/markup-compatibility/2006" xmlns:aink="http://schemas.microsoft.com/office/drawing/2016/ink" xmlns:am3d="http://schemas.microsoft.com/office/drawing/2017/model3d" xmlns:o="urn:schemas-microsoft-com:office:office" xmlns:oel="http://schemas.microsoft.com/office/2019/extlst" xmlns:r="http://schemas.openxmlformats.org/officeDocument/2006/relationships" xmlns:m="http://schemas.openxmlformats.org/officeDocument/2006/math" xmlns:v="urn:schemas-microsoft-com:vml" xmlns:wp14="http://schemas.microsoft.com/office/word/2010/wordprocessingDrawing" xmlns:wp="http://schemas.openxmlformats.org/drawingml/2006/wordprocessingDrawing" xmlns:w10="urn:schemas-microsoft-com:office:word" xmlns:w="http://schemas.openxmlformats.org/wordprocessingml/2006/main" xmlns:w14="http://schemas.microsoft.com/office/word/2010/wordml" xmlns:w15="http://schemas.microsoft.com/office/word/2012/wordml" xmlns:w16cex="http://schemas.microsoft.com/office/word/2018/wordml/cex" xmlns:w16cid="http://schemas.microsoft.com/office/word/2016/wordml/cid" xmlns:w16="http://schemas.microsoft.com/office/word/2018/wordml" xmlns:w16du="http://schemas.microsoft.com/office/word/2023/wordml/word16du" xmlns:w16sdtdh="http://schemas.microsoft.com/office/word/2020/wordml/sdtdatahash" xmlns:w16sdtfl="http://schemas.microsoft.com/office/word/2024/wordml/sdtformatlock" xmlns:w16se="http://schemas.microsoft.com/office/word/2015/wordml/symex" xmlns:wpg="http://schemas.microsoft.com/office/word/2010/wordprocessingGroup" xmlns:wpi="http://schemas.microsoft.com/office/word/2010/wordprocessingInk" xmlns:wne="http://schemas.microsoft.com/office/word/2006/wordml" xmlns:wps="http://schemas.microsoft.com/office/word/2010/wordprocessingShape" mc:Ignorable="w14 w15 w16se w16cid w16 w16cex w16sdtdh w16sdtfl w16du wp14">
+  <w:footnote w:type="separator" w:id="-1">
+    <w:p>
+      <w:pPr>
+        <w:spacing w:after="0" w:line="240" w:lineRule="auto"/>
+      </w:pPr>
+      <w:r>
+        <w:separator/>
+      </w:r>
+    </w:p>
+  </w:footnote>
+  <w:footnote w:type="continuationSeparator" w:id="0">
+    <w:p>
+      <w:pPr>
+        <w:spacing w:after="0" w:line="240" w:lineRule="auto"/>
+      </w:pPr>
+      <w:r>
+        <w:continuationSeparator/>
+      </w:r>
+    </w:p>
+  </w:footnote>
+</w:footnotes>
+</file>
+
+<file path=word/header1.xml><?xml version="1.0" encoding="utf-8"?>
+<w:hdr xmlns:wpc="http://schemas.microsoft.com/office/word/2010/wordprocessingCanvas" xmlns:cx="http://schemas.microsoft.com/office/drawing/2014/chartex" xmlns:cx1="http://schemas.microsoft.com/office/drawing/2015/9/8/chartex" xmlns:cx2="http://schemas.microsoft.com/office/drawing/2015/10/21/chartex" xmlns:cx3="http://schemas.microsoft.com/office/drawing/2016/5/9/chartex" xmlns:cx4="http://schemas.microsoft.com/office/drawing/2016/5/10/chartex" xmlns:cx5="http://schemas.microsoft.com/office/drawing/2016/5/11/chartex" xmlns:cx6="http://schemas.microsoft.com/office/drawing/2016/5/12/chartex" xmlns:cx7="http://schemas.microsoft.com/office/drawing/2016/5/13/chartex" xmlns:cx8="http://schemas.microsoft.com/office/drawing/2016/5/14/chartex" xmlns:mc="http://schemas.openxmlformats.org/markup-compatibility/2006" xmlns:aink="http://schemas.microsoft.com/office/drawing/2016/ink" xmlns:am3d="http://schemas.microsoft.com/office/drawing/2017/model3d" xmlns:o="urn:schemas-microsoft-com:office:office" xmlns:oel="http://schemas.microsoft.com/office/2019/extlst" xmlns:r="http://schemas.openxmlformats.org/officeDocument/2006/relationships" xmlns:m="http://schemas.openxmlformats.org/officeDocument/2006/math" xmlns:v="urn:schemas-microsoft-com:vml" xmlns:wp14="http://schemas.microsoft.com/office/word/2010/wordprocessingDrawing" xmlns:wp="http://schemas.openxmlformats.org/drawingml/2006/wordprocessingDrawing" xmlns:w10="urn:schemas-microsoft-com:office:word" xmlns:w="http://schemas.openxmlformats.org/wordprocessingml/2006/main" xmlns:w14="http://schemas.microsoft.com/office/word/2010/wordml" xmlns:w15="http://schemas.microsoft.com/office/word/2012/wordml" xmlns:w16cex="http://schemas.microsoft.com/office/word/2018/wordml/cex" xmlns:w16cid="http://schemas.microsoft.com/office/word/2016/wordml/cid" xmlns:w16="http://schemas.microsoft.com/office/word/2018/wordml" xmlns:w16du="http://schemas.microsoft.com/office/word/2023/wordml/word16du" xmlns:w16sdtdh="http://schemas.microsoft.com/office/word/2020/wordml/sdtdatahash" xmlns:w16sdtfl="http://schemas.microsoft.com/office/word/2024/wordml/sdtformatlock" xmlns:w16se="http://schemas.microsoft.com/office/word/2015/wordml/symex" xmlns:wpg="http://schemas.microsoft.com/office/word/2010/wordprocessingGroup" xmlns:wpi="http://schemas.microsoft.com/office/word/2010/wordprocessingInk" xmlns:wne="http://schemas.microsoft.com/office/word/2006/wordml" xmlns:wps="http://schemas.microsoft.com/office/word/2010/wordprocessingShape" mc:Ignorable="w14 w15 w16se w16cid w16 w16cex w16sdtdh w16sdtfl w16du wp14">
+  <w:p>
+    <w:pPr>
+      <w:pStyle w:val="Header"/>
+      <w:tabs>
+        <w:tab w:val="clear" w:pos="4680"/>
+        <w:tab w:val="clear" w:pos="9360"/>
+        <w:tab w:val="left" w:pos="7778"/>
+      </w:tabs>
+    </w:pPr>
+    <w:r>
+      <w:tab/>
+    </w:r>
+  </w:p>
+</w:hdr>
+</file>
+
 <file path=word/numbering.xml><?xml version="1.0" encoding="utf-8"?>
 <w:numbering xmlns:wpc="http://schemas.microsoft.com/office/word/2010/wordprocessingCanvas" xmlns:cx="http://schemas.microsoft.com/office/drawing/2014/chartex" xmlns:cx1="http://schemas.microsoft.com/office/drawing/2015/9/8/chartex" xmlns:cx2="http://schemas.microsoft.com/office/drawing/2015/10/21/chartex" xmlns:cx3="http://schemas.microsoft.com/office/drawing/2016/5/9/chartex" xmlns:cx4="http://schemas.microsoft.com/office/drawing/2016/5/10/chartex" xmlns:cx5="http://schemas.microsoft.com/office/drawing/2016/5/11/chartex" xmlns:cx6="http://schemas.microsoft.com/office/drawing/2016/5/12/chartex" xmlns:cx7="http://schemas.microsoft.com/office/drawing/2016/5/13/chartex" xmlns:cx8="http://schemas.microsoft.com/office/drawing/2016/5/14/chartex" xmlns:mc="http://schemas.openxmlformats.org/markup-compatibility/2006" xmlns:aink="http://schemas.microsoft.com/office/drawing/2016/ink" xmlns:am3d="http://schemas.microsoft.com/office/drawing/2017/model3d" xmlns:o="urn:schemas-microsoft-com:office:office" xmlns:oel="http://schemas.microsoft.com/office/2019/extlst" xmlns:r="http://schemas.openxmlformats.org/officeDocument/2006/relationships" xmlns:m="http://schemas.openxmlformats.org/officeDocument/2006/math" xmlns:v="urn:schemas-microsoft-com:vml" xmlns:wp14="http://schemas.microsoft.com/office/word/2010/wordprocessingDrawing" xmlns:wp="http://schemas.openxmlformats.org/drawingml/2006/wordprocessingDrawing" xmlns:w10="urn:schemas-microsoft-com:office:word" xmlns:w="http://schemas.openxmlformats.org/wordprocessingml/2006/main" xmlns:w14="http://schemas.microsoft.com/office/word/2010/wordml" xmlns:w15="http://schemas.microsoft.com/office/word/2012/wordml" xmlns:w16cex="http://schemas.microsoft.com/office/word/2018/wordml/cex" xmlns:w16cid="http://schemas.microsoft.com/office/word/2016/wordml/cid" xmlns:w16="http://schemas.microsoft.com/office/word/2018/wordml" xmlns:w16du="http://schemas.microsoft.com/office/word/2023/wordml/word16du" xmlns:w16sdtdh="http://schemas.microsoft.com/office/word/2020/wordml/sdtdatahash" xmlns:w16sdtfl="http://schemas.microsoft.com/office/word/2024/wordml/sdtformatlock" xmlns:w16se="http://schemas.microsoft.com/office/word/2015/wordml/symex" xmlns:wpg="http://schemas.microsoft.com/office/word/2010/wordprocessingGroup" xmlns:wpi="http://schemas.microsoft.com/office/word/2010/wordprocessingInk" xmlns:wne="http://schemas.microsoft.com/office/word/2006/wordml" xmlns:wps="http://schemas.microsoft.com/office/word/2010/wordprocessingShape" mc:Ignorable="w14 w15 w16se w16cid w16 w16cex w16sdtdh w16sdtfl w16du wp14">
   <w:abstractNum w:abstractNumId="0" w15:restartNumberingAfterBreak="0">
@@ -16026,6 +15264,155 @@
     </w:lvl>
   </w:abstractNum>
   <w:abstractNum w:abstractNumId="6" w15:restartNumberingAfterBreak="0">
+    <w:nsid w:val="0E127264"/>
+    <w:multiLevelType w:val="multilevel"/>
+    <w:tmpl w:val="8B720D02"/>
+    <w:lvl w:ilvl="0">
+      <w:start w:val="1"/>
+      <w:numFmt w:val="bullet"/>
+      <w:lvlText w:val=""/>
+      <w:lvlJc w:val="left"/>
+      <w:pPr>
+        <w:tabs>
+          <w:tab w:val="num" w:pos="720"/>
+        </w:tabs>
+        <w:ind w:left="720" w:hanging="360"/>
+      </w:pPr>
+      <w:rPr>
+        <w:rFonts w:ascii="Symbol" w:hAnsi="Symbol" w:hint="default"/>
+        <w:sz w:val="20"/>
+      </w:rPr>
+    </w:lvl>
+    <w:lvl w:ilvl="1" w:tentative="1">
+      <w:start w:val="1"/>
+      <w:numFmt w:val="bullet"/>
+      <w:lvlText w:val="o"/>
+      <w:lvlJc w:val="left"/>
+      <w:pPr>
+        <w:tabs>
+          <w:tab w:val="num" w:pos="1440"/>
+        </w:tabs>
+        <w:ind w:left="1440" w:hanging="360"/>
+      </w:pPr>
+      <w:rPr>
+        <w:rFonts w:ascii="Courier New" w:hAnsi="Courier New" w:hint="default"/>
+        <w:sz w:val="20"/>
+      </w:rPr>
+    </w:lvl>
+    <w:lvl w:ilvl="2" w:tentative="1">
+      <w:start w:val="1"/>
+      <w:numFmt w:val="bullet"/>
+      <w:lvlText w:val=""/>
+      <w:lvlJc w:val="left"/>
+      <w:pPr>
+        <w:tabs>
+          <w:tab w:val="num" w:pos="2160"/>
+        </w:tabs>
+        <w:ind w:left="2160" w:hanging="360"/>
+      </w:pPr>
+      <w:rPr>
+        <w:rFonts w:ascii="Wingdings" w:hAnsi="Wingdings" w:hint="default"/>
+        <w:sz w:val="20"/>
+      </w:rPr>
+    </w:lvl>
+    <w:lvl w:ilvl="3" w:tentative="1">
+      <w:start w:val="1"/>
+      <w:numFmt w:val="bullet"/>
+      <w:lvlText w:val=""/>
+      <w:lvlJc w:val="left"/>
+      <w:pPr>
+        <w:tabs>
+          <w:tab w:val="num" w:pos="2880"/>
+        </w:tabs>
+        <w:ind w:left="2880" w:hanging="360"/>
+      </w:pPr>
+      <w:rPr>
+        <w:rFonts w:ascii="Wingdings" w:hAnsi="Wingdings" w:hint="default"/>
+        <w:sz w:val="20"/>
+      </w:rPr>
+    </w:lvl>
+    <w:lvl w:ilvl="4" w:tentative="1">
+      <w:start w:val="1"/>
+      <w:numFmt w:val="bullet"/>
+      <w:lvlText w:val=""/>
+      <w:lvlJc w:val="left"/>
+      <w:pPr>
+        <w:tabs>
+          <w:tab w:val="num" w:pos="3600"/>
+        </w:tabs>
+        <w:ind w:left="3600" w:hanging="360"/>
+      </w:pPr>
+      <w:rPr>
+        <w:rFonts w:ascii="Wingdings" w:hAnsi="Wingdings" w:hint="default"/>
+        <w:sz w:val="20"/>
+      </w:rPr>
+    </w:lvl>
+    <w:lvl w:ilvl="5" w:tentative="1">
+      <w:start w:val="1"/>
+      <w:numFmt w:val="bullet"/>
+      <w:lvlText w:val=""/>
+      <w:lvlJc w:val="left"/>
+      <w:pPr>
+        <w:tabs>
+          <w:tab w:val="num" w:pos="4320"/>
+        </w:tabs>
+        <w:ind w:left="4320" w:hanging="360"/>
+      </w:pPr>
+      <w:rPr>
+        <w:rFonts w:ascii="Wingdings" w:hAnsi="Wingdings" w:hint="default"/>
+        <w:sz w:val="20"/>
+      </w:rPr>
+    </w:lvl>
+    <w:lvl w:ilvl="6" w:tentative="1">
+      <w:start w:val="1"/>
+      <w:numFmt w:val="bullet"/>
+      <w:lvlText w:val=""/>
+      <w:lvlJc w:val="left"/>
+      <w:pPr>
+        <w:tabs>
+          <w:tab w:val="num" w:pos="5040"/>
+        </w:tabs>
+        <w:ind w:left="5040" w:hanging="360"/>
+      </w:pPr>
+      <w:rPr>
+        <w:rFonts w:ascii="Wingdings" w:hAnsi="Wingdings" w:hint="default"/>
+        <w:sz w:val="20"/>
+      </w:rPr>
+    </w:lvl>
+    <w:lvl w:ilvl="7" w:tentative="1">
+      <w:start w:val="1"/>
+      <w:numFmt w:val="bullet"/>
+      <w:lvlText w:val=""/>
+      <w:lvlJc w:val="left"/>
+      <w:pPr>
+        <w:tabs>
+          <w:tab w:val="num" w:pos="5760"/>
+        </w:tabs>
+        <w:ind w:left="5760" w:hanging="360"/>
+      </w:pPr>
+      <w:rPr>
+        <w:rFonts w:ascii="Wingdings" w:hAnsi="Wingdings" w:hint="default"/>
+        <w:sz w:val="20"/>
+      </w:rPr>
+    </w:lvl>
+    <w:lvl w:ilvl="8" w:tentative="1">
+      <w:start w:val="1"/>
+      <w:numFmt w:val="bullet"/>
+      <w:lvlText w:val=""/>
+      <w:lvlJc w:val="left"/>
+      <w:pPr>
+        <w:tabs>
+          <w:tab w:val="num" w:pos="6480"/>
+        </w:tabs>
+        <w:ind w:left="6480" w:hanging="360"/>
+      </w:pPr>
+      <w:rPr>
+        <w:rFonts w:ascii="Wingdings" w:hAnsi="Wingdings" w:hint="default"/>
+        <w:sz w:val="20"/>
+      </w:rPr>
+    </w:lvl>
+  </w:abstractNum>
+  <w:abstractNum w:abstractNumId="7" w15:restartNumberingAfterBreak="0">
     <w:nsid w:val="11F5251B"/>
     <w:multiLevelType w:val="multilevel"/>
     <w:tmpl w:val="4C50293E"/>
@@ -16174,7 +15561,7 @@
       </w:rPr>
     </w:lvl>
   </w:abstractNum>
-  <w:abstractNum w:abstractNumId="7" w15:restartNumberingAfterBreak="0">
+  <w:abstractNum w:abstractNumId="8" w15:restartNumberingAfterBreak="0">
     <w:nsid w:val="12835EA6"/>
     <w:multiLevelType w:val="hybridMultilevel"/>
     <w:tmpl w:val="A8EC0CB6"/>
@@ -16260,7 +15647,7 @@
       </w:pPr>
     </w:lvl>
   </w:abstractNum>
-  <w:abstractNum w:abstractNumId="8" w15:restartNumberingAfterBreak="0">
+  <w:abstractNum w:abstractNumId="9" w15:restartNumberingAfterBreak="0">
     <w:nsid w:val="13F4272F"/>
     <w:multiLevelType w:val="hybridMultilevel"/>
     <w:tmpl w:val="FA4606E4"/>
@@ -16373,7 +15760,7 @@
       </w:rPr>
     </w:lvl>
   </w:abstractNum>
-  <w:abstractNum w:abstractNumId="9" w15:restartNumberingAfterBreak="0">
+  <w:abstractNum w:abstractNumId="10" w15:restartNumberingAfterBreak="0">
     <w:nsid w:val="1CF64C4A"/>
     <w:multiLevelType w:val="multilevel"/>
     <w:tmpl w:val="E22E85B8"/>
@@ -16522,7 +15909,7 @@
       </w:rPr>
     </w:lvl>
   </w:abstractNum>
-  <w:abstractNum w:abstractNumId="10" w15:restartNumberingAfterBreak="0">
+  <w:abstractNum w:abstractNumId="11" w15:restartNumberingAfterBreak="0">
     <w:nsid w:val="20AC1026"/>
     <w:multiLevelType w:val="hybridMultilevel"/>
     <w:tmpl w:val="5DFE33AC"/>
@@ -16635,7 +16022,7 @@
       </w:rPr>
     </w:lvl>
   </w:abstractNum>
-  <w:abstractNum w:abstractNumId="11" w15:restartNumberingAfterBreak="0">
+  <w:abstractNum w:abstractNumId="12" w15:restartNumberingAfterBreak="0">
     <w:nsid w:val="22F42792"/>
     <w:multiLevelType w:val="multilevel"/>
     <w:tmpl w:val="B202A47A"/>
@@ -16784,7 +16171,7 @@
       </w:rPr>
     </w:lvl>
   </w:abstractNum>
-  <w:abstractNum w:abstractNumId="12" w15:restartNumberingAfterBreak="0">
+  <w:abstractNum w:abstractNumId="13" w15:restartNumberingAfterBreak="0">
     <w:nsid w:val="257B24D8"/>
     <w:multiLevelType w:val="hybridMultilevel"/>
     <w:tmpl w:val="77709DE2"/>
@@ -16897,7 +16284,120 @@
       </w:rPr>
     </w:lvl>
   </w:abstractNum>
-  <w:abstractNum w:abstractNumId="13" w15:restartNumberingAfterBreak="0">
+  <w:abstractNum w:abstractNumId="14" w15:restartNumberingAfterBreak="0">
+    <w:nsid w:val="2EE41A36"/>
+    <w:multiLevelType w:val="hybridMultilevel"/>
+    <w:tmpl w:val="6AD01DAC"/>
+    <w:lvl w:ilvl="0" w:tplc="04090001">
+      <w:start w:val="1"/>
+      <w:numFmt w:val="bullet"/>
+      <w:lvlText w:val=""/>
+      <w:lvlJc w:val="left"/>
+      <w:pPr>
+        <w:ind w:left="1080" w:hanging="360"/>
+      </w:pPr>
+      <w:rPr>
+        <w:rFonts w:ascii="Symbol" w:hAnsi="Symbol" w:hint="default"/>
+      </w:rPr>
+    </w:lvl>
+    <w:lvl w:ilvl="1" w:tplc="04090003" w:tentative="1">
+      <w:start w:val="1"/>
+      <w:numFmt w:val="bullet"/>
+      <w:lvlText w:val="o"/>
+      <w:lvlJc w:val="left"/>
+      <w:pPr>
+        <w:ind w:left="1800" w:hanging="360"/>
+      </w:pPr>
+      <w:rPr>
+        <w:rFonts w:ascii="Courier New" w:hAnsi="Courier New" w:cs="Courier New" w:hint="default"/>
+      </w:rPr>
+    </w:lvl>
+    <w:lvl w:ilvl="2" w:tplc="04090005" w:tentative="1">
+      <w:start w:val="1"/>
+      <w:numFmt w:val="bullet"/>
+      <w:lvlText w:val=""/>
+      <w:lvlJc w:val="left"/>
+      <w:pPr>
+        <w:ind w:left="2520" w:hanging="360"/>
+      </w:pPr>
+      <w:rPr>
+        <w:rFonts w:ascii="Wingdings" w:hAnsi="Wingdings" w:hint="default"/>
+      </w:rPr>
+    </w:lvl>
+    <w:lvl w:ilvl="3" w:tplc="04090001" w:tentative="1">
+      <w:start w:val="1"/>
+      <w:numFmt w:val="bullet"/>
+      <w:lvlText w:val=""/>
+      <w:lvlJc w:val="left"/>
+      <w:pPr>
+        <w:ind w:left="3240" w:hanging="360"/>
+      </w:pPr>
+      <w:rPr>
+        <w:rFonts w:ascii="Symbol" w:hAnsi="Symbol" w:hint="default"/>
+      </w:rPr>
+    </w:lvl>
+    <w:lvl w:ilvl="4" w:tplc="04090003" w:tentative="1">
+      <w:start w:val="1"/>
+      <w:numFmt w:val="bullet"/>
+      <w:lvlText w:val="o"/>
+      <w:lvlJc w:val="left"/>
+      <w:pPr>
+        <w:ind w:left="3960" w:hanging="360"/>
+      </w:pPr>
+      <w:rPr>
+        <w:rFonts w:ascii="Courier New" w:hAnsi="Courier New" w:cs="Courier New" w:hint="default"/>
+      </w:rPr>
+    </w:lvl>
+    <w:lvl w:ilvl="5" w:tplc="04090005" w:tentative="1">
+      <w:start w:val="1"/>
+      <w:numFmt w:val="bullet"/>
+      <w:lvlText w:val=""/>
+      <w:lvlJc w:val="left"/>
+      <w:pPr>
+        <w:ind w:left="4680" w:hanging="360"/>
+      </w:pPr>
+      <w:rPr>
+        <w:rFonts w:ascii="Wingdings" w:hAnsi="Wingdings" w:hint="default"/>
+      </w:rPr>
+    </w:lvl>
+    <w:lvl w:ilvl="6" w:tplc="04090001" w:tentative="1">
+      <w:start w:val="1"/>
+      <w:numFmt w:val="bullet"/>
+      <w:lvlText w:val=""/>
+      <w:lvlJc w:val="left"/>
+      <w:pPr>
+        <w:ind w:left="5400" w:hanging="360"/>
+      </w:pPr>
+      <w:rPr>
+        <w:rFonts w:ascii="Symbol" w:hAnsi="Symbol" w:hint="default"/>
+      </w:rPr>
+    </w:lvl>
+    <w:lvl w:ilvl="7" w:tplc="04090003" w:tentative="1">
+      <w:start w:val="1"/>
+      <w:numFmt w:val="bullet"/>
+      <w:lvlText w:val="o"/>
+      <w:lvlJc w:val="left"/>
+      <w:pPr>
+        <w:ind w:left="6120" w:hanging="360"/>
+      </w:pPr>
+      <w:rPr>
+        <w:rFonts w:ascii="Courier New" w:hAnsi="Courier New" w:cs="Courier New" w:hint="default"/>
+      </w:rPr>
+    </w:lvl>
+    <w:lvl w:ilvl="8" w:tplc="04090005" w:tentative="1">
+      <w:start w:val="1"/>
+      <w:numFmt w:val="bullet"/>
+      <w:lvlText w:val=""/>
+      <w:lvlJc w:val="left"/>
+      <w:pPr>
+        <w:ind w:left="6840" w:hanging="360"/>
+      </w:pPr>
+      <w:rPr>
+        <w:rFonts w:ascii="Wingdings" w:hAnsi="Wingdings" w:hint="default"/>
+      </w:rPr>
+    </w:lvl>
+  </w:abstractNum>
+  <w:abstractNum w:abstractNumId="15" w15:restartNumberingAfterBreak="0">
     <w:nsid w:val="353C7B08"/>
     <w:multiLevelType w:val="hybridMultilevel"/>
     <w:tmpl w:val="82022DAE"/>
@@ -17010,7 +16510,156 @@
       </w:rPr>
     </w:lvl>
   </w:abstractNum>
-  <w:abstractNum w:abstractNumId="14" w15:restartNumberingAfterBreak="0">
+  <w:abstractNum w:abstractNumId="16" w15:restartNumberingAfterBreak="0">
+    <w:nsid w:val="3D1A4DAF"/>
+    <w:multiLevelType w:val="multilevel"/>
+    <w:tmpl w:val="E0AEFA44"/>
+    <w:lvl w:ilvl="0">
+      <w:start w:val="1"/>
+      <w:numFmt w:val="bullet"/>
+      <w:lvlText w:val=""/>
+      <w:lvlJc w:val="left"/>
+      <w:pPr>
+        <w:tabs>
+          <w:tab w:val="num" w:pos="720"/>
+        </w:tabs>
+        <w:ind w:left="720" w:hanging="360"/>
+      </w:pPr>
+      <w:rPr>
+        <w:rFonts w:ascii="Symbol" w:hAnsi="Symbol" w:hint="default"/>
+        <w:sz w:val="20"/>
+      </w:rPr>
+    </w:lvl>
+    <w:lvl w:ilvl="1" w:tentative="1">
+      <w:start w:val="1"/>
+      <w:numFmt w:val="bullet"/>
+      <w:lvlText w:val="o"/>
+      <w:lvlJc w:val="left"/>
+      <w:pPr>
+        <w:tabs>
+          <w:tab w:val="num" w:pos="1440"/>
+        </w:tabs>
+        <w:ind w:left="1440" w:hanging="360"/>
+      </w:pPr>
+      <w:rPr>
+        <w:rFonts w:ascii="Courier New" w:hAnsi="Courier New" w:hint="default"/>
+        <w:sz w:val="20"/>
+      </w:rPr>
+    </w:lvl>
+    <w:lvl w:ilvl="2" w:tentative="1">
+      <w:start w:val="1"/>
+      <w:numFmt w:val="bullet"/>
+      <w:lvlText w:val=""/>
+      <w:lvlJc w:val="left"/>
+      <w:pPr>
+        <w:tabs>
+          <w:tab w:val="num" w:pos="2160"/>
+        </w:tabs>
+        <w:ind w:left="2160" w:hanging="360"/>
+      </w:pPr>
+      <w:rPr>
+        <w:rFonts w:ascii="Wingdings" w:hAnsi="Wingdings" w:hint="default"/>
+        <w:sz w:val="20"/>
+      </w:rPr>
+    </w:lvl>
+    <w:lvl w:ilvl="3" w:tentative="1">
+      <w:start w:val="1"/>
+      <w:numFmt w:val="bullet"/>
+      <w:lvlText w:val=""/>
+      <w:lvlJc w:val="left"/>
+      <w:pPr>
+        <w:tabs>
+          <w:tab w:val="num" w:pos="2880"/>
+        </w:tabs>
+        <w:ind w:left="2880" w:hanging="360"/>
+      </w:pPr>
+      <w:rPr>
+        <w:rFonts w:ascii="Wingdings" w:hAnsi="Wingdings" w:hint="default"/>
+        <w:sz w:val="20"/>
+      </w:rPr>
+    </w:lvl>
+    <w:lvl w:ilvl="4" w:tentative="1">
+      <w:start w:val="1"/>
+      <w:numFmt w:val="bullet"/>
+      <w:lvlText w:val=""/>
+      <w:lvlJc w:val="left"/>
+      <w:pPr>
+        <w:tabs>
+          <w:tab w:val="num" w:pos="3600"/>
+        </w:tabs>
+        <w:ind w:left="3600" w:hanging="360"/>
+      </w:pPr>
+      <w:rPr>
+        <w:rFonts w:ascii="Wingdings" w:hAnsi="Wingdings" w:hint="default"/>
+        <w:sz w:val="20"/>
+      </w:rPr>
+    </w:lvl>
+    <w:lvl w:ilvl="5" w:tentative="1">
+      <w:start w:val="1"/>
+      <w:numFmt w:val="bullet"/>
+      <w:lvlText w:val=""/>
+      <w:lvlJc w:val="left"/>
+      <w:pPr>
+        <w:tabs>
+          <w:tab w:val="num" w:pos="4320"/>
+        </w:tabs>
+        <w:ind w:left="4320" w:hanging="360"/>
+      </w:pPr>
+      <w:rPr>
+        <w:rFonts w:ascii="Wingdings" w:hAnsi="Wingdings" w:hint="default"/>
+        <w:sz w:val="20"/>
+      </w:rPr>
+    </w:lvl>
+    <w:lvl w:ilvl="6" w:tentative="1">
+      <w:start w:val="1"/>
+      <w:numFmt w:val="bullet"/>
+      <w:lvlText w:val=""/>
+      <w:lvlJc w:val="left"/>
+      <w:pPr>
+        <w:tabs>
+          <w:tab w:val="num" w:pos="5040"/>
+        </w:tabs>
+        <w:ind w:left="5040" w:hanging="360"/>
+      </w:pPr>
+      <w:rPr>
+        <w:rFonts w:ascii="Wingdings" w:hAnsi="Wingdings" w:hint="default"/>
+        <w:sz w:val="20"/>
+      </w:rPr>
+    </w:lvl>
+    <w:lvl w:ilvl="7" w:tentative="1">
+      <w:start w:val="1"/>
+      <w:numFmt w:val="bullet"/>
+      <w:lvlText w:val=""/>
+      <w:lvlJc w:val="left"/>
+      <w:pPr>
+        <w:tabs>
+          <w:tab w:val="num" w:pos="5760"/>
+        </w:tabs>
+        <w:ind w:left="5760" w:hanging="360"/>
+      </w:pPr>
+      <w:rPr>
+        <w:rFonts w:ascii="Wingdings" w:hAnsi="Wingdings" w:hint="default"/>
+        <w:sz w:val="20"/>
+      </w:rPr>
+    </w:lvl>
+    <w:lvl w:ilvl="8" w:tentative="1">
+      <w:start w:val="1"/>
+      <w:numFmt w:val="bullet"/>
+      <w:lvlText w:val=""/>
+      <w:lvlJc w:val="left"/>
+      <w:pPr>
+        <w:tabs>
+          <w:tab w:val="num" w:pos="6480"/>
+        </w:tabs>
+        <w:ind w:left="6480" w:hanging="360"/>
+      </w:pPr>
+      <w:rPr>
+        <w:rFonts w:ascii="Wingdings" w:hAnsi="Wingdings" w:hint="default"/>
+        <w:sz w:val="20"/>
+      </w:rPr>
+    </w:lvl>
+  </w:abstractNum>
+  <w:abstractNum w:abstractNumId="17" w15:restartNumberingAfterBreak="0">
     <w:nsid w:val="461F54BD"/>
     <w:multiLevelType w:val="hybridMultilevel"/>
     <w:tmpl w:val="2F58B598"/>
@@ -17123,7 +16772,7 @@
       </w:rPr>
     </w:lvl>
   </w:abstractNum>
-  <w:abstractNum w:abstractNumId="15" w15:restartNumberingAfterBreak="0">
+  <w:abstractNum w:abstractNumId="18" w15:restartNumberingAfterBreak="0">
     <w:nsid w:val="4FE555BB"/>
     <w:multiLevelType w:val="hybridMultilevel"/>
     <w:tmpl w:val="776CEBAA"/>
@@ -17236,7 +16885,7 @@
       </w:rPr>
     </w:lvl>
   </w:abstractNum>
-  <w:abstractNum w:abstractNumId="16" w15:restartNumberingAfterBreak="0">
+  <w:abstractNum w:abstractNumId="19" w15:restartNumberingAfterBreak="0">
     <w:nsid w:val="50C902A0"/>
     <w:multiLevelType w:val="hybridMultilevel"/>
     <w:tmpl w:val="B86452AE"/>
@@ -17349,7 +16998,7 @@
       </w:rPr>
     </w:lvl>
   </w:abstractNum>
-  <w:abstractNum w:abstractNumId="17" w15:restartNumberingAfterBreak="0">
+  <w:abstractNum w:abstractNumId="20" w15:restartNumberingAfterBreak="0">
     <w:nsid w:val="5C340E0F"/>
     <w:multiLevelType w:val="hybridMultilevel"/>
     <w:tmpl w:val="2146E812"/>
@@ -17462,7 +17111,7 @@
       </w:rPr>
     </w:lvl>
   </w:abstractNum>
-  <w:abstractNum w:abstractNumId="18" w15:restartNumberingAfterBreak="0">
+  <w:abstractNum w:abstractNumId="21" w15:restartNumberingAfterBreak="0">
     <w:nsid w:val="5C376BCE"/>
     <w:multiLevelType w:val="hybridMultilevel"/>
     <w:tmpl w:val="3020A4D0"/>
@@ -17575,7 +17224,7 @@
       </w:rPr>
     </w:lvl>
   </w:abstractNum>
-  <w:abstractNum w:abstractNumId="19" w15:restartNumberingAfterBreak="0">
+  <w:abstractNum w:abstractNumId="22" w15:restartNumberingAfterBreak="0">
     <w:nsid w:val="5C6C670D"/>
     <w:multiLevelType w:val="hybridMultilevel"/>
     <w:tmpl w:val="39CE0FE4"/>
@@ -17688,7 +17337,7 @@
       </w:rPr>
     </w:lvl>
   </w:abstractNum>
-  <w:abstractNum w:abstractNumId="20" w15:restartNumberingAfterBreak="0">
+  <w:abstractNum w:abstractNumId="23" w15:restartNumberingAfterBreak="0">
     <w:nsid w:val="5EEA101D"/>
     <w:multiLevelType w:val="hybridMultilevel"/>
     <w:tmpl w:val="11ECD926"/>
@@ -17801,7 +17450,120 @@
       </w:rPr>
     </w:lvl>
   </w:abstractNum>
-  <w:abstractNum w:abstractNumId="21" w15:restartNumberingAfterBreak="0">
+  <w:abstractNum w:abstractNumId="24" w15:restartNumberingAfterBreak="0">
+    <w:nsid w:val="5F0B6827"/>
+    <w:multiLevelType w:val="hybridMultilevel"/>
+    <w:tmpl w:val="DBD63372"/>
+    <w:lvl w:ilvl="0" w:tplc="04090001">
+      <w:start w:val="1"/>
+      <w:numFmt w:val="bullet"/>
+      <w:lvlText w:val=""/>
+      <w:lvlJc w:val="left"/>
+      <w:pPr>
+        <w:ind w:left="1080" w:hanging="360"/>
+      </w:pPr>
+      <w:rPr>
+        <w:rFonts w:ascii="Symbol" w:hAnsi="Symbol" w:hint="default"/>
+      </w:rPr>
+    </w:lvl>
+    <w:lvl w:ilvl="1" w:tplc="04090003" w:tentative="1">
+      <w:start w:val="1"/>
+      <w:numFmt w:val="bullet"/>
+      <w:lvlText w:val="o"/>
+      <w:lvlJc w:val="left"/>
+      <w:pPr>
+        <w:ind w:left="1800" w:hanging="360"/>
+      </w:pPr>
+      <w:rPr>
+        <w:rFonts w:ascii="Courier New" w:hAnsi="Courier New" w:cs="Courier New" w:hint="default"/>
+      </w:rPr>
+    </w:lvl>
+    <w:lvl w:ilvl="2" w:tplc="04090005" w:tentative="1">
+      <w:start w:val="1"/>
+      <w:numFmt w:val="bullet"/>
+      <w:lvlText w:val=""/>
+      <w:lvlJc w:val="left"/>
+      <w:pPr>
+        <w:ind w:left="2520" w:hanging="360"/>
+      </w:pPr>
+      <w:rPr>
+        <w:rFonts w:ascii="Wingdings" w:hAnsi="Wingdings" w:hint="default"/>
+      </w:rPr>
+    </w:lvl>
+    <w:lvl w:ilvl="3" w:tplc="04090001" w:tentative="1">
+      <w:start w:val="1"/>
+      <w:numFmt w:val="bullet"/>
+      <w:lvlText w:val=""/>
+      <w:lvlJc w:val="left"/>
+      <w:pPr>
+        <w:ind w:left="3240" w:hanging="360"/>
+      </w:pPr>
+      <w:rPr>
+        <w:rFonts w:ascii="Symbol" w:hAnsi="Symbol" w:hint="default"/>
+      </w:rPr>
+    </w:lvl>
+    <w:lvl w:ilvl="4" w:tplc="04090003" w:tentative="1">
+      <w:start w:val="1"/>
+      <w:numFmt w:val="bullet"/>
+      <w:lvlText w:val="o"/>
+      <w:lvlJc w:val="left"/>
+      <w:pPr>
+        <w:ind w:left="3960" w:hanging="360"/>
+      </w:pPr>
+      <w:rPr>
+        <w:rFonts w:ascii="Courier New" w:hAnsi="Courier New" w:cs="Courier New" w:hint="default"/>
+      </w:rPr>
+    </w:lvl>
+    <w:lvl w:ilvl="5" w:tplc="04090005" w:tentative="1">
+      <w:start w:val="1"/>
+      <w:numFmt w:val="bullet"/>
+      <w:lvlText w:val=""/>
+      <w:lvlJc w:val="left"/>
+      <w:pPr>
+        <w:ind w:left="4680" w:hanging="360"/>
+      </w:pPr>
+      <w:rPr>
+        <w:rFonts w:ascii="Wingdings" w:hAnsi="Wingdings" w:hint="default"/>
+      </w:rPr>
+    </w:lvl>
+    <w:lvl w:ilvl="6" w:tplc="04090001" w:tentative="1">
+      <w:start w:val="1"/>
+      <w:numFmt w:val="bullet"/>
+      <w:lvlText w:val=""/>
+      <w:lvlJc w:val="left"/>
+      <w:pPr>
+        <w:ind w:left="5400" w:hanging="360"/>
+      </w:pPr>
+      <w:rPr>
+        <w:rFonts w:ascii="Symbol" w:hAnsi="Symbol" w:hint="default"/>
+      </w:rPr>
+    </w:lvl>
+    <w:lvl w:ilvl="7" w:tplc="04090003" w:tentative="1">
+      <w:start w:val="1"/>
+      <w:numFmt w:val="bullet"/>
+      <w:lvlText w:val="o"/>
+      <w:lvlJc w:val="left"/>
+      <w:pPr>
+        <w:ind w:left="6120" w:hanging="360"/>
+      </w:pPr>
+      <w:rPr>
+        <w:rFonts w:ascii="Courier New" w:hAnsi="Courier New" w:cs="Courier New" w:hint="default"/>
+      </w:rPr>
+    </w:lvl>
+    <w:lvl w:ilvl="8" w:tplc="04090005" w:tentative="1">
+      <w:start w:val="1"/>
+      <w:numFmt w:val="bullet"/>
+      <w:lvlText w:val=""/>
+      <w:lvlJc w:val="left"/>
+      <w:pPr>
+        <w:ind w:left="6840" w:hanging="360"/>
+      </w:pPr>
+      <w:rPr>
+        <w:rFonts w:ascii="Wingdings" w:hAnsi="Wingdings" w:hint="default"/>
+      </w:rPr>
+    </w:lvl>
+  </w:abstractNum>
+  <w:abstractNum w:abstractNumId="25" w15:restartNumberingAfterBreak="0">
     <w:nsid w:val="662B5238"/>
     <w:multiLevelType w:val="hybridMultilevel"/>
     <w:tmpl w:val="CB6EE8C0"/>
@@ -17914,7 +17676,7 @@
       </w:rPr>
     </w:lvl>
   </w:abstractNum>
-  <w:abstractNum w:abstractNumId="22" w15:restartNumberingAfterBreak="0">
+  <w:abstractNum w:abstractNumId="26" w15:restartNumberingAfterBreak="0">
     <w:nsid w:val="673F2B56"/>
     <w:multiLevelType w:val="hybridMultilevel"/>
     <w:tmpl w:val="DB48EFFA"/>
@@ -18003,7 +17765,7 @@
       </w:pPr>
     </w:lvl>
   </w:abstractNum>
-  <w:abstractNum w:abstractNumId="23" w15:restartNumberingAfterBreak="0">
+  <w:abstractNum w:abstractNumId="27" w15:restartNumberingAfterBreak="0">
     <w:nsid w:val="68973A34"/>
     <w:multiLevelType w:val="hybridMultilevel"/>
     <w:tmpl w:val="252A2864"/>
@@ -18116,7 +17878,7 @@
       </w:rPr>
     </w:lvl>
   </w:abstractNum>
-  <w:abstractNum w:abstractNumId="24" w15:restartNumberingAfterBreak="0">
+  <w:abstractNum w:abstractNumId="28" w15:restartNumberingAfterBreak="0">
     <w:nsid w:val="6AA039F4"/>
     <w:multiLevelType w:val="hybridMultilevel"/>
     <w:tmpl w:val="E702B904"/>
@@ -18229,7 +17991,7 @@
       </w:rPr>
     </w:lvl>
   </w:abstractNum>
-  <w:abstractNum w:abstractNumId="25" w15:restartNumberingAfterBreak="0">
+  <w:abstractNum w:abstractNumId="29" w15:restartNumberingAfterBreak="0">
     <w:nsid w:val="6BB72097"/>
     <w:multiLevelType w:val="hybridMultilevel"/>
     <w:tmpl w:val="07746E4E"/>
@@ -18342,7 +18104,7 @@
       </w:rPr>
     </w:lvl>
   </w:abstractNum>
-  <w:abstractNum w:abstractNumId="26" w15:restartNumberingAfterBreak="0">
+  <w:abstractNum w:abstractNumId="30" w15:restartNumberingAfterBreak="0">
     <w:nsid w:val="742F7F56"/>
     <w:multiLevelType w:val="hybridMultilevel"/>
     <w:tmpl w:val="C5E0C3FC"/>
@@ -18455,7 +18217,156 @@
       </w:rPr>
     </w:lvl>
   </w:abstractNum>
-  <w:abstractNum w:abstractNumId="27" w15:restartNumberingAfterBreak="0">
+  <w:abstractNum w:abstractNumId="31" w15:restartNumberingAfterBreak="0">
+    <w:nsid w:val="79B56569"/>
+    <w:multiLevelType w:val="multilevel"/>
+    <w:tmpl w:val="933854C8"/>
+    <w:lvl w:ilvl="0">
+      <w:start w:val="1"/>
+      <w:numFmt w:val="bullet"/>
+      <w:lvlText w:val=""/>
+      <w:lvlJc w:val="left"/>
+      <w:pPr>
+        <w:tabs>
+          <w:tab w:val="num" w:pos="720"/>
+        </w:tabs>
+        <w:ind w:left="720" w:hanging="360"/>
+      </w:pPr>
+      <w:rPr>
+        <w:rFonts w:ascii="Symbol" w:hAnsi="Symbol" w:hint="default"/>
+        <w:sz w:val="20"/>
+      </w:rPr>
+    </w:lvl>
+    <w:lvl w:ilvl="1" w:tentative="1">
+      <w:start w:val="1"/>
+      <w:numFmt w:val="bullet"/>
+      <w:lvlText w:val="o"/>
+      <w:lvlJc w:val="left"/>
+      <w:pPr>
+        <w:tabs>
+          <w:tab w:val="num" w:pos="1440"/>
+        </w:tabs>
+        <w:ind w:left="1440" w:hanging="360"/>
+      </w:pPr>
+      <w:rPr>
+        <w:rFonts w:ascii="Courier New" w:hAnsi="Courier New" w:hint="default"/>
+        <w:sz w:val="20"/>
+      </w:rPr>
+    </w:lvl>
+    <w:lvl w:ilvl="2" w:tentative="1">
+      <w:start w:val="1"/>
+      <w:numFmt w:val="bullet"/>
+      <w:lvlText w:val=""/>
+      <w:lvlJc w:val="left"/>
+      <w:pPr>
+        <w:tabs>
+          <w:tab w:val="num" w:pos="2160"/>
+        </w:tabs>
+        <w:ind w:left="2160" w:hanging="360"/>
+      </w:pPr>
+      <w:rPr>
+        <w:rFonts w:ascii="Wingdings" w:hAnsi="Wingdings" w:hint="default"/>
+        <w:sz w:val="20"/>
+      </w:rPr>
+    </w:lvl>
+    <w:lvl w:ilvl="3" w:tentative="1">
+      <w:start w:val="1"/>
+      <w:numFmt w:val="bullet"/>
+      <w:lvlText w:val=""/>
+      <w:lvlJc w:val="left"/>
+      <w:pPr>
+        <w:tabs>
+          <w:tab w:val="num" w:pos="2880"/>
+        </w:tabs>
+        <w:ind w:left="2880" w:hanging="360"/>
+      </w:pPr>
+      <w:rPr>
+        <w:rFonts w:ascii="Wingdings" w:hAnsi="Wingdings" w:hint="default"/>
+        <w:sz w:val="20"/>
+      </w:rPr>
+    </w:lvl>
+    <w:lvl w:ilvl="4" w:tentative="1">
+      <w:start w:val="1"/>
+      <w:numFmt w:val="bullet"/>
+      <w:lvlText w:val=""/>
+      <w:lvlJc w:val="left"/>
+      <w:pPr>
+        <w:tabs>
+          <w:tab w:val="num" w:pos="3600"/>
+        </w:tabs>
+        <w:ind w:left="3600" w:hanging="360"/>
+      </w:pPr>
+      <w:rPr>
+        <w:rFonts w:ascii="Wingdings" w:hAnsi="Wingdings" w:hint="default"/>
+        <w:sz w:val="20"/>
+      </w:rPr>
+    </w:lvl>
+    <w:lvl w:ilvl="5" w:tentative="1">
+      <w:start w:val="1"/>
+      <w:numFmt w:val="bullet"/>
+      <w:lvlText w:val=""/>
+      <w:lvlJc w:val="left"/>
+      <w:pPr>
+        <w:tabs>
+          <w:tab w:val="num" w:pos="4320"/>
+        </w:tabs>
+        <w:ind w:left="4320" w:hanging="360"/>
+      </w:pPr>
+      <w:rPr>
+        <w:rFonts w:ascii="Wingdings" w:hAnsi="Wingdings" w:hint="default"/>
+        <w:sz w:val="20"/>
+      </w:rPr>
+    </w:lvl>
+    <w:lvl w:ilvl="6" w:tentative="1">
+      <w:start w:val="1"/>
+      <w:numFmt w:val="bullet"/>
+      <w:lvlText w:val=""/>
+      <w:lvlJc w:val="left"/>
+      <w:pPr>
+        <w:tabs>
+          <w:tab w:val="num" w:pos="5040"/>
+        </w:tabs>
+        <w:ind w:left="5040" w:hanging="360"/>
+      </w:pPr>
+      <w:rPr>
+        <w:rFonts w:ascii="Wingdings" w:hAnsi="Wingdings" w:hint="default"/>
+        <w:sz w:val="20"/>
+      </w:rPr>
+    </w:lvl>
+    <w:lvl w:ilvl="7" w:tentative="1">
+      <w:start w:val="1"/>
+      <w:numFmt w:val="bullet"/>
+      <w:lvlText w:val=""/>
+      <w:lvlJc w:val="left"/>
+      <w:pPr>
+        <w:tabs>
+          <w:tab w:val="num" w:pos="5760"/>
+        </w:tabs>
+        <w:ind w:left="5760" w:hanging="360"/>
+      </w:pPr>
+      <w:rPr>
+        <w:rFonts w:ascii="Wingdings" w:hAnsi="Wingdings" w:hint="default"/>
+        <w:sz w:val="20"/>
+      </w:rPr>
+    </w:lvl>
+    <w:lvl w:ilvl="8" w:tentative="1">
+      <w:start w:val="1"/>
+      <w:numFmt w:val="bullet"/>
+      <w:lvlText w:val=""/>
+      <w:lvlJc w:val="left"/>
+      <w:pPr>
+        <w:tabs>
+          <w:tab w:val="num" w:pos="6480"/>
+        </w:tabs>
+        <w:ind w:left="6480" w:hanging="360"/>
+      </w:pPr>
+      <w:rPr>
+        <w:rFonts w:ascii="Wingdings" w:hAnsi="Wingdings" w:hint="default"/>
+        <w:sz w:val="20"/>
+      </w:rPr>
+    </w:lvl>
+  </w:abstractNum>
+  <w:abstractNum w:abstractNumId="32" w15:restartNumberingAfterBreak="0">
     <w:nsid w:val="7B205E3B"/>
     <w:multiLevelType w:val="hybridMultilevel"/>
     <w:tmpl w:val="8D0EC3F8"/>
@@ -18568,7 +18479,7 @@
       </w:rPr>
     </w:lvl>
   </w:abstractNum>
-  <w:abstractNum w:abstractNumId="28" w15:restartNumberingAfterBreak="0">
+  <w:abstractNum w:abstractNumId="33" w15:restartNumberingAfterBreak="0">
     <w:nsid w:val="7B68295A"/>
     <w:multiLevelType w:val="hybridMultilevel"/>
     <w:tmpl w:val="146240BE"/>
@@ -18681,7 +18592,7 @@
       </w:rPr>
     </w:lvl>
   </w:abstractNum>
-  <w:abstractNum w:abstractNumId="29" w15:restartNumberingAfterBreak="0">
+  <w:abstractNum w:abstractNumId="34" w15:restartNumberingAfterBreak="0">
     <w:nsid w:val="7DD2451C"/>
     <w:multiLevelType w:val="hybridMultilevel"/>
     <w:tmpl w:val="EB7A4F9A"/>
@@ -18794,7 +18705,7 @@
       </w:rPr>
     </w:lvl>
   </w:abstractNum>
-  <w:abstractNum w:abstractNumId="30" w15:restartNumberingAfterBreak="0">
+  <w:abstractNum w:abstractNumId="35" w15:restartNumberingAfterBreak="0">
     <w:nsid w:val="7F8E30CA"/>
     <w:multiLevelType w:val="multilevel"/>
     <w:tmpl w:val="E2509F4A"/>
@@ -18908,82 +18819,82 @@
     </w:lvl>
   </w:abstractNum>
   <w:num w:numId="1" w16cid:durableId="2113551837">
-    <w:abstractNumId w:val="7"/>
+    <w:abstractNumId w:val="8"/>
   </w:num>
   <w:num w:numId="2" w16cid:durableId="1180509085">
-    <w:abstractNumId w:val="23"/>
+    <w:abstractNumId w:val="27"/>
   </w:num>
   <w:num w:numId="3" w16cid:durableId="719477801">
+    <w:abstractNumId w:val="22"/>
+  </w:num>
+  <w:num w:numId="4" w16cid:durableId="185218928">
+    <w:abstractNumId w:val="33"/>
+  </w:num>
+  <w:num w:numId="5" w16cid:durableId="662046987">
+    <w:abstractNumId w:val="9"/>
+  </w:num>
+  <w:num w:numId="6" w16cid:durableId="18891784">
+    <w:abstractNumId w:val="15"/>
+  </w:num>
+  <w:num w:numId="7" w16cid:durableId="1731541130">
     <w:abstractNumId w:val="19"/>
   </w:num>
-  <w:num w:numId="4" w16cid:durableId="185218928">
-    <w:abstractNumId w:val="28"/>
-  </w:num>
-  <w:num w:numId="5" w16cid:durableId="662046987">
-    <w:abstractNumId w:val="8"/>
-  </w:num>
-  <w:num w:numId="6" w16cid:durableId="18891784">
-    <w:abstractNumId w:val="13"/>
-  </w:num>
-  <w:num w:numId="7" w16cid:durableId="1731541130">
-    <w:abstractNumId w:val="16"/>
-  </w:num>
   <w:num w:numId="8" w16cid:durableId="1870412852">
-    <w:abstractNumId w:val="18"/>
+    <w:abstractNumId w:val="21"/>
   </w:num>
   <w:num w:numId="9" w16cid:durableId="2141339984">
-    <w:abstractNumId w:val="25"/>
+    <w:abstractNumId w:val="29"/>
   </w:num>
   <w:num w:numId="10" w16cid:durableId="1855993595">
     <w:abstractNumId w:val="5"/>
   </w:num>
   <w:num w:numId="11" w16cid:durableId="1165364523">
-    <w:abstractNumId w:val="30"/>
+    <w:abstractNumId w:val="35"/>
   </w:num>
   <w:num w:numId="12" w16cid:durableId="668606715">
-    <w:abstractNumId w:val="21"/>
+    <w:abstractNumId w:val="25"/>
   </w:num>
   <w:num w:numId="13" w16cid:durableId="1298805398">
-    <w:abstractNumId w:val="6"/>
+    <w:abstractNumId w:val="7"/>
   </w:num>
   <w:num w:numId="14" w16cid:durableId="1008286879">
-    <w:abstractNumId w:val="24"/>
+    <w:abstractNumId w:val="28"/>
   </w:num>
   <w:num w:numId="15" w16cid:durableId="107236513">
     <w:abstractNumId w:val="2"/>
   </w:num>
   <w:num w:numId="16" w16cid:durableId="207684814">
-    <w:abstractNumId w:val="27"/>
+    <w:abstractNumId w:val="32"/>
   </w:num>
   <w:num w:numId="17" w16cid:durableId="1504393994">
-    <w:abstractNumId w:val="10"/>
+    <w:abstractNumId w:val="11"/>
   </w:num>
   <w:num w:numId="18" w16cid:durableId="1757245300">
-    <w:abstractNumId w:val="29"/>
+    <w:abstractNumId w:val="34"/>
   </w:num>
   <w:num w:numId="19" w16cid:durableId="589898265">
-    <w:abstractNumId w:val="20"/>
+    <w:abstractNumId w:val="23"/>
   </w:num>
   <w:num w:numId="20" w16cid:durableId="1137914264">
-    <w:abstractNumId w:val="11"/>
+    <w:abstractNumId w:val="12"/>
   </w:num>
   <w:num w:numId="21" w16cid:durableId="1990088281">
-    <w:abstractNumId w:val="17"/>
+    <w:abstractNumId w:val="20"/>
   </w:num>
   <w:num w:numId="22" w16cid:durableId="23987700">
     <w:abstractNumId w:val="0"/>
   </w:num>
   <w:num w:numId="23" w16cid:durableId="795292121">
-    <w:abstractNumId w:val="9"/>
+    <w:abstractNumId w:val="10"/>
   </w:num>
   <w:num w:numId="24" w16cid:durableId="1503819318">
-    <w:abstractNumId w:val="14"/>
+    <w:abstractNumId w:val="17"/>
   </w:num>
   <w:num w:numId="25" w16cid:durableId="1929073310">
-    <w:abstractNumId w:val="15"/>
+    <w:abstractNumId w:val="18"/>
   </w:num>
   <w:num w:numId="26" w16cid:durableId="1588609938">
-    <w:abstractNumId w:val="26"/>
+    <w:abstractNumId w:val="30"/>
   </w:num>
   <w:num w:numId="27" w16cid:durableId="1852571714">
     <w:abstractNumId w:val="3"/>
@@ -18992,13 +18903,28 @@
     <w:abstractNumId w:val="4"/>
   </w:num>
   <w:num w:numId="29" w16cid:durableId="1624068891">
-    <w:abstractNumId w:val="22"/>
+    <w:abstractNumId w:val="26"/>
   </w:num>
   <w:num w:numId="30" w16cid:durableId="1412267153">
-    <w:abstractNumId w:val="12"/>
+    <w:abstractNumId w:val="13"/>
   </w:num>
   <w:num w:numId="31" w16cid:durableId="905142021">
     <w:abstractNumId w:val="1"/>
+  </w:num>
+  <w:num w:numId="32" w16cid:durableId="729230908">
+    <w:abstractNumId w:val="6"/>
+  </w:num>
+  <w:num w:numId="33" w16cid:durableId="2124105306">
+    <w:abstractNumId w:val="31"/>
+  </w:num>
+  <w:num w:numId="34" w16cid:durableId="1519854751">
+    <w:abstractNumId w:val="16"/>
+  </w:num>
+  <w:num w:numId="35" w16cid:durableId="1376003922">
+    <w:abstractNumId w:val="14"/>
+  </w:num>
+  <w:num w:numId="36" w16cid:durableId="396979022">
+    <w:abstractNumId w:val="24"/>
   </w:num>
   <w:numIdMacAtCleanup w:val="19"/>
 </w:numbering>
@@ -19404,7 +19330,7 @@
   <w:style w:type="paragraph" w:default="1" w:styleId="Normal">
     <w:name w:val="Normal"/>
     <w:qFormat/>
-    <w:rsid w:val="00C65F5C"/>
+    <w:rsid w:val="0031492B"/>
   </w:style>
   <w:style w:type="paragraph" w:styleId="Heading1">
     <w:name w:val="heading 1"/>
@@ -19999,6 +19925,50 @@
       <w:szCs w:val="20"/>
     </w:rPr>
   </w:style>
+  <w:style w:type="paragraph" w:styleId="Header">
+    <w:name w:val="header"/>
+    <w:basedOn w:val="Normal"/>
+    <w:link w:val="HeaderChar"/>
+    <w:uiPriority w:val="99"/>
+    <w:unhideWhenUsed/>
+    <w:rsid w:val="00D06D12"/>
+    <w:pPr>
+      <w:tabs>
+        <w:tab w:val="center" w:pos="4680"/>
+        <w:tab w:val="right" w:pos="9360"/>
+      </w:tabs>
+      <w:spacing w:after="0" w:line="240" w:lineRule="auto"/>
+    </w:pPr>
+  </w:style>
+  <w:style w:type="character" w:customStyle="1" w:styleId="HeaderChar">
+    <w:name w:val="Header Char"/>
+    <w:basedOn w:val="DefaultParagraphFont"/>
+    <w:link w:val="Header"/>
+    <w:uiPriority w:val="99"/>
+    <w:rsid w:val="00D06D12"/>
+  </w:style>
+  <w:style w:type="paragraph" w:styleId="Footer">
+    <w:name w:val="footer"/>
+    <w:basedOn w:val="Normal"/>
+    <w:link w:val="FooterChar"/>
+    <w:uiPriority w:val="99"/>
+    <w:unhideWhenUsed/>
+    <w:rsid w:val="00D06D12"/>
+    <w:pPr>
+      <w:tabs>
+        <w:tab w:val="center" w:pos="4680"/>
+        <w:tab w:val="right" w:pos="9360"/>
+      </w:tabs>
+      <w:spacing w:after="0" w:line="240" w:lineRule="auto"/>
+    </w:pPr>
+  </w:style>
+  <w:style w:type="character" w:customStyle="1" w:styleId="FooterChar">
+    <w:name w:val="Footer Char"/>
+    <w:basedOn w:val="DefaultParagraphFont"/>
+    <w:link w:val="Footer"/>
+    <w:uiPriority w:val="99"/>
+    <w:rsid w:val="00D06D12"/>
+  </w:style>
 </w:styles>
 </file>
 

</xml_diff>